<commit_message>
Cite verified Zenodo v0.1.3 archive and update manuscript provenance
</commit_message>
<xml_diff>
--- a/manuscript/PathA_MainText.docx
+++ b/manuscript/PathA_MainText.docx
@@ -2486,7 +2486,7 @@
     </w:p>
     <w:p>
       <w:r>
-        <w:t>seismic-eval-audit v0.1.3 is distributed under the MIT license at https://github.com/rcw3712/seismic-eval-audit. The versioned GitHub release provides source, a wheel, tests, case-study reports and SHA-256 manifests. The core requires Python 3.10 or later and no third-party runtime dependencies. It runs without MATLAB, model inference or training. Continuous integration tests Linux and Windows with Python 3.10 and 3.12; the separate local verification used Python 3.12.14 on Windows. The historical STEAD implementation remains archived at https://doi.org/10.5281/zenodo.22824997 (Wibowo et al. 2026). That DOI does not identify this Python package; a new Zenodo DOI is not yet asserted.</w:t>
+        <w:t>seismic-eval-audit v0.1.3 is distributed under the MIT license at https://github.com/rcw3712/seismic-eval-audit and archived at https://doi.org/10.5281/zenodo.23684054 (Wibowo 2026). The DOI identifies the immutable source and evidence at tag archive-v0.1.3, commit 287138537796c577a383844a6faa57f126e17568, which is identical to the original v0.1.3 release commit. The package provides source, a wheel, tests, case-study reports and SHA-256 manifests. The core requires Python 3.10 or later and no third-party runtime dependencies. Continuous integration tests Linux and Windows with Python 3.10 and 3.12; separate local verification used Python 3.12.14 on Windows. The historical STEAD model/result implementation remains archived separately at https://doi.org/10.5281/zenodo.22824997 (Wibowo et al. 2026). Subsequent manuscript and citation updates are distinguished from the archived release bytes.</w:t>
       </w:r>
     </w:p>
     <w:p>
@@ -2587,6 +2587,12 @@
     <w:p>
       <w:r>
         <w:t>Swiss Seismological Service at ETH Zurich (2008) Seismology at School Program, ETH Zurich. ETH Zurich. https://doi.org/10.12686/sed/networks/s</w:t>
+      </w:r>
+    </w:p>
+    <w:p>
+      <w:pPr/>
+      <w:r>
+        <w:t>Wibowo RC (2026) seismic-eval-audit. Version 0.1.3. Zenodo. https://doi.org/10.5281/zenodo.23684054</w:t>
       </w:r>
     </w:p>
     <w:p>

</xml_diff>

<commit_message>
Clarify software attribution and polish pre-submission documents
</commit_message>
<xml_diff>
--- a/manuscript/PathA_MainText.docx
+++ b/manuscript/PathA_MainText.docx
@@ -1012,7 +1012,7 @@
     </w:p>
     <w:p>
       <w:r>
-        <w:t>ChatGPT/Codex (OpenAI) assisted software implementation, test drafting, metadata-analysis scripts, document organization and language revision. Claude (Anthropic) assisted earlier manuscript review and editing. Verification includes 27 automated tests, direct set-based cross-checks, comparison with frozen historical-role evidence, and byte-hash checks. These checks are documented separately from AI assistance and do not constitute external validation. The authors are responsible for reviewing the implementation, evidence, references and manuscript and for the final scientific claims.</w:t>
+        <w:t>ChatGPT/Codex (OpenAI) assisted software implementation, test drafting, metadata-analysis scripts, document organization and language revision. Claude (Anthropic) assisted manuscript review and editing, including review of the Path A drafts. Verification includes 27 automated tests, direct set-based cross-checks, comparison with frozen historical-role evidence, and byte-hash checks. These checks are documented separately from AI assistance and do not constitute external validation. The authors are responsible for reviewing the implementation, evidence, references and manuscript and for the final scientific claims.</w:t>
       </w:r>
     </w:p>
     <w:p>
@@ -2451,6 +2451,12 @@
       </w:r>
     </w:p>
     <w:p>
+      <w:pPr/>
+      <w:r>
+        <w:t>Rahmat Catur Wibowo developed the Python package seismic-eval-audit. The Software contributions of Razki Alfatah Khairu Mahli and Karyanto relate to the historical MATLAB pipeline, not to the Python package. The single-author software citation for seismic-eval-audit and the multi-author manuscript contributions therefore have different scopes.</w:t>
+      </w:r>
+    </w:p>
+    <w:p>
       <w:pPr>
         <w:pStyle w:val="Heading1"/>
       </w:pPr>
@@ -2486,7 +2492,7 @@
     </w:p>
     <w:p>
       <w:r>
-        <w:t>seismic-eval-audit v0.1.3 is distributed under the MIT license at https://github.com/rcw3712/seismic-eval-audit and archived at https://doi.org/10.5281/zenodo.23684054 (Wibowo 2026). The DOI identifies the immutable source and evidence at tag archive-v0.1.3, commit 287138537796c577a383844a6faa57f126e17568, which is identical to the original v0.1.3 release commit. The package provides source, a wheel, tests, case-study reports and SHA-256 manifests. The core requires Python 3.10 or later and no third-party runtime dependencies. Continuous integration tests Linux and Windows with Python 3.10 and 3.12; separate local verification used Python 3.12.14 on Windows. The historical STEAD model/result implementation remains archived separately at https://doi.org/10.5281/zenodo.22824997 (Wibowo et al. 2026). Subsequent manuscript and citation updates are distinguished from the archived release bytes.</w:t>
+        <w:t>seismic-eval-audit v0.1.3 is distributed under the MIT license at https://github.com/rcw3712/seismic-eval-audit and archived at https://doi.org/10.5281/zenodo.23684054 (Wibowo 2026). The DOI identifies the immutable source and evidence at tag archive-v0.1.3, commit 287138537796c577a383844a6faa57f126e17568, which is identical to the original v0.1.3 release commit. The package provides source, a wheel, tests, case-study reports and SHA-256 manifests. The core requires Python 3.10 or later and no third-party runtime dependencies. Continuous integration tests Linux and Windows with Python 3.10 and 3.12; separate local verification used Python 3.12.14 on Windows. The historical STEAD model/result implementation remains archived separately at https://doi.org/10.5281/zenodo.22824997 (Wibowo et al. 2026).</w:t>
       </w:r>
     </w:p>
     <w:p>
@@ -2530,12 +2536,12 @@
     </w:p>
     <w:p>
       <w:r>
-        <w:t>CERN (2016) CERN Seismic Network. ETH Zurich. https://doi.org/10.12686/sed/networks/c4</w:t>
+        <w:t>Cawley GC, Talbot NLC (2010) On over-fitting in model selection and subsequent selection bias in performance evaluation. Journal of Machine Learning Research 11:2079–2107. https://www.jmlr.org/papers/v11/cawley10a.html</w:t>
       </w:r>
     </w:p>
     <w:p>
       <w:r>
-        <w:t>Cawley GC, Talbot NLC (2010) On over-fitting in model selection and subsequent selection bias in performance evaluation. Journal of Machine Learning Research 11:2079–2107. https://www.jmlr.org/papers/v11/cawley10a.html</w:t>
+        <w:t>CERN (2016) CERN Seismic Network. ETH Zurich. https://doi.org/10.12686/sed/networks/c4</w:t>
       </w:r>
     </w:p>
     <w:p>

</xml_diff>

<commit_message>
Document and verify installed-wheel user workflow without changing audit core
</commit_message>
<xml_diff>
--- a/manuscript/PathA_MainText.docx
+++ b/manuscript/PathA_MainText.docx
@@ -146,12 +146,18 @@
     <w:p>
       <w:pPr/>
       <w:r>
-        <w:t>Existing libraries already support grouped partition construction: scikit-learn provides GroupKFold and GroupShuffleSplit (Pedregosa et al. 2011). Those splitting interfaces generate train/test indices from supplied groups; they do not themselves provide the combined audit of saved partitions, derived-record links, multistage OOF memberships, artifact hashes and earlier development roles examined here. Our contribution is a small, reusable implementation of explicit input contracts and consistent reports across these checks. The split command reports PASS, FAIL or WARNING and identifies record-level membership violations; the accompanying Python APIs address the other contracts. This makes the checks inspectable and repeatable without claiming a new splitting algorithm or a comprehensive leakage detector.</w:t>
+        <w:t>Existing libraries already support grouped partition construction: scikit-learn provides GroupKFold and GroupShuffleSplit (Pedregosa et al. 2011). Those splitting interfaces generate train/test indices from supplied groups; they do not themselves provide the combined audit of saved partitions, derived-record links, multistage out-of-fold (OOF) memberships, artifact hashes and earlier development roles examined here. Our contribution is a small, reusable implementation of explicit input contracts and consistent reports across these checks. The split command reports PASS, FAIL or WARNING and identifies record-level membership violations; the accompanying Python APIs address the other contracts. This makes the checks inspectable and repeatable without claiming a new splitting algorithm or a comprehensive leakage detector.</w:t>
       </w:r>
     </w:p>
     <w:p>
       <w:r>
-        <w:t>We ask whether a compact, model-independent interface can make common source-membership and processing-history failures visible before seismic predictions are interpreted. We connect a forensic example from an existing STEAD workflow to a reusable Python implementation and a metadata demonstration on ETHZ. The new demonstration requires neither MATLAB nor a trained picker. Its purpose is to test the portability of the membership audit, with a clear distinction between a supplied partition and controls constructed for this study. Model architecture and accuracy ranking are outside the primary question.</w:t>
+        <w:t>We ask whether a compact, model-independent interface can make common source-membership and processing-history failures visible before seismic predictions are interpreted. We connect a forensic example from an existing STEAD workflow to a reusable Python implementation and a metadata demonstration on ETHZ. The metadata demonstration requires neither MATLAB nor a trained picker. Its purpose is to test the portability of the membership audit, with a clear distinction between a supplied partition and controls constructed for this study. Model architecture and accuracy ranking are outside the primary question.</w:t>
+      </w:r>
+    </w:p>
+    <w:p>
+      <w:pPr/>
+      <w:r>
+        <w:t>To use the workflow, declare the grouping requirement, export saved record memberships, run the corresponding check, and use its output to decide what must be corrected or qualified. Online Resource 1 provides a comparison with split-construction interfaces, a contract-by-evidence matrix and a complete SeisBench metadata example (Tables S5–S6; Section 10).</w:t>
       </w:r>
     </w:p>
     <w:p>
@@ -195,7 +201,7 @@
     </w:p>
     <w:p>
       <w:r>
-        <w:t>A derived record, such as an augmented waveform, must retain its parent source and partition. The lineage check rejects a missing parent, reuse of a parent record identifier as a child identifier, and changes in source or split. For a multistage model, an out-of-fold prediction is a prediction for a record excluded from the fitting operation that generated it. The corresponding source must also be excluded from that operation, including its inner validation set. The OOF check tests pairwise source intersections between held-out, fitting and inner-validation records.</w:t>
+        <w:t>A derived record, such as an augmented waveform, must retain its parent source and partition. The lineage check rejects a missing parent, reuse of a parent record identifier as a child identifier, and changes in source or split. For a multistage model, an out-of-fold prediction is a prediction for a record excluded from the fitting operation that generated it. The corresponding source must also be excluded from that operation, including its inner validation set. The OOF check tests pairwise source intersections between held-out, fitting and inner-validation records. Here, fitting denotes records used for parameter updates, excluding the inner-validation records.</w:t>
       </w:r>
     </w:p>
     <w:p>
@@ -952,6 +958,12 @@
       </w:r>
     </w:p>
     <w:p>
+      <w:pPr/>
+      <w:r>
+        <w:t>The historical 335-record and corrected 330-record test sets result from different allocations of the same 2,234 retained records. The difference is not the removal of five records from the collection; these are distinct test populations.</w:t>
+      </w:r>
+    </w:p>
+    <w:p>
       <w:r>
         <w:t>We additionally audit six saved OOF membership files representing two component modes and three base seeds. Each uses five folds. The actual inner-fold tables specify held, fitting and inner-validation roles. We check record coverage and source agreement before checking the three source sets for each configuration and fold. Model bytes are compared with the frozen model manifest; public code copies are compared with their existing public_sha256 entries.</w:t>
       </w:r>
@@ -1012,7 +1024,7 @@
     </w:p>
     <w:p>
       <w:r>
-        <w:t>ChatGPT/Codex (OpenAI) assisted software implementation, test drafting, metadata-analysis scripts, document organization and language revision. Claude (Anthropic) assisted manuscript review and editing, including review of the Path A drafts. Verification includes 27 automated tests, direct set-based cross-checks, comparison with frozen historical-role evidence, and byte-hash checks. These checks are documented separately from AI assistance and do not constitute external validation. The authors are responsible for reviewing the implementation, evidence, references and manuscript and for the final scientific claims.</w:t>
+        <w:t>ChatGPT/Codex (OpenAI) assisted software implementation, test drafting, metadata-analysis scripts, document organization and language revision. Claude (Anthropic) assisted manuscript review and editing, including review of manuscript drafts. Verification includes 27 automated tests, direct set-based cross-checks, comparison with frozen historical-role evidence, and byte-hash checks. These checks are documented separately from AI assistance and do not constitute external validation. The authors are responsible for reviewing the implementation, evidence, references and manuscript and for the final scientific claims.</w:t>
       </w:r>
     </w:p>
     <w:p>
@@ -1033,7 +1045,7 @@
     </w:p>
     <w:p>
       <w:r>
-        <w:t>The tool reports FAIL for the recovered historical STEAD partition: 283 sources span subsets, affecting 739 records overall. Among its 335 test records, 151 share a source with training and 168 with training or validation. These counts are newly reproduced by the Python adapter from the frozen recovered mapping and checked by direct set calculations. The corrected 330-record test partition passes with zero shared sources across train, validation and test (Table 2). Machine-readable reports retain the separate populations and their input hashes.</w:t>
+        <w:t>The tool reports FAIL for the recovered historical STEAD partition: 283 sources span subsets, affecting 739 records overall. Among its 335 test records, 151 share a source with training and 168 with training or validation. These counts are reproduced by the Python adapter from the frozen recovered mapping and checked by direct set calculations. The corrected 330-record test partition passes with zero shared sources across train, validation and test (Table 2). Machine-readable reports retain the separate populations and their input hashes.</w:t>
       </w:r>
     </w:p>
     <w:p>
@@ -1047,7 +1059,7 @@
         <w:keepNext/>
       </w:pPr>
       <w:r>
-        <w:t>Table 2 New tool outputs from frozen STEAD evidence</w:t>
+        <w:t>Table 2 Tool outputs from frozen STEAD evidence</w:t>
       </w:r>
     </w:p>
     <w:tbl>
@@ -1523,7 +1535,7 @@
                 <w:b w:val="0"/>
                 <w:sz w:val="20"/>
               </w:rPr>
-              <w:t>30 configuration–fold checks; five distinct fold assignments</w:t>
+              <w:t>30 configuration–fold checks; five inner-fold tables shared across six configurations</w:t>
             </w:r>
           </w:p>
         </w:tc>
@@ -2362,7 +2374,7 @@
     </w:tbl>
     <w:p>
       <w:r>
-        <w:t>All rows contain 36,743 records and 2,231 distinct source identifiers. Shared sources means sources occurring in more than one subset, counted once. The two constructed rows use seed 42. The new demonstration verifies that the same membership interface handles another dataset table without using the STEAD-specific model implementation. It does not demonstrate an end-to-end model audit on ETHZ.</w:t>
+        <w:t>All rows contain 36,743 records and 2,231 distinct source identifiers. Shared sources means sources occurring in more than one subset, counted once. The two constructed rows use seed 42. The metadata demonstration verifies that the same membership interface handles another dataset table without using the STEAD-specific model implementation. It does not demonstrate an end-to-end model audit on ETHZ.</w:t>
       </w:r>
     </w:p>
     <w:p>
@@ -2380,7 +2392,13 @@
     </w:p>
     <w:p>
       <w:r>
-        <w:t>All 27 automated tests pass, including new role-category and strict-exit tests. The built wheel is checked in a separate installation directory. The historical command returns the expected FAIL, while the corrected memberships pass. All 30 OOF membership checks, 106 checkpoint hashes and 93 public-code hashes pass. The 9,264 receipt-derived child links are consistent with frozen memberships within their reconstructed scope. The core package uses the Python standard library; local verification used Python 3.12.14 on Windows. Continuous integration also runs the 27 tests and package-hash verification on Linux and Windows with Python 3.10 and 3.12. No new training or inference was performed.</w:t>
+        <w:t>All 27 automated tests pass, including role-category and strict-exit tests. The built wheel is checked in a separate installation directory. The historical command returns the expected FAIL, while the corrected memberships pass. All 30 OOF membership checks, 106 checkpoint hashes and 93 public-code hashes pass. The 9,264 receipt-derived child links are consistent with frozen memberships within their reconstructed scope. The core package uses the Python standard library; local verification used Python 3.12.14 on Windows. Continuous integration also runs the 27 tests and package-hash verification on Linux and Windows with Python 3.10 and 3.12. No new training or inference was performed.</w:t>
+      </w:r>
+    </w:p>
+    <w:p>
+      <w:pPr/>
+      <w:r>
+        <w:t>The usage walkthrough separately exercises the unchanged v0.1.3 wheel from outside the source directory. Native ETHZ columns reproduce the source and station counts against direct set calculations. Synthetic examples verify PASS, FAIL, WARNING, strict-warning and invalid-input exits. This author-run check verifies executable instructions, not independent-user adoption; its receipt and guide are supplied separately from the archived release.</w:t>
       </w:r>
     </w:p>
     <w:p>
@@ -2426,7 +2444,7 @@
     </w:p>
     <w:p>
       <w:r>
-        <w:t>The new tool detects a documented historical source-overlap failure and distinguishes that failure from the corrected STEAD memberships and their earlier development roles. Saved OOF memberships and frozen artifact hashes pass their specified checks. On ETHZ, the supplied partition is source-disjoint but shares 180 network.station keys between training and testing, demonstrating why the evaluation unit must be stated. These findings support explicit audit claims without estimating a change in model accuracy. We recommend running these checks, and reporting historical data roles, before interpreting seismic machine-learning scores.</w:t>
+        <w:t>The tool detects a documented historical source-overlap failure and distinguishes that failure from the corrected STEAD memberships and their earlier development roles. Saved OOF memberships and frozen artifact hashes pass their specified checks. On ETHZ, the supplied partition is source-disjoint but shares 180 network.station keys between training and testing, demonstrating why the evaluation unit must be stated. These findings support explicit audit claims without estimating a change in model accuracy. We recommend running these checks, and reporting historical data roles, before interpreting seismic machine-learning scores.</w:t>
       </w:r>
     </w:p>
     <w:p>
@@ -2496,6 +2514,12 @@
       </w:r>
     </w:p>
     <w:p>
+      <w:pPr/>
+      <w:r>
+        <w:t>The accompanying docs/WALKTHROUGH.md, docs/verify_walkthrough.py and wheel-usage receipt document use of that unchanged wheel. These additions and the current manuscript postdate the DOI snapshot and are identified by the accompanying Git commit and SHA-256 manifest.</w:t>
+      </w:r>
+    </w:p>
+    <w:p>
       <w:pPr>
         <w:pStyle w:val="Heading1"/>
       </w:pPr>
@@ -2518,7 +2542,7 @@
     </w:p>
     <w:p>
       <w:r>
-        <w:t>Online Resource 1 provides input contracts, reproduction commands, evidence boundaries and network citations. The accompanying Software and Results directories contain the implementation and machine-readable reports. In the dedicated repository, software is at the root and new evidence is in case_studies/results. Earlier model-focused material remains available separately in the preserved STEAD case-study archive.</w:t>
+        <w:t>Online Resource 1 provides input contracts, reproduction commands, evidence boundaries and network citations. The accompanying Software and Results directories contain the implementation and machine-readable reports. In the dedicated repository, software is at the root and case-study evidence is in case_studies/results. Earlier model-focused material remains available separately in the preserved STEAD case-study archive.</w:t>
       </w:r>
     </w:p>
     <w:p>

</xml_diff>

<commit_message>
Close four-item editorial pass and prepare Software article candidate
</commit_message>
<xml_diff>
--- a/manuscript/PathA_MainText.docx
+++ b/manuscript/PathA_MainText.docx
@@ -157,7 +157,7 @@
     <w:p>
       <w:pPr/>
       <w:r>
-        <w:t>To use the workflow, declare the grouping requirement, export saved record memberships, run the corresponding check, and use its output to decide what must be corrected or qualified. Online Resource 1 provides a comparison with split-construction interfaces, a contract-by-evidence matrix and a complete SeisBench metadata example (Tables S5–S6; Section 10).</w:t>
+        <w:t>To use the workflow, declare the grouping requirement, export saved record memberships, run the corresponding check, and use its output to decide what must be corrected or qualified. Online Resource 1 provides a comparison with split-construction interfaces, a contract-by-evidence matrix and a complete SeisBench metadata example (Tables S4–S5; Section 9).</w:t>
       </w:r>
     </w:p>
     <w:p>
@@ -165,7 +165,7 @@
         <w:pStyle w:val="Heading1"/>
       </w:pPr>
       <w:r>
-        <w:t>2 Audit workflow</w:t>
+        <w:t>2 Design and Implementation</w:t>
       </w:r>
     </w:p>
     <w:p>
@@ -209,678 +209,6 @@
         <w:t>Later checks address different failure modes. An ordered feature-schema comparison detects channel swaps even when tensor dimensions are unchanged. An artifact check compares file bytes against a declared SHA-256 manifest and rejects paths outside the specified artifact directory. Matching hashes demonstrate identity with the reference bytes; they do not establish that those bytes are scientifically correct. Table 1 translates each check into a practical action.</w:t>
       </w:r>
     </w:p>
-    <w:p>
-      <w:pPr>
-        <w:pStyle w:val="Caption"/>
-        <w:keepNext/>
-      </w:pPr>
-      <w:r>
-        <w:t>Table 1 Checks and actions before interpreting results</w:t>
-      </w:r>
-    </w:p>
-    <w:tbl>
-      <w:tblPr>
-        <w:tblW w:type="auto" w:w="0"/>
-        <w:tblLayout w:type="fixed"/>
-        <w:tblLook w:firstColumn="1" w:firstRow="1" w:lastColumn="0" w:lastRow="0" w:noHBand="0" w:noVBand="1" w:val="04A0"/>
-      </w:tblPr>
-      <w:tblGrid>
-        <w:gridCol w:w="1728"/>
-        <w:gridCol w:w="3096"/>
-        <w:gridCol w:w="4464"/>
-      </w:tblGrid>
-      <w:tr>
-        <w:trPr>
-          <w:tblHeader/>
-          <w:cantSplit/>
-        </w:trPr>
-        <w:tc>
-          <w:tcPr>
-            <w:tcW w:type="dxa" w:w="1728"/>
-            <w:tcBorders>
-              <w:top w:val="single" w:sz="4" w:color="D9D9D9"/>
-              <w:left w:val="single" w:sz="4" w:color="D9D9D9"/>
-              <w:bottom w:val="single" w:sz="4" w:color="D9D9D9"/>
-              <w:right w:val="single" w:sz="4" w:color="D9D9D9"/>
-            </w:tcBorders>
-            <w:tcMar>
-              <w:top w:w="85" w:type="dxa"/>
-              <w:left w:w="85" w:type="dxa"/>
-              <w:bottom w:w="85" w:type="dxa"/>
-              <w:right w:w="85" w:type="dxa"/>
-            </w:tcMar>
-            <w:shd w:fill="E5EDF3"/>
-          </w:tcPr>
-          <w:p>
-            <w:pPr>
-              <w:keepNext/>
-              <w:spacing w:after="40" w:before="40" w:line="240" w:lineRule="auto"/>
-            </w:pPr>
-            <w:r>
-              <w:rPr>
-                <w:b/>
-                <w:sz w:val="20"/>
-              </w:rPr>
-              <w:t>Check</w:t>
-            </w:r>
-          </w:p>
-        </w:tc>
-        <w:tc>
-          <w:tcPr>
-            <w:tcW w:type="dxa" w:w="3096"/>
-            <w:tcBorders>
-              <w:top w:val="single" w:sz="4" w:color="D9D9D9"/>
-              <w:left w:val="single" w:sz="4" w:color="D9D9D9"/>
-              <w:bottom w:val="single" w:sz="4" w:color="D9D9D9"/>
-              <w:right w:val="single" w:sz="4" w:color="D9D9D9"/>
-            </w:tcBorders>
-            <w:tcMar>
-              <w:top w:w="85" w:type="dxa"/>
-              <w:left w:w="85" w:type="dxa"/>
-              <w:bottom w:w="85" w:type="dxa"/>
-              <w:right w:w="85" w:type="dxa"/>
-            </w:tcMar>
-            <w:shd w:fill="E5EDF3"/>
-          </w:tcPr>
-          <w:p>
-            <w:pPr>
-              <w:keepNext/>
-              <w:spacing w:after="40" w:before="40" w:line="240" w:lineRule="auto"/>
-            </w:pPr>
-            <w:r>
-              <w:rPr>
-                <w:b/>
-                <w:sz w:val="20"/>
-              </w:rPr>
-              <w:t>Required evidence</w:t>
-            </w:r>
-          </w:p>
-        </w:tc>
-        <w:tc>
-          <w:tcPr>
-            <w:tcW w:type="dxa" w:w="4464"/>
-            <w:tcBorders>
-              <w:top w:val="single" w:sz="4" w:color="D9D9D9"/>
-              <w:left w:val="single" w:sz="4" w:color="D9D9D9"/>
-              <w:bottom w:val="single" w:sz="4" w:color="D9D9D9"/>
-              <w:right w:val="single" w:sz="4" w:color="D9D9D9"/>
-            </w:tcBorders>
-            <w:tcMar>
-              <w:top w:w="85" w:type="dxa"/>
-              <w:left w:w="85" w:type="dxa"/>
-              <w:bottom w:w="85" w:type="dxa"/>
-              <w:right w:w="85" w:type="dxa"/>
-            </w:tcMar>
-            <w:shd w:fill="E5EDF3"/>
-          </w:tcPr>
-          <w:p>
-            <w:pPr>
-              <w:keepNext/>
-              <w:spacing w:after="40" w:before="40" w:line="240" w:lineRule="auto"/>
-            </w:pPr>
-            <w:r>
-              <w:rPr>
-                <w:b/>
-                <w:sz w:val="20"/>
-              </w:rPr>
-              <w:t>Action when it fails</w:t>
-            </w:r>
-          </w:p>
-        </w:tc>
-      </w:tr>
-      <w:tr>
-        <w:trPr>
-          <w:cantSplit/>
-        </w:trPr>
-        <w:tc>
-          <w:tcPr>
-            <w:tcW w:type="dxa" w:w="1728"/>
-            <w:tcBorders>
-              <w:top w:val="single" w:sz="4" w:color="D9D9D9"/>
-              <w:left w:val="single" w:sz="4" w:color="D9D9D9"/>
-              <w:bottom w:val="single" w:sz="4" w:color="D9D9D9"/>
-              <w:right w:val="single" w:sz="4" w:color="D9D9D9"/>
-            </w:tcBorders>
-            <w:tcMar>
-              <w:top w:w="85" w:type="dxa"/>
-              <w:left w:w="85" w:type="dxa"/>
-              <w:bottom w:w="85" w:type="dxa"/>
-              <w:right w:w="85" w:type="dxa"/>
-            </w:tcMar>
-          </w:tcPr>
-          <w:p>
-            <w:pPr>
-              <w:spacing w:after="40" w:before="40" w:line="240" w:lineRule="auto"/>
-            </w:pPr>
-            <w:r>
-              <w:rPr>
-                <w:b w:val="0"/>
-                <w:sz w:val="20"/>
-              </w:rPr>
-              <w:t>Source separation</w:t>
-            </w:r>
-          </w:p>
-        </w:tc>
-        <w:tc>
-          <w:tcPr>
-            <w:tcW w:type="dxa" w:w="3096"/>
-            <w:tcBorders>
-              <w:top w:val="single" w:sz="4" w:color="D9D9D9"/>
-              <w:left w:val="single" w:sz="4" w:color="D9D9D9"/>
-              <w:bottom w:val="single" w:sz="4" w:color="D9D9D9"/>
-              <w:right w:val="single" w:sz="4" w:color="D9D9D9"/>
-            </w:tcBorders>
-            <w:tcMar>
-              <w:top w:w="85" w:type="dxa"/>
-              <w:left w:w="85" w:type="dxa"/>
-              <w:bottom w:w="85" w:type="dxa"/>
-              <w:right w:w="85" w:type="dxa"/>
-            </w:tcMar>
-          </w:tcPr>
-          <w:p>
-            <w:pPr>
-              <w:spacing w:after="40" w:before="40" w:line="240" w:lineRule="auto"/>
-            </w:pPr>
-            <w:r>
-              <w:rPr>
-                <w:b w:val="0"/>
-                <w:sz w:val="20"/>
-              </w:rPr>
-              <w:t>Record, source and split table</w:t>
-            </w:r>
-          </w:p>
-        </w:tc>
-        <w:tc>
-          <w:tcPr>
-            <w:tcW w:type="dxa" w:w="4464"/>
-            <w:tcBorders>
-              <w:top w:val="single" w:sz="4" w:color="D9D9D9"/>
-              <w:left w:val="single" w:sz="4" w:color="D9D9D9"/>
-              <w:bottom w:val="single" w:sz="4" w:color="D9D9D9"/>
-              <w:right w:val="single" w:sz="4" w:color="D9D9D9"/>
-            </w:tcBorders>
-            <w:tcMar>
-              <w:top w:w="85" w:type="dxa"/>
-              <w:left w:w="85" w:type="dxa"/>
-              <w:bottom w:w="85" w:type="dxa"/>
-              <w:right w:w="85" w:type="dxa"/>
-            </w:tcMar>
-          </w:tcPr>
-          <w:p>
-            <w:pPr>
-              <w:spacing w:after="40" w:before="40" w:line="240" w:lineRule="auto"/>
-            </w:pPr>
-            <w:r>
-              <w:rPr>
-                <w:b w:val="0"/>
-                <w:sz w:val="20"/>
-              </w:rPr>
-              <w:t>Resolve identity or revise the partition</w:t>
-            </w:r>
-          </w:p>
-        </w:tc>
-      </w:tr>
-      <w:tr>
-        <w:trPr>
-          <w:cantSplit/>
-        </w:trPr>
-        <w:tc>
-          <w:tcPr>
-            <w:tcW w:type="dxa" w:w="1728"/>
-            <w:tcBorders>
-              <w:top w:val="single" w:sz="4" w:color="D9D9D9"/>
-              <w:left w:val="single" w:sz="4" w:color="D9D9D9"/>
-              <w:bottom w:val="single" w:sz="4" w:color="D9D9D9"/>
-              <w:right w:val="single" w:sz="4" w:color="D9D9D9"/>
-            </w:tcBorders>
-            <w:tcMar>
-              <w:top w:w="85" w:type="dxa"/>
-              <w:left w:w="85" w:type="dxa"/>
-              <w:bottom w:w="85" w:type="dxa"/>
-              <w:right w:w="85" w:type="dxa"/>
-            </w:tcMar>
-          </w:tcPr>
-          <w:p>
-            <w:pPr>
-              <w:spacing w:after="40" w:before="40" w:line="240" w:lineRule="auto"/>
-            </w:pPr>
-            <w:r>
-              <w:rPr>
-                <w:b w:val="0"/>
-                <w:sz w:val="20"/>
-              </w:rPr>
-              <w:t>Derived-record lineage</w:t>
-            </w:r>
-          </w:p>
-        </w:tc>
-        <w:tc>
-          <w:tcPr>
-            <w:tcW w:type="dxa" w:w="3096"/>
-            <w:tcBorders>
-              <w:top w:val="single" w:sz="4" w:color="D9D9D9"/>
-              <w:left w:val="single" w:sz="4" w:color="D9D9D9"/>
-              <w:bottom w:val="single" w:sz="4" w:color="D9D9D9"/>
-              <w:right w:val="single" w:sz="4" w:color="D9D9D9"/>
-            </w:tcBorders>
-            <w:tcMar>
-              <w:top w:w="85" w:type="dxa"/>
-              <w:left w:w="85" w:type="dxa"/>
-              <w:bottom w:w="85" w:type="dxa"/>
-              <w:right w:w="85" w:type="dxa"/>
-            </w:tcMar>
-          </w:tcPr>
-          <w:p>
-            <w:pPr>
-              <w:spacing w:after="40" w:before="40" w:line="240" w:lineRule="auto"/>
-            </w:pPr>
-            <w:r>
-              <w:rPr>
-                <w:b w:val="0"/>
-                <w:sz w:val="20"/>
-              </w:rPr>
-              <w:t>Parent and child memberships</w:t>
-            </w:r>
-          </w:p>
-        </w:tc>
-        <w:tc>
-          <w:tcPr>
-            <w:tcW w:type="dxa" w:w="4464"/>
-            <w:tcBorders>
-              <w:top w:val="single" w:sz="4" w:color="D9D9D9"/>
-              <w:left w:val="single" w:sz="4" w:color="D9D9D9"/>
-              <w:bottom w:val="single" w:sz="4" w:color="D9D9D9"/>
-              <w:right w:val="single" w:sz="4" w:color="D9D9D9"/>
-            </w:tcBorders>
-            <w:tcMar>
-              <w:top w:w="85" w:type="dxa"/>
-              <w:left w:w="85" w:type="dxa"/>
-              <w:bottom w:w="85" w:type="dxa"/>
-              <w:right w:w="85" w:type="dxa"/>
-            </w:tcMar>
-          </w:tcPr>
-          <w:p>
-            <w:pPr>
-              <w:spacing w:after="40" w:before="40" w:line="240" w:lineRule="auto"/>
-            </w:pPr>
-            <w:r>
-              <w:rPr>
-                <w:b w:val="0"/>
-                <w:sz w:val="20"/>
-              </w:rPr>
-              <w:t>Restore the parent source and split</w:t>
-            </w:r>
-          </w:p>
-        </w:tc>
-      </w:tr>
-      <w:tr>
-        <w:trPr>
-          <w:cantSplit/>
-        </w:trPr>
-        <w:tc>
-          <w:tcPr>
-            <w:tcW w:type="dxa" w:w="1728"/>
-            <w:tcBorders>
-              <w:top w:val="single" w:sz="4" w:color="D9D9D9"/>
-              <w:left w:val="single" w:sz="4" w:color="D9D9D9"/>
-              <w:bottom w:val="single" w:sz="4" w:color="D9D9D9"/>
-              <w:right w:val="single" w:sz="4" w:color="D9D9D9"/>
-            </w:tcBorders>
-            <w:tcMar>
-              <w:top w:w="85" w:type="dxa"/>
-              <w:left w:w="85" w:type="dxa"/>
-              <w:bottom w:w="85" w:type="dxa"/>
-              <w:right w:w="85" w:type="dxa"/>
-            </w:tcMar>
-          </w:tcPr>
-          <w:p>
-            <w:pPr>
-              <w:spacing w:after="40" w:before="40" w:line="240" w:lineRule="auto"/>
-            </w:pPr>
-            <w:r>
-              <w:rPr>
-                <w:b w:val="0"/>
-                <w:sz w:val="20"/>
-              </w:rPr>
-              <w:t>OOF exclusion</w:t>
-            </w:r>
-          </w:p>
-        </w:tc>
-        <w:tc>
-          <w:tcPr>
-            <w:tcW w:type="dxa" w:w="3096"/>
-            <w:tcBorders>
-              <w:top w:val="single" w:sz="4" w:color="D9D9D9"/>
-              <w:left w:val="single" w:sz="4" w:color="D9D9D9"/>
-              <w:bottom w:val="single" w:sz="4" w:color="D9D9D9"/>
-              <w:right w:val="single" w:sz="4" w:color="D9D9D9"/>
-            </w:tcBorders>
-            <w:tcMar>
-              <w:top w:w="85" w:type="dxa"/>
-              <w:left w:w="85" w:type="dxa"/>
-              <w:bottom w:w="85" w:type="dxa"/>
-              <w:right w:w="85" w:type="dxa"/>
-            </w:tcMar>
-          </w:tcPr>
-          <w:p>
-            <w:pPr>
-              <w:spacing w:after="40" w:before="40" w:line="240" w:lineRule="auto"/>
-            </w:pPr>
-            <w:r>
-              <w:rPr>
-                <w:b w:val="0"/>
-                <w:sz w:val="20"/>
-              </w:rPr>
-              <w:t>Held, fit and inner-validation memberships</w:t>
-            </w:r>
-          </w:p>
-        </w:tc>
-        <w:tc>
-          <w:tcPr>
-            <w:tcW w:type="dxa" w:w="4464"/>
-            <w:tcBorders>
-              <w:top w:val="single" w:sz="4" w:color="D9D9D9"/>
-              <w:left w:val="single" w:sz="4" w:color="D9D9D9"/>
-              <w:bottom w:val="single" w:sz="4" w:color="D9D9D9"/>
-              <w:right w:val="single" w:sz="4" w:color="D9D9D9"/>
-            </w:tcBorders>
-            <w:tcMar>
-              <w:top w:w="85" w:type="dxa"/>
-              <w:left w:w="85" w:type="dxa"/>
-              <w:bottom w:w="85" w:type="dxa"/>
-              <w:right w:w="85" w:type="dxa"/>
-            </w:tcMar>
-          </w:tcPr>
-          <w:p>
-            <w:pPr>
-              <w:spacing w:after="40" w:before="40" w:line="240" w:lineRule="auto"/>
-            </w:pPr>
-            <w:r>
-              <w:rPr>
-                <w:b w:val="0"/>
-                <w:sz w:val="20"/>
-              </w:rPr>
-              <w:t>Regenerate affected derived predictions</w:t>
-            </w:r>
-          </w:p>
-        </w:tc>
-      </w:tr>
-      <w:tr>
-        <w:trPr>
-          <w:cantSplit/>
-        </w:trPr>
-        <w:tc>
-          <w:tcPr>
-            <w:tcW w:type="dxa" w:w="1728"/>
-            <w:tcBorders>
-              <w:top w:val="single" w:sz="4" w:color="D9D9D9"/>
-              <w:left w:val="single" w:sz="4" w:color="D9D9D9"/>
-              <w:bottom w:val="single" w:sz="4" w:color="D9D9D9"/>
-              <w:right w:val="single" w:sz="4" w:color="D9D9D9"/>
-            </w:tcBorders>
-            <w:tcMar>
-              <w:top w:w="85" w:type="dxa"/>
-              <w:left w:w="85" w:type="dxa"/>
-              <w:bottom w:w="85" w:type="dxa"/>
-              <w:right w:w="85" w:type="dxa"/>
-            </w:tcMar>
-          </w:tcPr>
-          <w:p>
-            <w:pPr>
-              <w:spacing w:after="40" w:before="40" w:line="240" w:lineRule="auto"/>
-            </w:pPr>
-            <w:r>
-              <w:rPr>
-                <w:b w:val="0"/>
-                <w:sz w:val="20"/>
-              </w:rPr>
-              <w:t>Feature order</w:t>
-            </w:r>
-          </w:p>
-        </w:tc>
-        <w:tc>
-          <w:tcPr>
-            <w:tcW w:type="dxa" w:w="3096"/>
-            <w:tcBorders>
-              <w:top w:val="single" w:sz="4" w:color="D9D9D9"/>
-              <w:left w:val="single" w:sz="4" w:color="D9D9D9"/>
-              <w:bottom w:val="single" w:sz="4" w:color="D9D9D9"/>
-              <w:right w:val="single" w:sz="4" w:color="D9D9D9"/>
-            </w:tcBorders>
-            <w:tcMar>
-              <w:top w:w="85" w:type="dxa"/>
-              <w:left w:w="85" w:type="dxa"/>
-              <w:bottom w:w="85" w:type="dxa"/>
-              <w:right w:w="85" w:type="dxa"/>
-            </w:tcMar>
-          </w:tcPr>
-          <w:p>
-            <w:pPr>
-              <w:spacing w:after="40" w:before="40" w:line="240" w:lineRule="auto"/>
-            </w:pPr>
-            <w:r>
-              <w:rPr>
-                <w:b w:val="0"/>
-                <w:sz w:val="20"/>
-              </w:rPr>
-              <w:t>Actual and expected channel lists</w:t>
-            </w:r>
-          </w:p>
-        </w:tc>
-        <w:tc>
-          <w:tcPr>
-            <w:tcW w:type="dxa" w:w="4464"/>
-            <w:tcBorders>
-              <w:top w:val="single" w:sz="4" w:color="D9D9D9"/>
-              <w:left w:val="single" w:sz="4" w:color="D9D9D9"/>
-              <w:bottom w:val="single" w:sz="4" w:color="D9D9D9"/>
-              <w:right w:val="single" w:sz="4" w:color="D9D9D9"/>
-            </w:tcBorders>
-            <w:tcMar>
-              <w:top w:w="85" w:type="dxa"/>
-              <w:left w:w="85" w:type="dxa"/>
-              <w:bottom w:w="85" w:type="dxa"/>
-              <w:right w:w="85" w:type="dxa"/>
-            </w:tcMar>
-          </w:tcPr>
-          <w:p>
-            <w:pPr>
-              <w:spacing w:after="40" w:before="40" w:line="240" w:lineRule="auto"/>
-            </w:pPr>
-            <w:r>
-              <w:rPr>
-                <w:b w:val="0"/>
-                <w:sz w:val="20"/>
-              </w:rPr>
-              <w:t>Restore the declared ordering</w:t>
-            </w:r>
-          </w:p>
-        </w:tc>
-      </w:tr>
-      <w:tr>
-        <w:trPr>
-          <w:cantSplit/>
-        </w:trPr>
-        <w:tc>
-          <w:tcPr>
-            <w:tcW w:type="dxa" w:w="1728"/>
-            <w:tcBorders>
-              <w:top w:val="single" w:sz="4" w:color="D9D9D9"/>
-              <w:left w:val="single" w:sz="4" w:color="D9D9D9"/>
-              <w:bottom w:val="single" w:sz="4" w:color="D9D9D9"/>
-              <w:right w:val="single" w:sz="4" w:color="D9D9D9"/>
-            </w:tcBorders>
-            <w:tcMar>
-              <w:top w:w="85" w:type="dxa"/>
-              <w:left w:w="85" w:type="dxa"/>
-              <w:bottom w:w="85" w:type="dxa"/>
-              <w:right w:w="85" w:type="dxa"/>
-            </w:tcMar>
-          </w:tcPr>
-          <w:p>
-            <w:pPr>
-              <w:spacing w:after="40" w:before="40" w:line="240" w:lineRule="auto"/>
-            </w:pPr>
-            <w:r>
-              <w:rPr>
-                <w:b w:val="0"/>
-                <w:sz w:val="20"/>
-              </w:rPr>
-              <w:t>Artifact identity</w:t>
-            </w:r>
-          </w:p>
-        </w:tc>
-        <w:tc>
-          <w:tcPr>
-            <w:tcW w:type="dxa" w:w="3096"/>
-            <w:tcBorders>
-              <w:top w:val="single" w:sz="4" w:color="D9D9D9"/>
-              <w:left w:val="single" w:sz="4" w:color="D9D9D9"/>
-              <w:bottom w:val="single" w:sz="4" w:color="D9D9D9"/>
-              <w:right w:val="single" w:sz="4" w:color="D9D9D9"/>
-            </w:tcBorders>
-            <w:tcMar>
-              <w:top w:w="85" w:type="dxa"/>
-              <w:left w:w="85" w:type="dxa"/>
-              <w:bottom w:w="85" w:type="dxa"/>
-              <w:right w:w="85" w:type="dxa"/>
-            </w:tcMar>
-          </w:tcPr>
-          <w:p>
-            <w:pPr>
-              <w:spacing w:after="40" w:before="40" w:line="240" w:lineRule="auto"/>
-            </w:pPr>
-            <w:r>
-              <w:rPr>
-                <w:b w:val="0"/>
-                <w:sz w:val="20"/>
-              </w:rPr>
-              <w:t>Files and a frozen SHA-256 manifest</w:t>
-            </w:r>
-          </w:p>
-        </w:tc>
-        <w:tc>
-          <w:tcPr>
-            <w:tcW w:type="dxa" w:w="4464"/>
-            <w:tcBorders>
-              <w:top w:val="single" w:sz="4" w:color="D9D9D9"/>
-              <w:left w:val="single" w:sz="4" w:color="D9D9D9"/>
-              <w:bottom w:val="single" w:sz="4" w:color="D9D9D9"/>
-              <w:right w:val="single" w:sz="4" w:color="D9D9D9"/>
-            </w:tcBorders>
-            <w:tcMar>
-              <w:top w:w="85" w:type="dxa"/>
-              <w:left w:w="85" w:type="dxa"/>
-              <w:bottom w:w="85" w:type="dxa"/>
-              <w:right w:w="85" w:type="dxa"/>
-            </w:tcMar>
-          </w:tcPr>
-          <w:p>
-            <w:pPr>
-              <w:spacing w:after="40" w:before="40" w:line="240" w:lineRule="auto"/>
-            </w:pPr>
-            <w:r>
-              <w:rPr>
-                <w:b w:val="0"/>
-                <w:sz w:val="20"/>
-              </w:rPr>
-              <w:t>Find the changed or missing artifact</w:t>
-            </w:r>
-          </w:p>
-        </w:tc>
-      </w:tr>
-      <w:tr>
-        <w:trPr>
-          <w:cantSplit/>
-        </w:trPr>
-        <w:tc>
-          <w:tcPr>
-            <w:tcW w:type="dxa" w:w="1728"/>
-            <w:tcBorders>
-              <w:top w:val="single" w:sz="4" w:color="D9D9D9"/>
-              <w:left w:val="single" w:sz="4" w:color="D9D9D9"/>
-              <w:bottom w:val="single" w:sz="4" w:color="D9D9D9"/>
-              <w:right w:val="single" w:sz="4" w:color="D9D9D9"/>
-            </w:tcBorders>
-            <w:tcMar>
-              <w:top w:w="85" w:type="dxa"/>
-              <w:left w:w="85" w:type="dxa"/>
-              <w:bottom w:w="85" w:type="dxa"/>
-              <w:right w:w="85" w:type="dxa"/>
-            </w:tcMar>
-          </w:tcPr>
-          <w:p>
-            <w:pPr>
-              <w:spacing w:after="40" w:before="40" w:line="240" w:lineRule="auto"/>
-            </w:pPr>
-            <w:r>
-              <w:rPr>
-                <w:b w:val="0"/>
-                <w:sz w:val="20"/>
-              </w:rPr>
-              <w:t>Historical roles</w:t>
-            </w:r>
-          </w:p>
-        </w:tc>
-        <w:tc>
-          <w:tcPr>
-            <w:tcW w:type="dxa" w:w="3096"/>
-            <w:tcBorders>
-              <w:top w:val="single" w:sz="4" w:color="D9D9D9"/>
-              <w:left w:val="single" w:sz="4" w:color="D9D9D9"/>
-              <w:bottom w:val="single" w:sz="4" w:color="D9D9D9"/>
-              <w:right w:val="single" w:sz="4" w:color="D9D9D9"/>
-            </w:tcBorders>
-            <w:tcMar>
-              <w:top w:w="85" w:type="dxa"/>
-              <w:left w:w="85" w:type="dxa"/>
-              <w:bottom w:w="85" w:type="dxa"/>
-              <w:right w:w="85" w:type="dxa"/>
-            </w:tcMar>
-          </w:tcPr>
-          <w:p>
-            <w:pPr>
-              <w:spacing w:after="40" w:before="40" w:line="240" w:lineRule="auto"/>
-            </w:pPr>
-            <w:r>
-              <w:rPr>
-                <w:b w:val="0"/>
-                <w:sz w:val="20"/>
-              </w:rPr>
-              <w:t>Earlier uses of present test sources</w:t>
-            </w:r>
-          </w:p>
-        </w:tc>
-        <w:tc>
-          <w:tcPr>
-            <w:tcW w:type="dxa" w:w="4464"/>
-            <w:tcBorders>
-              <w:top w:val="single" w:sz="4" w:color="D9D9D9"/>
-              <w:left w:val="single" w:sz="4" w:color="D9D9D9"/>
-              <w:bottom w:val="single" w:sz="4" w:color="D9D9D9"/>
-              <w:right w:val="single" w:sz="4" w:color="D9D9D9"/>
-            </w:tcBorders>
-            <w:tcMar>
-              <w:top w:w="85" w:type="dxa"/>
-              <w:left w:w="85" w:type="dxa"/>
-              <w:bottom w:w="85" w:type="dxa"/>
-              <w:right w:w="85" w:type="dxa"/>
-            </w:tcMar>
-          </w:tcPr>
-          <w:p>
-            <w:pPr>
-              <w:spacing w:after="40" w:before="40" w:line="240" w:lineRule="auto"/>
-            </w:pPr>
-            <w:r>
-              <w:rPr>
-                <w:b w:val="0"/>
-                <w:sz w:val="20"/>
-              </w:rPr>
-              <w:t>Limit independent-confirmation claims</w:t>
-            </w:r>
-          </w:p>
-        </w:tc>
-      </w:tr>
-    </w:tbl>
     <w:p>
       <w:pPr>
         <w:pStyle w:val="Heading1"/>
@@ -936,7 +264,7 @@
         <w:pStyle w:val="Heading1"/>
       </w:pPr>
       <w:r>
-        <w:t>3 Evaluation design</w:t>
+        <w:t>3 Case studies and verification</w:t>
       </w:r>
     </w:p>
     <w:p>
@@ -1055,678 +383,6 @@
     </w:p>
     <w:p>
       <w:pPr>
-        <w:pStyle w:val="Caption"/>
-        <w:keepNext/>
-      </w:pPr>
-      <w:r>
-        <w:t>Table 2 Tool outputs from frozen STEAD evidence</w:t>
-      </w:r>
-    </w:p>
-    <w:tbl>
-      <w:tblPr>
-        <w:tblW w:type="auto" w:w="0"/>
-        <w:tblLayout w:type="fixed"/>
-        <w:tblLook w:firstColumn="1" w:firstRow="1" w:lastColumn="0" w:lastRow="0" w:noHBand="0" w:noVBand="1" w:val="04A0"/>
-      </w:tblPr>
-      <w:tblGrid>
-        <w:gridCol w:w="3024"/>
-        <w:gridCol w:w="1800"/>
-        <w:gridCol w:w="4464"/>
-      </w:tblGrid>
-      <w:tr>
-        <w:trPr>
-          <w:tblHeader/>
-          <w:cantSplit/>
-        </w:trPr>
-        <w:tc>
-          <w:tcPr>
-            <w:tcW w:type="dxa" w:w="3024"/>
-            <w:tcBorders>
-              <w:top w:val="single" w:sz="4" w:color="D9D9D9"/>
-              <w:left w:val="single" w:sz="4" w:color="D9D9D9"/>
-              <w:bottom w:val="single" w:sz="4" w:color="D9D9D9"/>
-              <w:right w:val="single" w:sz="4" w:color="D9D9D9"/>
-            </w:tcBorders>
-            <w:tcMar>
-              <w:top w:w="85" w:type="dxa"/>
-              <w:left w:w="85" w:type="dxa"/>
-              <w:bottom w:w="85" w:type="dxa"/>
-              <w:right w:w="85" w:type="dxa"/>
-            </w:tcMar>
-            <w:shd w:fill="E5EDF3"/>
-          </w:tcPr>
-          <w:p>
-            <w:pPr>
-              <w:keepNext/>
-              <w:spacing w:after="40" w:before="40" w:line="240" w:lineRule="auto"/>
-            </w:pPr>
-            <w:r>
-              <w:rPr>
-                <w:b/>
-                <w:sz w:val="20"/>
-              </w:rPr>
-              <w:t>Check and input</w:t>
-            </w:r>
-          </w:p>
-        </w:tc>
-        <w:tc>
-          <w:tcPr>
-            <w:tcW w:type="dxa" w:w="1800"/>
-            <w:tcBorders>
-              <w:top w:val="single" w:sz="4" w:color="D9D9D9"/>
-              <w:left w:val="single" w:sz="4" w:color="D9D9D9"/>
-              <w:bottom w:val="single" w:sz="4" w:color="D9D9D9"/>
-              <w:right w:val="single" w:sz="4" w:color="D9D9D9"/>
-            </w:tcBorders>
-            <w:tcMar>
-              <w:top w:w="85" w:type="dxa"/>
-              <w:left w:w="85" w:type="dxa"/>
-              <w:bottom w:w="85" w:type="dxa"/>
-              <w:right w:w="85" w:type="dxa"/>
-            </w:tcMar>
-            <w:shd w:fill="E5EDF3"/>
-          </w:tcPr>
-          <w:p>
-            <w:pPr>
-              <w:keepNext/>
-              <w:spacing w:after="40" w:before="40" w:line="240" w:lineRule="auto"/>
-            </w:pPr>
-            <w:r>
-              <w:rPr>
-                <w:b/>
-                <w:sz w:val="20"/>
-              </w:rPr>
-              <w:t>Status</w:t>
-            </w:r>
-          </w:p>
-        </w:tc>
-        <w:tc>
-          <w:tcPr>
-            <w:tcW w:type="dxa" w:w="4464"/>
-            <w:tcBorders>
-              <w:top w:val="single" w:sz="4" w:color="D9D9D9"/>
-              <w:left w:val="single" w:sz="4" w:color="D9D9D9"/>
-              <w:bottom w:val="single" w:sz="4" w:color="D9D9D9"/>
-              <w:right w:val="single" w:sz="4" w:color="D9D9D9"/>
-            </w:tcBorders>
-            <w:tcMar>
-              <w:top w:w="85" w:type="dxa"/>
-              <w:left w:w="85" w:type="dxa"/>
-              <w:bottom w:w="85" w:type="dxa"/>
-              <w:right w:w="85" w:type="dxa"/>
-            </w:tcMar>
-            <w:shd w:fill="E5EDF3"/>
-          </w:tcPr>
-          <w:p>
-            <w:pPr>
-              <w:keepNext/>
-              <w:spacing w:after="40" w:before="40" w:line="240" w:lineRule="auto"/>
-            </w:pPr>
-            <w:r>
-              <w:rPr>
-                <w:b/>
-                <w:sz w:val="20"/>
-              </w:rPr>
-              <w:t>Key result</w:t>
-            </w:r>
-          </w:p>
-        </w:tc>
-      </w:tr>
-      <w:tr>
-        <w:trPr>
-          <w:cantSplit/>
-        </w:trPr>
-        <w:tc>
-          <w:tcPr>
-            <w:tcW w:type="dxa" w:w="3024"/>
-            <w:tcBorders>
-              <w:top w:val="single" w:sz="4" w:color="D9D9D9"/>
-              <w:left w:val="single" w:sz="4" w:color="D9D9D9"/>
-              <w:bottom w:val="single" w:sz="4" w:color="D9D9D9"/>
-              <w:right w:val="single" w:sz="4" w:color="D9D9D9"/>
-            </w:tcBorders>
-            <w:tcMar>
-              <w:top w:w="85" w:type="dxa"/>
-              <w:left w:w="85" w:type="dxa"/>
-              <w:bottom w:w="85" w:type="dxa"/>
-              <w:right w:w="85" w:type="dxa"/>
-            </w:tcMar>
-          </w:tcPr>
-          <w:p>
-            <w:pPr>
-              <w:spacing w:after="40" w:before="40" w:line="240" w:lineRule="auto"/>
-            </w:pPr>
-            <w:r>
-              <w:rPr>
-                <w:b w:val="0"/>
-                <w:sz w:val="20"/>
-              </w:rPr>
-              <w:t>Historical source membership</w:t>
-            </w:r>
-          </w:p>
-        </w:tc>
-        <w:tc>
-          <w:tcPr>
-            <w:tcW w:type="dxa" w:w="1800"/>
-            <w:tcBorders>
-              <w:top w:val="single" w:sz="4" w:color="D9D9D9"/>
-              <w:left w:val="single" w:sz="4" w:color="D9D9D9"/>
-              <w:bottom w:val="single" w:sz="4" w:color="D9D9D9"/>
-              <w:right w:val="single" w:sz="4" w:color="D9D9D9"/>
-            </w:tcBorders>
-            <w:tcMar>
-              <w:top w:w="85" w:type="dxa"/>
-              <w:left w:w="85" w:type="dxa"/>
-              <w:bottom w:w="85" w:type="dxa"/>
-              <w:right w:w="85" w:type="dxa"/>
-            </w:tcMar>
-          </w:tcPr>
-          <w:p>
-            <w:pPr>
-              <w:spacing w:after="40" w:before="40" w:line="240" w:lineRule="auto"/>
-            </w:pPr>
-            <w:r>
-              <w:rPr>
-                <w:b w:val="0"/>
-                <w:sz w:val="20"/>
-              </w:rPr>
-              <w:t>FAIL</w:t>
-            </w:r>
-          </w:p>
-        </w:tc>
-        <w:tc>
-          <w:tcPr>
-            <w:tcW w:type="dxa" w:w="4464"/>
-            <w:tcBorders>
-              <w:top w:val="single" w:sz="4" w:color="D9D9D9"/>
-              <w:left w:val="single" w:sz="4" w:color="D9D9D9"/>
-              <w:bottom w:val="single" w:sz="4" w:color="D9D9D9"/>
-              <w:right w:val="single" w:sz="4" w:color="D9D9D9"/>
-            </w:tcBorders>
-            <w:tcMar>
-              <w:top w:w="85" w:type="dxa"/>
-              <w:left w:w="85" w:type="dxa"/>
-              <w:bottom w:w="85" w:type="dxa"/>
-              <w:right w:w="85" w:type="dxa"/>
-            </w:tcMar>
-          </w:tcPr>
-          <w:p>
-            <w:pPr>
-              <w:spacing w:after="40" w:before="40" w:line="240" w:lineRule="auto"/>
-            </w:pPr>
-            <w:r>
-              <w:rPr>
-                <w:b w:val="0"/>
-                <w:sz w:val="20"/>
-              </w:rPr>
-              <w:t>151/335 test records share training sources; 168/335 share training or validation</w:t>
-            </w:r>
-          </w:p>
-        </w:tc>
-      </w:tr>
-      <w:tr>
-        <w:trPr>
-          <w:cantSplit/>
-        </w:trPr>
-        <w:tc>
-          <w:tcPr>
-            <w:tcW w:type="dxa" w:w="3024"/>
-            <w:tcBorders>
-              <w:top w:val="single" w:sz="4" w:color="D9D9D9"/>
-              <w:left w:val="single" w:sz="4" w:color="D9D9D9"/>
-              <w:bottom w:val="single" w:sz="4" w:color="D9D9D9"/>
-              <w:right w:val="single" w:sz="4" w:color="D9D9D9"/>
-            </w:tcBorders>
-            <w:tcMar>
-              <w:top w:w="85" w:type="dxa"/>
-              <w:left w:w="85" w:type="dxa"/>
-              <w:bottom w:w="85" w:type="dxa"/>
-              <w:right w:w="85" w:type="dxa"/>
-            </w:tcMar>
-          </w:tcPr>
-          <w:p>
-            <w:pPr>
-              <w:spacing w:after="40" w:before="40" w:line="240" w:lineRule="auto"/>
-            </w:pPr>
-            <w:r>
-              <w:rPr>
-                <w:b w:val="0"/>
-                <w:sz w:val="20"/>
-              </w:rPr>
-              <w:t>Corrected source membership</w:t>
-            </w:r>
-          </w:p>
-        </w:tc>
-        <w:tc>
-          <w:tcPr>
-            <w:tcW w:type="dxa" w:w="1800"/>
-            <w:tcBorders>
-              <w:top w:val="single" w:sz="4" w:color="D9D9D9"/>
-              <w:left w:val="single" w:sz="4" w:color="D9D9D9"/>
-              <w:bottom w:val="single" w:sz="4" w:color="D9D9D9"/>
-              <w:right w:val="single" w:sz="4" w:color="D9D9D9"/>
-            </w:tcBorders>
-            <w:tcMar>
-              <w:top w:w="85" w:type="dxa"/>
-              <w:left w:w="85" w:type="dxa"/>
-              <w:bottom w:w="85" w:type="dxa"/>
-              <w:right w:w="85" w:type="dxa"/>
-            </w:tcMar>
-          </w:tcPr>
-          <w:p>
-            <w:pPr>
-              <w:spacing w:after="40" w:before="40" w:line="240" w:lineRule="auto"/>
-            </w:pPr>
-            <w:r>
-              <w:rPr>
-                <w:b w:val="0"/>
-                <w:sz w:val="20"/>
-              </w:rPr>
-              <w:t>PASS</w:t>
-            </w:r>
-          </w:p>
-        </w:tc>
-        <w:tc>
-          <w:tcPr>
-            <w:tcW w:type="dxa" w:w="4464"/>
-            <w:tcBorders>
-              <w:top w:val="single" w:sz="4" w:color="D9D9D9"/>
-              <w:left w:val="single" w:sz="4" w:color="D9D9D9"/>
-              <w:bottom w:val="single" w:sz="4" w:color="D9D9D9"/>
-              <w:right w:val="single" w:sz="4" w:color="D9D9D9"/>
-            </w:tcBorders>
-            <w:tcMar>
-              <w:top w:w="85" w:type="dxa"/>
-              <w:left w:w="85" w:type="dxa"/>
-              <w:bottom w:w="85" w:type="dxa"/>
-              <w:right w:w="85" w:type="dxa"/>
-            </w:tcMar>
-          </w:tcPr>
-          <w:p>
-            <w:pPr>
-              <w:spacing w:after="40" w:before="40" w:line="240" w:lineRule="auto"/>
-            </w:pPr>
-            <w:r>
-              <w:rPr>
-                <w:b w:val="0"/>
-                <w:sz w:val="20"/>
-              </w:rPr>
-              <w:t>Zero shared sources</w:t>
-            </w:r>
-          </w:p>
-        </w:tc>
-      </w:tr>
-      <w:tr>
-        <w:trPr>
-          <w:cantSplit/>
-        </w:trPr>
-        <w:tc>
-          <w:tcPr>
-            <w:tcW w:type="dxa" w:w="3024"/>
-            <w:tcBorders>
-              <w:top w:val="single" w:sz="4" w:color="D9D9D9"/>
-              <w:left w:val="single" w:sz="4" w:color="D9D9D9"/>
-              <w:bottom w:val="single" w:sz="4" w:color="D9D9D9"/>
-              <w:right w:val="single" w:sz="4" w:color="D9D9D9"/>
-            </w:tcBorders>
-            <w:tcMar>
-              <w:top w:w="85" w:type="dxa"/>
-              <w:left w:w="85" w:type="dxa"/>
-              <w:bottom w:w="85" w:type="dxa"/>
-              <w:right w:w="85" w:type="dxa"/>
-            </w:tcMar>
-          </w:tcPr>
-          <w:p>
-            <w:pPr>
-              <w:spacing w:after="40" w:before="40" w:line="240" w:lineRule="auto"/>
-            </w:pPr>
-            <w:r>
-              <w:rPr>
-                <w:b w:val="0"/>
-                <w:sz w:val="20"/>
-              </w:rPr>
-              <w:t>Current test versus historical roles</w:t>
-            </w:r>
-          </w:p>
-        </w:tc>
-        <w:tc>
-          <w:tcPr>
-            <w:tcW w:type="dxa" w:w="1800"/>
-            <w:tcBorders>
-              <w:top w:val="single" w:sz="4" w:color="D9D9D9"/>
-              <w:left w:val="single" w:sz="4" w:color="D9D9D9"/>
-              <w:bottom w:val="single" w:sz="4" w:color="D9D9D9"/>
-              <w:right w:val="single" w:sz="4" w:color="D9D9D9"/>
-            </w:tcBorders>
-            <w:tcMar>
-              <w:top w:w="85" w:type="dxa"/>
-              <w:left w:w="85" w:type="dxa"/>
-              <w:bottom w:w="85" w:type="dxa"/>
-              <w:right w:w="85" w:type="dxa"/>
-            </w:tcMar>
-          </w:tcPr>
-          <w:p>
-            <w:pPr>
-              <w:spacing w:after="40" w:before="40" w:line="240" w:lineRule="auto"/>
-            </w:pPr>
-            <w:r>
-              <w:rPr>
-                <w:b w:val="0"/>
-                <w:sz w:val="20"/>
-              </w:rPr>
-              <w:t>WARNING</w:t>
-            </w:r>
-          </w:p>
-        </w:tc>
-        <w:tc>
-          <w:tcPr>
-            <w:tcW w:type="dxa" w:w="4464"/>
-            <w:tcBorders>
-              <w:top w:val="single" w:sz="4" w:color="D9D9D9"/>
-              <w:left w:val="single" w:sz="4" w:color="D9D9D9"/>
-              <w:bottom w:val="single" w:sz="4" w:color="D9D9D9"/>
-              <w:right w:val="single" w:sz="4" w:color="D9D9D9"/>
-            </w:tcBorders>
-            <w:tcMar>
-              <w:top w:w="85" w:type="dxa"/>
-              <w:left w:w="85" w:type="dxa"/>
-              <w:bottom w:w="85" w:type="dxa"/>
-              <w:right w:w="85" w:type="dxa"/>
-            </w:tcMar>
-          </w:tcPr>
-          <w:p>
-            <w:pPr>
-              <w:spacing w:after="40" w:before="40" w:line="240" w:lineRule="auto"/>
-            </w:pPr>
-            <w:r>
-              <w:rPr>
-                <w:b w:val="0"/>
-                <w:sz w:val="20"/>
-              </w:rPr>
-              <w:t>196/221 sources and 304/330 records had development roles</w:t>
-            </w:r>
-          </w:p>
-        </w:tc>
-      </w:tr>
-      <w:tr>
-        <w:trPr>
-          <w:cantSplit/>
-        </w:trPr>
-        <w:tc>
-          <w:tcPr>
-            <w:tcW w:type="dxa" w:w="3024"/>
-            <w:tcBorders>
-              <w:top w:val="single" w:sz="4" w:color="D9D9D9"/>
-              <w:left w:val="single" w:sz="4" w:color="D9D9D9"/>
-              <w:bottom w:val="single" w:sz="4" w:color="D9D9D9"/>
-              <w:right w:val="single" w:sz="4" w:color="D9D9D9"/>
-            </w:tcBorders>
-            <w:tcMar>
-              <w:top w:w="85" w:type="dxa"/>
-              <w:left w:w="85" w:type="dxa"/>
-              <w:bottom w:w="85" w:type="dxa"/>
-              <w:right w:w="85" w:type="dxa"/>
-            </w:tcMar>
-          </w:tcPr>
-          <w:p>
-            <w:pPr>
-              <w:spacing w:after="40" w:before="40" w:line="240" w:lineRule="auto"/>
-            </w:pPr>
-            <w:r>
-              <w:rPr>
-                <w:b w:val="0"/>
-                <w:sz w:val="20"/>
-              </w:rPr>
-              <w:t>Six OOF membership tables</w:t>
-            </w:r>
-          </w:p>
-        </w:tc>
-        <w:tc>
-          <w:tcPr>
-            <w:tcW w:type="dxa" w:w="1800"/>
-            <w:tcBorders>
-              <w:top w:val="single" w:sz="4" w:color="D9D9D9"/>
-              <w:left w:val="single" w:sz="4" w:color="D9D9D9"/>
-              <w:bottom w:val="single" w:sz="4" w:color="D9D9D9"/>
-              <w:right w:val="single" w:sz="4" w:color="D9D9D9"/>
-            </w:tcBorders>
-            <w:tcMar>
-              <w:top w:w="85" w:type="dxa"/>
-              <w:left w:w="85" w:type="dxa"/>
-              <w:bottom w:w="85" w:type="dxa"/>
-              <w:right w:w="85" w:type="dxa"/>
-            </w:tcMar>
-          </w:tcPr>
-          <w:p>
-            <w:pPr>
-              <w:spacing w:after="40" w:before="40" w:line="240" w:lineRule="auto"/>
-            </w:pPr>
-            <w:r>
-              <w:rPr>
-                <w:b w:val="0"/>
-                <w:sz w:val="20"/>
-              </w:rPr>
-              <w:t>PASS</w:t>
-            </w:r>
-          </w:p>
-        </w:tc>
-        <w:tc>
-          <w:tcPr>
-            <w:tcW w:type="dxa" w:w="4464"/>
-            <w:tcBorders>
-              <w:top w:val="single" w:sz="4" w:color="D9D9D9"/>
-              <w:left w:val="single" w:sz="4" w:color="D9D9D9"/>
-              <w:bottom w:val="single" w:sz="4" w:color="D9D9D9"/>
-              <w:right w:val="single" w:sz="4" w:color="D9D9D9"/>
-            </w:tcBorders>
-            <w:tcMar>
-              <w:top w:w="85" w:type="dxa"/>
-              <w:left w:w="85" w:type="dxa"/>
-              <w:bottom w:w="85" w:type="dxa"/>
-              <w:right w:w="85" w:type="dxa"/>
-            </w:tcMar>
-          </w:tcPr>
-          <w:p>
-            <w:pPr>
-              <w:spacing w:after="40" w:before="40" w:line="240" w:lineRule="auto"/>
-            </w:pPr>
-            <w:r>
-              <w:rPr>
-                <w:b w:val="0"/>
-                <w:sz w:val="20"/>
-              </w:rPr>
-              <w:t>30 configuration–fold checks; five inner-fold tables shared across six configurations</w:t>
-            </w:r>
-          </w:p>
-        </w:tc>
-      </w:tr>
-      <w:tr>
-        <w:trPr>
-          <w:cantSplit/>
-        </w:trPr>
-        <w:tc>
-          <w:tcPr>
-            <w:tcW w:type="dxa" w:w="3024"/>
-            <w:tcBorders>
-              <w:top w:val="single" w:sz="4" w:color="D9D9D9"/>
-              <w:left w:val="single" w:sz="4" w:color="D9D9D9"/>
-              <w:bottom w:val="single" w:sz="4" w:color="D9D9D9"/>
-              <w:right w:val="single" w:sz="4" w:color="D9D9D9"/>
-            </w:tcBorders>
-            <w:tcMar>
-              <w:top w:w="85" w:type="dxa"/>
-              <w:left w:w="85" w:type="dxa"/>
-              <w:bottom w:w="85" w:type="dxa"/>
-              <w:right w:w="85" w:type="dxa"/>
-            </w:tcMar>
-          </w:tcPr>
-          <w:p>
-            <w:pPr>
-              <w:spacing w:after="40" w:before="40" w:line="240" w:lineRule="auto"/>
-            </w:pPr>
-            <w:r>
-              <w:rPr>
-                <w:b w:val="0"/>
-                <w:sz w:val="20"/>
-              </w:rPr>
-              <w:t>Lineage adapted from replay receipts</w:t>
-            </w:r>
-          </w:p>
-        </w:tc>
-        <w:tc>
-          <w:tcPr>
-            <w:tcW w:type="dxa" w:w="1800"/>
-            <w:tcBorders>
-              <w:top w:val="single" w:sz="4" w:color="D9D9D9"/>
-              <w:left w:val="single" w:sz="4" w:color="D9D9D9"/>
-              <w:bottom w:val="single" w:sz="4" w:color="D9D9D9"/>
-              <w:right w:val="single" w:sz="4" w:color="D9D9D9"/>
-            </w:tcBorders>
-            <w:tcMar>
-              <w:top w:w="85" w:type="dxa"/>
-              <w:left w:w="85" w:type="dxa"/>
-              <w:bottom w:w="85" w:type="dxa"/>
-              <w:right w:w="85" w:type="dxa"/>
-            </w:tcMar>
-          </w:tcPr>
-          <w:p>
-            <w:pPr>
-              <w:spacing w:after="40" w:before="40" w:line="240" w:lineRule="auto"/>
-            </w:pPr>
-            <w:r>
-              <w:rPr>
-                <w:b w:val="0"/>
-                <w:sz w:val="20"/>
-              </w:rPr>
-              <w:t>Consistent (reconstructed)</w:t>
-            </w:r>
-          </w:p>
-        </w:tc>
-        <w:tc>
-          <w:tcPr>
-            <w:tcW w:type="dxa" w:w="4464"/>
-            <w:tcBorders>
-              <w:top w:val="single" w:sz="4" w:color="D9D9D9"/>
-              <w:left w:val="single" w:sz="4" w:color="D9D9D9"/>
-              <w:bottom w:val="single" w:sz="4" w:color="D9D9D9"/>
-              <w:right w:val="single" w:sz="4" w:color="D9D9D9"/>
-            </w:tcBorders>
-            <w:tcMar>
-              <w:top w:w="85" w:type="dxa"/>
-              <w:left w:w="85" w:type="dxa"/>
-              <w:bottom w:w="85" w:type="dxa"/>
-              <w:right w:w="85" w:type="dxa"/>
-            </w:tcMar>
-          </w:tcPr>
-          <w:p>
-            <w:pPr>
-              <w:spacing w:after="40" w:before="40" w:line="240" w:lineRule="auto"/>
-            </w:pPr>
-            <w:r>
-              <w:rPr>
-                <w:b w:val="0"/>
-                <w:sz w:val="20"/>
-              </w:rPr>
-              <w:t>9,264 receipt-derived child keys agree with frozen source and fold memberships; no augmentation-time log available</w:t>
-            </w:r>
-          </w:p>
-        </w:tc>
-      </w:tr>
-      <w:tr>
-        <w:trPr>
-          <w:cantSplit/>
-        </w:trPr>
-        <w:tc>
-          <w:tcPr>
-            <w:tcW w:type="dxa" w:w="3024"/>
-            <w:tcBorders>
-              <w:top w:val="single" w:sz="4" w:color="D9D9D9"/>
-              <w:left w:val="single" w:sz="4" w:color="D9D9D9"/>
-              <w:bottom w:val="single" w:sz="4" w:color="D9D9D9"/>
-              <w:right w:val="single" w:sz="4" w:color="D9D9D9"/>
-            </w:tcBorders>
-            <w:tcMar>
-              <w:top w:w="85" w:type="dxa"/>
-              <w:left w:w="85" w:type="dxa"/>
-              <w:bottom w:w="85" w:type="dxa"/>
-              <w:right w:w="85" w:type="dxa"/>
-            </w:tcMar>
-          </w:tcPr>
-          <w:p>
-            <w:pPr>
-              <w:spacing w:after="40" w:before="40" w:line="240" w:lineRule="auto"/>
-            </w:pPr>
-            <w:r>
-              <w:rPr>
-                <w:b w:val="0"/>
-                <w:sz w:val="20"/>
-              </w:rPr>
-              <w:t>Checkpoint and public-code hashes</w:t>
-            </w:r>
-          </w:p>
-        </w:tc>
-        <w:tc>
-          <w:tcPr>
-            <w:tcW w:type="dxa" w:w="1800"/>
-            <w:tcBorders>
-              <w:top w:val="single" w:sz="4" w:color="D9D9D9"/>
-              <w:left w:val="single" w:sz="4" w:color="D9D9D9"/>
-              <w:bottom w:val="single" w:sz="4" w:color="D9D9D9"/>
-              <w:right w:val="single" w:sz="4" w:color="D9D9D9"/>
-            </w:tcBorders>
-            <w:tcMar>
-              <w:top w:w="85" w:type="dxa"/>
-              <w:left w:w="85" w:type="dxa"/>
-              <w:bottom w:w="85" w:type="dxa"/>
-              <w:right w:w="85" w:type="dxa"/>
-            </w:tcMar>
-          </w:tcPr>
-          <w:p>
-            <w:pPr>
-              <w:spacing w:after="40" w:before="40" w:line="240" w:lineRule="auto"/>
-            </w:pPr>
-            <w:r>
-              <w:rPr>
-                <w:b w:val="0"/>
-                <w:sz w:val="20"/>
-              </w:rPr>
-              <w:t>PASS</w:t>
-            </w:r>
-          </w:p>
-        </w:tc>
-        <w:tc>
-          <w:tcPr>
-            <w:tcW w:type="dxa" w:w="4464"/>
-            <w:tcBorders>
-              <w:top w:val="single" w:sz="4" w:color="D9D9D9"/>
-              <w:left w:val="single" w:sz="4" w:color="D9D9D9"/>
-              <w:bottom w:val="single" w:sz="4" w:color="D9D9D9"/>
-              <w:right w:val="single" w:sz="4" w:color="D9D9D9"/>
-            </w:tcBorders>
-            <w:tcMar>
-              <w:top w:w="85" w:type="dxa"/>
-              <w:left w:w="85" w:type="dxa"/>
-              <w:bottom w:w="85" w:type="dxa"/>
-              <w:right w:w="85" w:type="dxa"/>
-            </w:tcMar>
-          </w:tcPr>
-          <w:p>
-            <w:pPr>
-              <w:spacing w:after="40" w:before="40" w:line="240" w:lineRule="auto"/>
-            </w:pPr>
-            <w:r>
-              <w:rPr>
-                <w:b w:val="0"/>
-                <w:sz w:val="20"/>
-              </w:rPr>
-              <w:t>106 checkpoints and 93 code files</w:t>
-            </w:r>
-          </w:p>
-        </w:tc>
-      </w:tr>
-    </w:tbl>
-    <w:p>
-      <w:pPr>
         <w:pStyle w:val="Heading1"/>
       </w:pPr>
       <w:r>
@@ -1739,647 +395,13 @@
       </w:r>
     </w:p>
     <w:p>
-      <w:pPr>
-        <w:pStyle w:val="Caption"/>
-        <w:keepNext/>
-      </w:pPr>
-      <w:r>
-        <w:t>Table 3 ETHZ records by partition and audit outcome</w:t>
-      </w:r>
-    </w:p>
-    <w:tbl>
-      <w:tblPr>
-        <w:tblW w:type="auto" w:w="0"/>
-        <w:tblLayout w:type="fixed"/>
-        <w:tblLook w:firstColumn="1" w:firstRow="1" w:lastColumn="0" w:lastRow="0" w:noHBand="0" w:noVBand="1" w:val="04A0"/>
-      </w:tblPr>
-      <w:tblGrid>
-        <w:gridCol w:w="3168"/>
-        <w:gridCol w:w="1368"/>
-        <w:gridCol w:w="1368"/>
-        <w:gridCol w:w="1368"/>
-        <w:gridCol w:w="2016"/>
-      </w:tblGrid>
-      <w:tr>
-        <w:trPr>
-          <w:tblHeader/>
-          <w:cantSplit/>
-        </w:trPr>
-        <w:tc>
-          <w:tcPr>
-            <w:tcW w:type="dxa" w:w="3168"/>
-            <w:tcBorders>
-              <w:top w:val="single" w:sz="4" w:color="D9D9D9"/>
-              <w:left w:val="single" w:sz="4" w:color="D9D9D9"/>
-              <w:bottom w:val="single" w:sz="4" w:color="D9D9D9"/>
-              <w:right w:val="single" w:sz="4" w:color="D9D9D9"/>
-            </w:tcBorders>
-            <w:tcMar>
-              <w:top w:w="85" w:type="dxa"/>
-              <w:left w:w="85" w:type="dxa"/>
-              <w:bottom w:w="85" w:type="dxa"/>
-              <w:right w:w="85" w:type="dxa"/>
-            </w:tcMar>
-            <w:shd w:fill="E5EDF3"/>
-          </w:tcPr>
-          <w:p>
-            <w:pPr>
-              <w:keepNext/>
-              <w:spacing w:after="40" w:before="40" w:line="240" w:lineRule="auto"/>
-            </w:pPr>
-            <w:r>
-              <w:rPr>
-                <w:b/>
-                <w:sz w:val="20"/>
-              </w:rPr>
-              <w:t>Partition</w:t>
-            </w:r>
-          </w:p>
-        </w:tc>
-        <w:tc>
-          <w:tcPr>
-            <w:tcW w:type="dxa" w:w="1368"/>
-            <w:tcBorders>
-              <w:top w:val="single" w:sz="4" w:color="D9D9D9"/>
-              <w:left w:val="single" w:sz="4" w:color="D9D9D9"/>
-              <w:bottom w:val="single" w:sz="4" w:color="D9D9D9"/>
-              <w:right w:val="single" w:sz="4" w:color="D9D9D9"/>
-            </w:tcBorders>
-            <w:tcMar>
-              <w:top w:w="85" w:type="dxa"/>
-              <w:left w:w="85" w:type="dxa"/>
-              <w:bottom w:w="85" w:type="dxa"/>
-              <w:right w:w="85" w:type="dxa"/>
-            </w:tcMar>
-            <w:shd w:fill="E5EDF3"/>
-          </w:tcPr>
-          <w:p>
-            <w:pPr>
-              <w:keepNext/>
-              <w:spacing w:after="40" w:before="40" w:line="240" w:lineRule="auto"/>
-            </w:pPr>
-            <w:r>
-              <w:rPr>
-                <w:b/>
-                <w:sz w:val="20"/>
-              </w:rPr>
-              <w:t>Train</w:t>
-            </w:r>
-          </w:p>
-        </w:tc>
-        <w:tc>
-          <w:tcPr>
-            <w:tcW w:type="dxa" w:w="1368"/>
-            <w:tcBorders>
-              <w:top w:val="single" w:sz="4" w:color="D9D9D9"/>
-              <w:left w:val="single" w:sz="4" w:color="D9D9D9"/>
-              <w:bottom w:val="single" w:sz="4" w:color="D9D9D9"/>
-              <w:right w:val="single" w:sz="4" w:color="D9D9D9"/>
-            </w:tcBorders>
-            <w:tcMar>
-              <w:top w:w="85" w:type="dxa"/>
-              <w:left w:w="85" w:type="dxa"/>
-              <w:bottom w:w="85" w:type="dxa"/>
-              <w:right w:w="85" w:type="dxa"/>
-            </w:tcMar>
-            <w:shd w:fill="E5EDF3"/>
-          </w:tcPr>
-          <w:p>
-            <w:pPr>
-              <w:keepNext/>
-              <w:spacing w:after="40" w:before="40" w:line="240" w:lineRule="auto"/>
-            </w:pPr>
-            <w:r>
-              <w:rPr>
-                <w:b/>
-                <w:sz w:val="20"/>
-              </w:rPr>
-              <w:t>Dev</w:t>
-            </w:r>
-          </w:p>
-        </w:tc>
-        <w:tc>
-          <w:tcPr>
-            <w:tcW w:type="dxa" w:w="1368"/>
-            <w:tcBorders>
-              <w:top w:val="single" w:sz="4" w:color="D9D9D9"/>
-              <w:left w:val="single" w:sz="4" w:color="D9D9D9"/>
-              <w:bottom w:val="single" w:sz="4" w:color="D9D9D9"/>
-              <w:right w:val="single" w:sz="4" w:color="D9D9D9"/>
-            </w:tcBorders>
-            <w:tcMar>
-              <w:top w:w="85" w:type="dxa"/>
-              <w:left w:w="85" w:type="dxa"/>
-              <w:bottom w:w="85" w:type="dxa"/>
-              <w:right w:w="85" w:type="dxa"/>
-            </w:tcMar>
-            <w:shd w:fill="E5EDF3"/>
-          </w:tcPr>
-          <w:p>
-            <w:pPr>
-              <w:keepNext/>
-              <w:spacing w:after="40" w:before="40" w:line="240" w:lineRule="auto"/>
-            </w:pPr>
-            <w:r>
-              <w:rPr>
-                <w:b/>
-                <w:sz w:val="20"/>
-              </w:rPr>
-              <w:t>Test</w:t>
-            </w:r>
-          </w:p>
-        </w:tc>
-        <w:tc>
-          <w:tcPr>
-            <w:tcW w:type="dxa" w:w="2016"/>
-            <w:tcBorders>
-              <w:top w:val="single" w:sz="4" w:color="D9D9D9"/>
-              <w:left w:val="single" w:sz="4" w:color="D9D9D9"/>
-              <w:bottom w:val="single" w:sz="4" w:color="D9D9D9"/>
-              <w:right w:val="single" w:sz="4" w:color="D9D9D9"/>
-            </w:tcBorders>
-            <w:tcMar>
-              <w:top w:w="85" w:type="dxa"/>
-              <w:left w:w="85" w:type="dxa"/>
-              <w:bottom w:w="85" w:type="dxa"/>
-              <w:right w:w="85" w:type="dxa"/>
-            </w:tcMar>
-            <w:shd w:fill="E5EDF3"/>
-          </w:tcPr>
-          <w:p>
-            <w:pPr>
-              <w:keepNext/>
-              <w:spacing w:after="40" w:before="40" w:line="240" w:lineRule="auto"/>
-            </w:pPr>
-            <w:r>
-              <w:rPr>
-                <w:b/>
-                <w:sz w:val="20"/>
-              </w:rPr>
-              <w:t>Shared sources</w:t>
-            </w:r>
-          </w:p>
-        </w:tc>
-      </w:tr>
-      <w:tr>
-        <w:trPr>
-          <w:cantSplit/>
-        </w:trPr>
-        <w:tc>
-          <w:tcPr>
-            <w:tcW w:type="dxa" w:w="3168"/>
-            <w:tcBorders>
-              <w:top w:val="single" w:sz="4" w:color="D9D9D9"/>
-              <w:left w:val="single" w:sz="4" w:color="D9D9D9"/>
-              <w:bottom w:val="single" w:sz="4" w:color="D9D9D9"/>
-              <w:right w:val="single" w:sz="4" w:color="D9D9D9"/>
-            </w:tcBorders>
-            <w:tcMar>
-              <w:top w:w="85" w:type="dxa"/>
-              <w:left w:w="85" w:type="dxa"/>
-              <w:bottom w:w="85" w:type="dxa"/>
-              <w:right w:w="85" w:type="dxa"/>
-            </w:tcMar>
-          </w:tcPr>
-          <w:p>
-            <w:pPr>
-              <w:spacing w:after="40" w:before="40" w:line="240" w:lineRule="auto"/>
-            </w:pPr>
-            <w:r>
-              <w:rPr>
-                <w:b w:val="0"/>
-                <w:sz w:val="20"/>
-              </w:rPr>
-              <w:t>Supplied SeisBench</w:t>
-            </w:r>
-          </w:p>
-        </w:tc>
-        <w:tc>
-          <w:tcPr>
-            <w:tcW w:type="dxa" w:w="1368"/>
-            <w:tcBorders>
-              <w:top w:val="single" w:sz="4" w:color="D9D9D9"/>
-              <w:left w:val="single" w:sz="4" w:color="D9D9D9"/>
-              <w:bottom w:val="single" w:sz="4" w:color="D9D9D9"/>
-              <w:right w:val="single" w:sz="4" w:color="D9D9D9"/>
-            </w:tcBorders>
-            <w:tcMar>
-              <w:top w:w="85" w:type="dxa"/>
-              <w:left w:w="85" w:type="dxa"/>
-              <w:bottom w:w="85" w:type="dxa"/>
-              <w:right w:w="85" w:type="dxa"/>
-            </w:tcMar>
-          </w:tcPr>
-          <w:p>
-            <w:pPr>
-              <w:spacing w:after="40" w:before="40" w:line="240" w:lineRule="auto"/>
-            </w:pPr>
-            <w:r>
-              <w:rPr>
-                <w:b w:val="0"/>
-                <w:sz w:val="20"/>
-              </w:rPr>
-              <w:t>22626</w:t>
-            </w:r>
-          </w:p>
-        </w:tc>
-        <w:tc>
-          <w:tcPr>
-            <w:tcW w:type="dxa" w:w="1368"/>
-            <w:tcBorders>
-              <w:top w:val="single" w:sz="4" w:color="D9D9D9"/>
-              <w:left w:val="single" w:sz="4" w:color="D9D9D9"/>
-              <w:bottom w:val="single" w:sz="4" w:color="D9D9D9"/>
-              <w:right w:val="single" w:sz="4" w:color="D9D9D9"/>
-            </w:tcBorders>
-            <w:tcMar>
-              <w:top w:w="85" w:type="dxa"/>
-              <w:left w:w="85" w:type="dxa"/>
-              <w:bottom w:w="85" w:type="dxa"/>
-              <w:right w:w="85" w:type="dxa"/>
-            </w:tcMar>
-          </w:tcPr>
-          <w:p>
-            <w:pPr>
-              <w:spacing w:after="40" w:before="40" w:line="240" w:lineRule="auto"/>
-            </w:pPr>
-            <w:r>
-              <w:rPr>
-                <w:b w:val="0"/>
-                <w:sz w:val="20"/>
-              </w:rPr>
-              <w:t>3632</w:t>
-            </w:r>
-          </w:p>
-        </w:tc>
-        <w:tc>
-          <w:tcPr>
-            <w:tcW w:type="dxa" w:w="1368"/>
-            <w:tcBorders>
-              <w:top w:val="single" w:sz="4" w:color="D9D9D9"/>
-              <w:left w:val="single" w:sz="4" w:color="D9D9D9"/>
-              <w:bottom w:val="single" w:sz="4" w:color="D9D9D9"/>
-              <w:right w:val="single" w:sz="4" w:color="D9D9D9"/>
-            </w:tcBorders>
-            <w:tcMar>
-              <w:top w:w="85" w:type="dxa"/>
-              <w:left w:w="85" w:type="dxa"/>
-              <w:bottom w:w="85" w:type="dxa"/>
-              <w:right w:w="85" w:type="dxa"/>
-            </w:tcMar>
-          </w:tcPr>
-          <w:p>
-            <w:pPr>
-              <w:spacing w:after="40" w:before="40" w:line="240" w:lineRule="auto"/>
-            </w:pPr>
-            <w:r>
-              <w:rPr>
-                <w:b w:val="0"/>
-                <w:sz w:val="20"/>
-              </w:rPr>
-              <w:t>10485</w:t>
-            </w:r>
-          </w:p>
-        </w:tc>
-        <w:tc>
-          <w:tcPr>
-            <w:tcW w:type="dxa" w:w="2016"/>
-            <w:tcBorders>
-              <w:top w:val="single" w:sz="4" w:color="D9D9D9"/>
-              <w:left w:val="single" w:sz="4" w:color="D9D9D9"/>
-              <w:bottom w:val="single" w:sz="4" w:color="D9D9D9"/>
-              <w:right w:val="single" w:sz="4" w:color="D9D9D9"/>
-            </w:tcBorders>
-            <w:tcMar>
-              <w:top w:w="85" w:type="dxa"/>
-              <w:left w:w="85" w:type="dxa"/>
-              <w:bottom w:w="85" w:type="dxa"/>
-              <w:right w:w="85" w:type="dxa"/>
-            </w:tcMar>
-          </w:tcPr>
-          <w:p>
-            <w:pPr>
-              <w:spacing w:after="40" w:before="40" w:line="240" w:lineRule="auto"/>
-            </w:pPr>
-            <w:r>
-              <w:rPr>
-                <w:b w:val="0"/>
-                <w:sz w:val="20"/>
-              </w:rPr>
-              <w:t>0</w:t>
-            </w:r>
-          </w:p>
-        </w:tc>
-      </w:tr>
-      <w:tr>
-        <w:trPr>
-          <w:cantSplit/>
-        </w:trPr>
-        <w:tc>
-          <w:tcPr>
-            <w:tcW w:type="dxa" w:w="3168"/>
-            <w:tcBorders>
-              <w:top w:val="single" w:sz="4" w:color="D9D9D9"/>
-              <w:left w:val="single" w:sz="4" w:color="D9D9D9"/>
-              <w:bottom w:val="single" w:sz="4" w:color="D9D9D9"/>
-              <w:right w:val="single" w:sz="4" w:color="D9D9D9"/>
-            </w:tcBorders>
-            <w:tcMar>
-              <w:top w:w="85" w:type="dxa"/>
-              <w:left w:w="85" w:type="dxa"/>
-              <w:bottom w:w="85" w:type="dxa"/>
-              <w:right w:w="85" w:type="dxa"/>
-            </w:tcMar>
-          </w:tcPr>
-          <w:p>
-            <w:pPr>
-              <w:spacing w:after="40" w:before="40" w:line="240" w:lineRule="auto"/>
-            </w:pPr>
-            <w:r>
-              <w:rPr>
-                <w:b w:val="0"/>
-                <w:sz w:val="20"/>
-              </w:rPr>
-              <w:t>Constructed record-random</w:t>
-            </w:r>
-          </w:p>
-        </w:tc>
-        <w:tc>
-          <w:tcPr>
-            <w:tcW w:type="dxa" w:w="1368"/>
-            <w:tcBorders>
-              <w:top w:val="single" w:sz="4" w:color="D9D9D9"/>
-              <w:left w:val="single" w:sz="4" w:color="D9D9D9"/>
-              <w:bottom w:val="single" w:sz="4" w:color="D9D9D9"/>
-              <w:right w:val="single" w:sz="4" w:color="D9D9D9"/>
-            </w:tcBorders>
-            <w:tcMar>
-              <w:top w:w="85" w:type="dxa"/>
-              <w:left w:w="85" w:type="dxa"/>
-              <w:bottom w:w="85" w:type="dxa"/>
-              <w:right w:w="85" w:type="dxa"/>
-            </w:tcMar>
-          </w:tcPr>
-          <w:p>
-            <w:pPr>
-              <w:spacing w:after="40" w:before="40" w:line="240" w:lineRule="auto"/>
-            </w:pPr>
-            <w:r>
-              <w:rPr>
-                <w:b w:val="0"/>
-                <w:sz w:val="20"/>
-              </w:rPr>
-              <w:t>25720</w:t>
-            </w:r>
-          </w:p>
-        </w:tc>
-        <w:tc>
-          <w:tcPr>
-            <w:tcW w:type="dxa" w:w="1368"/>
-            <w:tcBorders>
-              <w:top w:val="single" w:sz="4" w:color="D9D9D9"/>
-              <w:left w:val="single" w:sz="4" w:color="D9D9D9"/>
-              <w:bottom w:val="single" w:sz="4" w:color="D9D9D9"/>
-              <w:right w:val="single" w:sz="4" w:color="D9D9D9"/>
-            </w:tcBorders>
-            <w:tcMar>
-              <w:top w:w="85" w:type="dxa"/>
-              <w:left w:w="85" w:type="dxa"/>
-              <w:bottom w:w="85" w:type="dxa"/>
-              <w:right w:w="85" w:type="dxa"/>
-            </w:tcMar>
-          </w:tcPr>
-          <w:p>
-            <w:pPr>
-              <w:spacing w:after="40" w:before="40" w:line="240" w:lineRule="auto"/>
-            </w:pPr>
-            <w:r>
-              <w:rPr>
-                <w:b w:val="0"/>
-                <w:sz w:val="20"/>
-              </w:rPr>
-              <w:t>5511</w:t>
-            </w:r>
-          </w:p>
-        </w:tc>
-        <w:tc>
-          <w:tcPr>
-            <w:tcW w:type="dxa" w:w="1368"/>
-            <w:tcBorders>
-              <w:top w:val="single" w:sz="4" w:color="D9D9D9"/>
-              <w:left w:val="single" w:sz="4" w:color="D9D9D9"/>
-              <w:bottom w:val="single" w:sz="4" w:color="D9D9D9"/>
-              <w:right w:val="single" w:sz="4" w:color="D9D9D9"/>
-            </w:tcBorders>
-            <w:tcMar>
-              <w:top w:w="85" w:type="dxa"/>
-              <w:left w:w="85" w:type="dxa"/>
-              <w:bottom w:w="85" w:type="dxa"/>
-              <w:right w:w="85" w:type="dxa"/>
-            </w:tcMar>
-          </w:tcPr>
-          <w:p>
-            <w:pPr>
-              <w:spacing w:after="40" w:before="40" w:line="240" w:lineRule="auto"/>
-            </w:pPr>
-            <w:r>
-              <w:rPr>
-                <w:b w:val="0"/>
-                <w:sz w:val="20"/>
-              </w:rPr>
-              <w:t>5512</w:t>
-            </w:r>
-          </w:p>
-        </w:tc>
-        <w:tc>
-          <w:tcPr>
-            <w:tcW w:type="dxa" w:w="2016"/>
-            <w:tcBorders>
-              <w:top w:val="single" w:sz="4" w:color="D9D9D9"/>
-              <w:left w:val="single" w:sz="4" w:color="D9D9D9"/>
-              <w:bottom w:val="single" w:sz="4" w:color="D9D9D9"/>
-              <w:right w:val="single" w:sz="4" w:color="D9D9D9"/>
-            </w:tcBorders>
-            <w:tcMar>
-              <w:top w:w="85" w:type="dxa"/>
-              <w:left w:w="85" w:type="dxa"/>
-              <w:bottom w:w="85" w:type="dxa"/>
-              <w:right w:w="85" w:type="dxa"/>
-            </w:tcMar>
-          </w:tcPr>
-          <w:p>
-            <w:pPr>
-              <w:spacing w:after="40" w:before="40" w:line="240" w:lineRule="auto"/>
-            </w:pPr>
-            <w:r>
-              <w:rPr>
-                <w:b w:val="0"/>
-                <w:sz w:val="20"/>
-              </w:rPr>
-              <w:t>2028</w:t>
-            </w:r>
-          </w:p>
-        </w:tc>
-      </w:tr>
-      <w:tr>
-        <w:trPr>
-          <w:cantSplit/>
-        </w:trPr>
-        <w:tc>
-          <w:tcPr>
-            <w:tcW w:type="dxa" w:w="3168"/>
-            <w:tcBorders>
-              <w:top w:val="single" w:sz="4" w:color="D9D9D9"/>
-              <w:left w:val="single" w:sz="4" w:color="D9D9D9"/>
-              <w:bottom w:val="single" w:sz="4" w:color="D9D9D9"/>
-              <w:right w:val="single" w:sz="4" w:color="D9D9D9"/>
-            </w:tcBorders>
-            <w:tcMar>
-              <w:top w:w="85" w:type="dxa"/>
-              <w:left w:w="85" w:type="dxa"/>
-              <w:bottom w:w="85" w:type="dxa"/>
-              <w:right w:w="85" w:type="dxa"/>
-            </w:tcMar>
-          </w:tcPr>
-          <w:p>
-            <w:pPr>
-              <w:spacing w:after="40" w:before="40" w:line="240" w:lineRule="auto"/>
-            </w:pPr>
-            <w:r>
-              <w:rPr>
-                <w:b w:val="0"/>
-                <w:sz w:val="20"/>
-              </w:rPr>
-              <w:t>Constructed source-grouped</w:t>
-            </w:r>
-          </w:p>
-        </w:tc>
-        <w:tc>
-          <w:tcPr>
-            <w:tcW w:type="dxa" w:w="1368"/>
-            <w:tcBorders>
-              <w:top w:val="single" w:sz="4" w:color="D9D9D9"/>
-              <w:left w:val="single" w:sz="4" w:color="D9D9D9"/>
-              <w:bottom w:val="single" w:sz="4" w:color="D9D9D9"/>
-              <w:right w:val="single" w:sz="4" w:color="D9D9D9"/>
-            </w:tcBorders>
-            <w:tcMar>
-              <w:top w:w="85" w:type="dxa"/>
-              <w:left w:w="85" w:type="dxa"/>
-              <w:bottom w:w="85" w:type="dxa"/>
-              <w:right w:w="85" w:type="dxa"/>
-            </w:tcMar>
-          </w:tcPr>
-          <w:p>
-            <w:pPr>
-              <w:spacing w:after="40" w:before="40" w:line="240" w:lineRule="auto"/>
-            </w:pPr>
-            <w:r>
-              <w:rPr>
-                <w:b w:val="0"/>
-                <w:sz w:val="20"/>
-              </w:rPr>
-              <w:t>25522</w:t>
-            </w:r>
-          </w:p>
-        </w:tc>
-        <w:tc>
-          <w:tcPr>
-            <w:tcW w:type="dxa" w:w="1368"/>
-            <w:tcBorders>
-              <w:top w:val="single" w:sz="4" w:color="D9D9D9"/>
-              <w:left w:val="single" w:sz="4" w:color="D9D9D9"/>
-              <w:bottom w:val="single" w:sz="4" w:color="D9D9D9"/>
-              <w:right w:val="single" w:sz="4" w:color="D9D9D9"/>
-            </w:tcBorders>
-            <w:tcMar>
-              <w:top w:w="85" w:type="dxa"/>
-              <w:left w:w="85" w:type="dxa"/>
-              <w:bottom w:w="85" w:type="dxa"/>
-              <w:right w:w="85" w:type="dxa"/>
-            </w:tcMar>
-          </w:tcPr>
-          <w:p>
-            <w:pPr>
-              <w:spacing w:after="40" w:before="40" w:line="240" w:lineRule="auto"/>
-            </w:pPr>
-            <w:r>
-              <w:rPr>
-                <w:b w:val="0"/>
-                <w:sz w:val="20"/>
-              </w:rPr>
-              <w:t>5850</w:t>
-            </w:r>
-          </w:p>
-        </w:tc>
-        <w:tc>
-          <w:tcPr>
-            <w:tcW w:type="dxa" w:w="1368"/>
-            <w:tcBorders>
-              <w:top w:val="single" w:sz="4" w:color="D9D9D9"/>
-              <w:left w:val="single" w:sz="4" w:color="D9D9D9"/>
-              <w:bottom w:val="single" w:sz="4" w:color="D9D9D9"/>
-              <w:right w:val="single" w:sz="4" w:color="D9D9D9"/>
-            </w:tcBorders>
-            <w:tcMar>
-              <w:top w:w="85" w:type="dxa"/>
-              <w:left w:w="85" w:type="dxa"/>
-              <w:bottom w:w="85" w:type="dxa"/>
-              <w:right w:w="85" w:type="dxa"/>
-            </w:tcMar>
-          </w:tcPr>
-          <w:p>
-            <w:pPr>
-              <w:spacing w:after="40" w:before="40" w:line="240" w:lineRule="auto"/>
-            </w:pPr>
-            <w:r>
-              <w:rPr>
-                <w:b w:val="0"/>
-                <w:sz w:val="20"/>
-              </w:rPr>
-              <w:t>5371</w:t>
-            </w:r>
-          </w:p>
-        </w:tc>
-        <w:tc>
-          <w:tcPr>
-            <w:tcW w:type="dxa" w:w="2016"/>
-            <w:tcBorders>
-              <w:top w:val="single" w:sz="4" w:color="D9D9D9"/>
-              <w:left w:val="single" w:sz="4" w:color="D9D9D9"/>
-              <w:bottom w:val="single" w:sz="4" w:color="D9D9D9"/>
-              <w:right w:val="single" w:sz="4" w:color="D9D9D9"/>
-            </w:tcBorders>
-            <w:tcMar>
-              <w:top w:w="85" w:type="dxa"/>
-              <w:left w:w="85" w:type="dxa"/>
-              <w:bottom w:w="85" w:type="dxa"/>
-              <w:right w:w="85" w:type="dxa"/>
-            </w:tcMar>
-          </w:tcPr>
-          <w:p>
-            <w:pPr>
-              <w:spacing w:after="40" w:before="40" w:line="240" w:lineRule="auto"/>
-            </w:pPr>
-            <w:r>
-              <w:rPr>
-                <w:b w:val="0"/>
-                <w:sz w:val="20"/>
-              </w:rPr>
-              <w:t>0</w:t>
-            </w:r>
-          </w:p>
-        </w:tc>
-      </w:tr>
-    </w:tbl>
-    <w:p>
       <w:r>
         <w:t>All rows contain 36,743 records and 2,231 distinct source identifiers. Shared sources means sources occurring in more than one subset, counted once. The two constructed rows use seed 42. The metadata demonstration verifies that the same membership interface handles another dataset table without using the STEAD-specific model implementation. It does not demonstrate an end-to-end model audit on ETHZ.</w:t>
       </w:r>
     </w:p>
     <w:p>
       <w:r>
-        <w:t>The station-key audit gives a different answer for the same supplied split. It contains 238 distinct network.station keys, with 212 in training, 188 in development and 206 in testing. Training and testing share 180 keys, covering 9,637 of 10,485 test records. Overall, 190 keys occur in more than one subset. Thus, this partition supports a source-exclusion claim for the supplied identifiers, but not an unseen-station evaluation claim under this key. No station-generalization performance is estimated.</w:t>
+        <w:t>The station-key audit gives a different answer for the same supplied split. It contains 238 distinct network.station keys, with 212 in training, 188 in development and 206 in testing. Training and testing share 180 keys, covering 9,637 of 10,485 test records. Overall, 190 keys occur in more than one subset. For an evaluation requiring source exclusion, report the PASS conditional on the supplied identifiers. If the intended claim concerns previously unseen stations, use a station-separated evaluation before making that claim; the source PASS is insufficient. The station FAIL does not invalidate the supplied split for its source-exclusion purpose. No station-generalization performance is estimated.</w:t>
       </w:r>
     </w:p>
     <w:p>
@@ -2398,7 +420,7 @@
     <w:p>
       <w:pPr/>
       <w:r>
-        <w:t>The usage walkthrough separately exercises the unchanged v0.1.3 wheel from outside the source directory. Native ETHZ columns reproduce the source and station counts against direct set calculations. Synthetic examples verify PASS, FAIL, WARNING, strict-warning and invalid-input exits. This author-run check verifies executable instructions, not independent-user adoption; its receipt and guide are supplied separately from the archived release.</w:t>
+        <w:t>The usage walkthrough separately exercises the unchanged v0.1.3 wheel from outside the source directory. Native ETHZ columns reproduce the source and station counts against direct set calculations. Synthetic examples verify PASS, FAIL, WARNING, strict-warning and invalid-input exits (Online Resource 1, Table S6). This author-run check verifies executable instructions, not independent-user adoption; its receipt and guide are supplied separately from the archived release.</w:t>
       </w:r>
     </w:p>
     <w:p>
@@ -2445,6 +467,48 @@
     <w:p>
       <w:r>
         <w:t>The tool detects a documented historical source-overlap failure and distinguishes that failure from the corrected STEAD memberships and their earlier development roles. Saved OOF memberships and frozen artifact hashes pass their specified checks. On ETHZ, the supplied partition is source-disjoint but shares 180 network.station keys between training and testing, demonstrating why the evaluation unit must be stated. These findings support explicit audit claims without estimating a change in model accuracy. We recommend running these checks, and reporting historical data roles, before interpreting seismic machine-learning scores.</w:t>
+      </w:r>
+    </w:p>
+    <w:p>
+      <w:pPr>
+        <w:pStyle w:val="Heading1"/>
+      </w:pPr>
+      <w:r>
+        <w:t>Availability and Requirements</w:t>
+      </w:r>
+    </w:p>
+    <w:p>
+      <w:pPr/>
+      <w:r>
+        <w:t>Project: seismic-eval-audit, version 0.1.3. Source, wheel and licence: https://github.com/rcw3712/seismic-eval-audit. Immutable software archive: https://doi.org/10.5281/zenodo.23684054. The software is distributed under the MIT licence; upstream data licences remain separate.</w:t>
+      </w:r>
+    </w:p>
+    <w:p>
+      <w:pPr/>
+      <w:r>
+        <w:t>Python 3.10 or later is required; the audit core has no third-party runtime dependencies. Verification covers Windows and Linux with Python 3.10 and 3.12; local verification used Python 3.12.14 on Windows. No MATLAB installation, GPU or trained model is required for the metadata workflow. Memory and storage depend on the input tables, reports and any artifacts being hashed; minimum RAM, disk capacity and cross-platform performance were not benchmarked. Network access is needed only when retrieving remote inputs or software.</w:t>
+      </w:r>
+    </w:p>
+    <w:p>
+      <w:pPr/>
+      <w:r>
+        <w:t>Install the supplied wheel in a Python environment:</w:t>
+      </w:r>
+    </w:p>
+    <w:p>
+      <w:pPr/>
+      <w:r>
+        <w:rPr>
+          <w:rFonts w:ascii="Courier New" w:hAnsi="Courier New"/>
+          <w:sz w:val="17"/>
+        </w:rPr>
+        <w:t>python -m pip install --no-deps dist/seismic_eval_audit-0.1.3-py3-none-any.whl</w:t>
+      </w:r>
+    </w:p>
+    <w:p>
+      <w:pPr/>
+      <w:r>
+        <w:t>The source CLI and separate APIs, their input contracts and their exit semantics are described in Online Resource 1. Section 9 provides the installed-wheel walkthrough; Code availability distinguishes its later commit from the software DOI.</w:t>
       </w:r>
     </w:p>
     <w:p>
@@ -2516,7 +580,7 @@
     <w:p>
       <w:pPr/>
       <w:r>
-        <w:t>The accompanying docs/WALKTHROUGH.md, docs/verify_walkthrough.py and wheel-usage receipt document use of that unchanged wheel. These additions and the current manuscript postdate the DOI snapshot and are identified by the accompanying Git commit and SHA-256 manifest.</w:t>
+        <w:t>The post-archive walkthrough, usage driver and verification receipt are fixed at commit 502b5415bead677ec810207affed55a0e76a9f82 (https://github.com/rcw3712/seismic-eval-audit/tree/502b5415bead677ec810207affed55a0e76a9f82). Its CHECKSUMS.csv records their hashes; Online Resource 1, Section 6 supplies the exact manifest URL and SHA-256. These files are outside the v0.1.3 Zenodo snapshot. The present manuscript is a later editorial revision and is not identified by that earlier documentation commit.</w:t>
       </w:r>
     </w:p>
     <w:p>
@@ -2542,7 +606,7 @@
     </w:p>
     <w:p>
       <w:r>
-        <w:t>Online Resource 1 provides input contracts, reproduction commands, evidence boundaries and network citations. The accompanying Software and Results directories contain the implementation and machine-readable reports. In the dedicated repository, software is at the root and case-study evidence is in case_studies/results. Earlier model-focused material remains available separately in the preserved STEAD case-study archive.</w:t>
+        <w:t>Online Resource 1 provides input contracts, reproduction commands, a comparison with grouped split interfaces, a contract-by-evidence matrix, an installed-wheel walkthrough and network citations. The implementation is at the repository root; machine-readable case-study reports are in case_studies/results and usage receipts in case_studies/verification. Earlier model-focused material remains in the preserved STEAD case-study archive.</w:t>
       </w:r>
     </w:p>
     <w:p>
@@ -2554,85 +618,2137 @@
       </w:r>
     </w:p>
     <w:p>
+      <w:pPr>
+        <w:keepLines/>
+      </w:pPr>
       <w:r>
         <w:t>AlpArray Seismic Network (2014) Eastern Alpine Seismic Investigation (EASI) - AlpArray Complimentary Experiment. AlpArray Working Group. https://doi.org/10.12686/alparray/xt_2014</w:t>
       </w:r>
     </w:p>
     <w:p>
+      <w:pPr>
+        <w:keepLines/>
+      </w:pPr>
       <w:r>
         <w:t>Cawley GC, Talbot NLC (2010) On over-fitting in model selection and subsequent selection bias in performance evaluation. Journal of Machine Learning Research 11:2079–2107. https://www.jmlr.org/papers/v11/cawley10a.html</w:t>
       </w:r>
     </w:p>
     <w:p>
+      <w:pPr>
+        <w:keepLines/>
+      </w:pPr>
       <w:r>
         <w:t>CERN (2016) CERN Seismic Network. ETH Zurich. https://doi.org/10.12686/sed/networks/c4</w:t>
       </w:r>
     </w:p>
     <w:p>
+      <w:pPr>
+        <w:keepLines/>
+      </w:pPr>
       <w:r>
         <w:t>Duerr RE, Downs RR, Tilmes C, Barkstrom B, Lenhardt WC, Glassy J, Bermudez LE, Slaughter P (2011) On the utility of identification schemes for digital earth science data: an assessment and recommendations. Earth Science Informatics 4:139–160. https://doi.org/10.1007/s12145-011-0083-6</w:t>
       </w:r>
     </w:p>
     <w:p>
+      <w:pPr>
+        <w:keepLines/>
+      </w:pPr>
       <w:r>
         <w:t>Kapoor S, Narayanan A (2023) Leakage and the reproducibility crisis in machine-learning-based science. Patterns 4:100804. https://doi.org/10.1016/j.patter.2023.100804</w:t>
       </w:r>
     </w:p>
     <w:p>
+      <w:pPr>
+        <w:keepLines/>
+      </w:pPr>
       <w:r>
         <w:t>Moreau L, Missier P (eds) (2013) PROV-DM: The PROV Data Model. W3C Recommendation, 30 April 2013. https://www.w3.org/TR/2013/REC-prov-dm-20130430/</w:t>
       </w:r>
     </w:p>
     <w:p>
+      <w:pPr>
+        <w:keepLines/>
+      </w:pPr>
       <w:r>
         <w:t>Mousavi SM, Sheng Y, Zhu W, Beroza GC (2019) STanford EArthquake Dataset (STEAD): A global data set of seismic signals for AI. IEEE Access 7:179464–179476. https://doi.org/10.1109/ACCESS.2019.2947848</w:t>
       </w:r>
     </w:p>
     <w:p>
+      <w:pPr>
+        <w:keepLines/>
+      </w:pPr>
       <w:r>
         <w:t>Münchmeyer J, Woollam J, Rietbrock A, Tilmann F, Lange D, Bornstein T, Diehl T, Giunchi C, Haslinger F, Jozinović D, Michelini A, Saul J, Soto H (2022) Which picker fits my data? A quantitative evaluation of deep learning based seismic pickers. Journal of Geophysical Research: Solid Earth 127:e2021JB023499. https://doi.org/10.1029/2021JB023499</w:t>
       </w:r>
     </w:p>
     <w:p>
-      <w:pPr/>
+      <w:pPr>
+        <w:keepLines/>
+      </w:pPr>
       <w:r>
         <w:t>Pedregosa F, Varoquaux G, Gramfort A, Michel V, Thirion B, Grisel O, Blondel M, Prettenhofer P, Weiss R, Dubourg V, Vanderplas J, Passos A, Cournapeau D, Brucher M, Perrot M, Duchesnay E (2011) Scikit-learn: Machine Learning in Python. Journal of Machine Learning Research 12:2825–2830. https://jmlr.org/papers/v12/pedregosa11a.html</w:t>
       </w:r>
     </w:p>
     <w:p>
+      <w:pPr>
+        <w:keepLines/>
+      </w:pPr>
       <w:r>
         <w:t>Roberts DR, Bahn V, Ciuti S, Boyce MS, Elith J, Guillera-Arroita G, Hauenstein S, Lahoz-Monfort JJ, Schröder B, Thuiller W, Warton DI, Wintle BA, Hartig F, Dormann CF (2017) Cross-validation strategies for data with temporal, spatial, hierarchical, or phylogenetic structure. Ecography 40:913–929. https://doi.org/10.1111/ecog.02881</w:t>
       </w:r>
     </w:p>
     <w:p>
+      <w:pPr>
+        <w:keepLines/>
+      </w:pPr>
       <w:r>
         <w:t>Swiss Seismological Service at ETH Zurich (1983) National Seismic Networks of Switzerland. ETH Zürich. https://doi.org/10.12686/sed/networks/ch</w:t>
       </w:r>
     </w:p>
     <w:p>
+      <w:pPr>
+        <w:keepLines/>
+      </w:pPr>
       <w:r>
         <w:t>Swiss Seismological Service at ETH Zurich (2005) Temporary deployments in Switzerland associated with aftershocks and other seismic sequences. ETH Zurich. https://doi.org/10.12686/sed/networks/8d</w:t>
       </w:r>
     </w:p>
     <w:p>
+      <w:pPr>
+        <w:keepLines/>
+      </w:pPr>
       <w:r>
         <w:t>Swiss Seismological Service at ETH Zurich (2008) Seismology at School Program, ETH Zurich. ETH Zurich. https://doi.org/10.12686/sed/networks/s</w:t>
       </w:r>
     </w:p>
     <w:p>
-      <w:pPr/>
+      <w:pPr>
+        <w:keepLines/>
+      </w:pPr>
       <w:r>
         <w:t>Wibowo RC (2026) seismic-eval-audit. Version 0.1.3. Zenodo. https://doi.org/10.5281/zenodo.23684054</w:t>
       </w:r>
     </w:p>
     <w:p>
+      <w:pPr>
+        <w:keepLines/>
+      </w:pPr>
       <w:r>
         <w:t>Wibowo RC, Mahli RAK, Karyanto, Amijaya H, Aristoteles, Hermana M, Sarkowi M (2026) Source-Grouped Evaluation of Temporal Stacking for Seismic Phase Picking with Three-Component Data. Version source-verified-v2.0.0. Zenodo. https://doi.org/10.5281/zenodo.22824997</w:t>
       </w:r>
     </w:p>
     <w:p>
+      <w:pPr>
+        <w:keepLines/>
+      </w:pPr>
       <w:r>
         <w:t>Woollam J, Münchmeyer J, Tilmann F, Rietbrock A, Lange D, Bornstein T, Diehl T, Giunchi C, Haslinger F, Jozinović D, Michelini A, Saul J, Soto H (2022) SeisBench—A toolbox for machine learning in seismology. Seismological Research Letters 93:1695–1709. https://doi.org/10.1785/0220210324</w:t>
+      </w:r>
+    </w:p>
+    <w:p>
+      <w:pPr>
+        <w:pStyle w:val="Heading1"/>
+        <w:pageBreakBefore/>
+      </w:pPr>
+      <w:r>
+        <w:t>Tables and captions</w:t>
+      </w:r>
+    </w:p>
+    <w:p>
+      <w:pPr>
+        <w:pStyle w:val="Caption"/>
+        <w:keepNext/>
+      </w:pPr>
+      <w:r>
+        <w:t>Table 1 Checks and actions before interpreting results</w:t>
+      </w:r>
+    </w:p>
+    <w:tbl>
+      <w:tblPr>
+        <w:tblW w:type="auto" w:w="0"/>
+        <w:tblLayout w:type="fixed"/>
+        <w:tblLook w:firstColumn="1" w:firstRow="1" w:lastColumn="0" w:lastRow="0" w:noHBand="0" w:noVBand="1" w:val="04A0"/>
+      </w:tblPr>
+      <w:tblGrid>
+        <w:gridCol w:w="1728"/>
+        <w:gridCol w:w="3096"/>
+        <w:gridCol w:w="4464"/>
+      </w:tblGrid>
+      <w:tr>
+        <w:trPr>
+          <w:tblHeader/>
+          <w:cantSplit/>
+        </w:trPr>
+        <w:tc>
+          <w:tcPr>
+            <w:tcW w:type="dxa" w:w="1728"/>
+            <w:tcBorders>
+              <w:top w:val="single" w:sz="4" w:color="D9D9D9"/>
+              <w:left w:val="single" w:sz="4" w:color="D9D9D9"/>
+              <w:bottom w:val="single" w:sz="4" w:color="D9D9D9"/>
+              <w:right w:val="single" w:sz="4" w:color="D9D9D9"/>
+            </w:tcBorders>
+            <w:tcMar>
+              <w:top w:w="85" w:type="dxa"/>
+              <w:left w:w="85" w:type="dxa"/>
+              <w:bottom w:w="85" w:type="dxa"/>
+              <w:right w:w="85" w:type="dxa"/>
+            </w:tcMar>
+            <w:shd w:fill="E5EDF3"/>
+          </w:tcPr>
+          <w:p>
+            <w:pPr>
+              <w:keepNext/>
+              <w:spacing w:after="0" w:before="0" w:line="240" w:lineRule="auto"/>
+            </w:pPr>
+            <w:r>
+              <w:rPr>
+                <w:b/>
+                <w:sz w:val="20"/>
+              </w:rPr>
+              <w:t>Check</w:t>
+            </w:r>
+          </w:p>
+        </w:tc>
+        <w:tc>
+          <w:tcPr>
+            <w:tcW w:type="dxa" w:w="3096"/>
+            <w:tcBorders>
+              <w:top w:val="single" w:sz="4" w:color="D9D9D9"/>
+              <w:left w:val="single" w:sz="4" w:color="D9D9D9"/>
+              <w:bottom w:val="single" w:sz="4" w:color="D9D9D9"/>
+              <w:right w:val="single" w:sz="4" w:color="D9D9D9"/>
+            </w:tcBorders>
+            <w:tcMar>
+              <w:top w:w="85" w:type="dxa"/>
+              <w:left w:w="85" w:type="dxa"/>
+              <w:bottom w:w="85" w:type="dxa"/>
+              <w:right w:w="85" w:type="dxa"/>
+            </w:tcMar>
+            <w:shd w:fill="E5EDF3"/>
+          </w:tcPr>
+          <w:p>
+            <w:pPr>
+              <w:keepNext/>
+              <w:spacing w:after="0" w:before="0" w:line="240" w:lineRule="auto"/>
+            </w:pPr>
+            <w:r>
+              <w:rPr>
+                <w:b/>
+                <w:sz w:val="20"/>
+              </w:rPr>
+              <w:t>Required evidence</w:t>
+            </w:r>
+          </w:p>
+        </w:tc>
+        <w:tc>
+          <w:tcPr>
+            <w:tcW w:type="dxa" w:w="4464"/>
+            <w:tcBorders>
+              <w:top w:val="single" w:sz="4" w:color="D9D9D9"/>
+              <w:left w:val="single" w:sz="4" w:color="D9D9D9"/>
+              <w:bottom w:val="single" w:sz="4" w:color="D9D9D9"/>
+              <w:right w:val="single" w:sz="4" w:color="D9D9D9"/>
+            </w:tcBorders>
+            <w:tcMar>
+              <w:top w:w="85" w:type="dxa"/>
+              <w:left w:w="85" w:type="dxa"/>
+              <w:bottom w:w="85" w:type="dxa"/>
+              <w:right w:w="85" w:type="dxa"/>
+            </w:tcMar>
+            <w:shd w:fill="E5EDF3"/>
+          </w:tcPr>
+          <w:p>
+            <w:pPr>
+              <w:keepNext/>
+              <w:spacing w:after="0" w:before="0" w:line="240" w:lineRule="auto"/>
+            </w:pPr>
+            <w:r>
+              <w:rPr>
+                <w:b/>
+                <w:sz w:val="20"/>
+              </w:rPr>
+              <w:t>Action when it fails</w:t>
+            </w:r>
+          </w:p>
+        </w:tc>
+      </w:tr>
+      <w:tr>
+        <w:trPr>
+          <w:cantSplit/>
+        </w:trPr>
+        <w:tc>
+          <w:tcPr>
+            <w:tcW w:type="dxa" w:w="1728"/>
+            <w:tcBorders>
+              <w:top w:val="single" w:sz="4" w:color="D9D9D9"/>
+              <w:left w:val="single" w:sz="4" w:color="D9D9D9"/>
+              <w:bottom w:val="single" w:sz="4" w:color="D9D9D9"/>
+              <w:right w:val="single" w:sz="4" w:color="D9D9D9"/>
+            </w:tcBorders>
+            <w:tcMar>
+              <w:top w:w="85" w:type="dxa"/>
+              <w:left w:w="85" w:type="dxa"/>
+              <w:bottom w:w="85" w:type="dxa"/>
+              <w:right w:w="85" w:type="dxa"/>
+            </w:tcMar>
+          </w:tcPr>
+          <w:p>
+            <w:pPr>
+              <w:spacing w:after="0" w:before="0" w:line="240" w:lineRule="auto"/>
+            </w:pPr>
+            <w:r>
+              <w:rPr>
+                <w:b w:val="0"/>
+                <w:sz w:val="20"/>
+              </w:rPr>
+              <w:t>Source separation</w:t>
+            </w:r>
+          </w:p>
+        </w:tc>
+        <w:tc>
+          <w:tcPr>
+            <w:tcW w:type="dxa" w:w="3096"/>
+            <w:tcBorders>
+              <w:top w:val="single" w:sz="4" w:color="D9D9D9"/>
+              <w:left w:val="single" w:sz="4" w:color="D9D9D9"/>
+              <w:bottom w:val="single" w:sz="4" w:color="D9D9D9"/>
+              <w:right w:val="single" w:sz="4" w:color="D9D9D9"/>
+            </w:tcBorders>
+            <w:tcMar>
+              <w:top w:w="85" w:type="dxa"/>
+              <w:left w:w="85" w:type="dxa"/>
+              <w:bottom w:w="85" w:type="dxa"/>
+              <w:right w:w="85" w:type="dxa"/>
+            </w:tcMar>
+          </w:tcPr>
+          <w:p>
+            <w:pPr>
+              <w:spacing w:after="0" w:before="0" w:line="240" w:lineRule="auto"/>
+            </w:pPr>
+            <w:r>
+              <w:rPr>
+                <w:b w:val="0"/>
+                <w:sz w:val="20"/>
+              </w:rPr>
+              <w:t>Record, source and split table</w:t>
+            </w:r>
+          </w:p>
+        </w:tc>
+        <w:tc>
+          <w:tcPr>
+            <w:tcW w:type="dxa" w:w="4464"/>
+            <w:tcBorders>
+              <w:top w:val="single" w:sz="4" w:color="D9D9D9"/>
+              <w:left w:val="single" w:sz="4" w:color="D9D9D9"/>
+              <w:bottom w:val="single" w:sz="4" w:color="D9D9D9"/>
+              <w:right w:val="single" w:sz="4" w:color="D9D9D9"/>
+            </w:tcBorders>
+            <w:tcMar>
+              <w:top w:w="85" w:type="dxa"/>
+              <w:left w:w="85" w:type="dxa"/>
+              <w:bottom w:w="85" w:type="dxa"/>
+              <w:right w:w="85" w:type="dxa"/>
+            </w:tcMar>
+          </w:tcPr>
+          <w:p>
+            <w:pPr>
+              <w:spacing w:after="0" w:before="0" w:line="240" w:lineRule="auto"/>
+            </w:pPr>
+            <w:r>
+              <w:rPr>
+                <w:b w:val="0"/>
+                <w:sz w:val="20"/>
+              </w:rPr>
+              <w:t>Resolve identity or revise the partition</w:t>
+            </w:r>
+          </w:p>
+        </w:tc>
+      </w:tr>
+      <w:tr>
+        <w:trPr>
+          <w:cantSplit/>
+        </w:trPr>
+        <w:tc>
+          <w:tcPr>
+            <w:tcW w:type="dxa" w:w="1728"/>
+            <w:tcBorders>
+              <w:top w:val="single" w:sz="4" w:color="D9D9D9"/>
+              <w:left w:val="single" w:sz="4" w:color="D9D9D9"/>
+              <w:bottom w:val="single" w:sz="4" w:color="D9D9D9"/>
+              <w:right w:val="single" w:sz="4" w:color="D9D9D9"/>
+            </w:tcBorders>
+            <w:tcMar>
+              <w:top w:w="85" w:type="dxa"/>
+              <w:left w:w="85" w:type="dxa"/>
+              <w:bottom w:w="85" w:type="dxa"/>
+              <w:right w:w="85" w:type="dxa"/>
+            </w:tcMar>
+          </w:tcPr>
+          <w:p>
+            <w:pPr>
+              <w:spacing w:after="0" w:before="0" w:line="240" w:lineRule="auto"/>
+            </w:pPr>
+            <w:r>
+              <w:rPr>
+                <w:b w:val="0"/>
+                <w:sz w:val="20"/>
+              </w:rPr>
+              <w:t>Derived-record lineage</w:t>
+            </w:r>
+          </w:p>
+        </w:tc>
+        <w:tc>
+          <w:tcPr>
+            <w:tcW w:type="dxa" w:w="3096"/>
+            <w:tcBorders>
+              <w:top w:val="single" w:sz="4" w:color="D9D9D9"/>
+              <w:left w:val="single" w:sz="4" w:color="D9D9D9"/>
+              <w:bottom w:val="single" w:sz="4" w:color="D9D9D9"/>
+              <w:right w:val="single" w:sz="4" w:color="D9D9D9"/>
+            </w:tcBorders>
+            <w:tcMar>
+              <w:top w:w="85" w:type="dxa"/>
+              <w:left w:w="85" w:type="dxa"/>
+              <w:bottom w:w="85" w:type="dxa"/>
+              <w:right w:w="85" w:type="dxa"/>
+            </w:tcMar>
+          </w:tcPr>
+          <w:p>
+            <w:pPr>
+              <w:spacing w:after="0" w:before="0" w:line="240" w:lineRule="auto"/>
+            </w:pPr>
+            <w:r>
+              <w:rPr>
+                <w:b w:val="0"/>
+                <w:sz w:val="20"/>
+              </w:rPr>
+              <w:t>Parent and child memberships</w:t>
+            </w:r>
+          </w:p>
+        </w:tc>
+        <w:tc>
+          <w:tcPr>
+            <w:tcW w:type="dxa" w:w="4464"/>
+            <w:tcBorders>
+              <w:top w:val="single" w:sz="4" w:color="D9D9D9"/>
+              <w:left w:val="single" w:sz="4" w:color="D9D9D9"/>
+              <w:bottom w:val="single" w:sz="4" w:color="D9D9D9"/>
+              <w:right w:val="single" w:sz="4" w:color="D9D9D9"/>
+            </w:tcBorders>
+            <w:tcMar>
+              <w:top w:w="85" w:type="dxa"/>
+              <w:left w:w="85" w:type="dxa"/>
+              <w:bottom w:w="85" w:type="dxa"/>
+              <w:right w:w="85" w:type="dxa"/>
+            </w:tcMar>
+          </w:tcPr>
+          <w:p>
+            <w:pPr>
+              <w:spacing w:after="0" w:before="0" w:line="240" w:lineRule="auto"/>
+            </w:pPr>
+            <w:r>
+              <w:rPr>
+                <w:b w:val="0"/>
+                <w:sz w:val="20"/>
+              </w:rPr>
+              <w:t>Restore the parent source and split</w:t>
+            </w:r>
+          </w:p>
+        </w:tc>
+      </w:tr>
+      <w:tr>
+        <w:trPr>
+          <w:cantSplit/>
+        </w:trPr>
+        <w:tc>
+          <w:tcPr>
+            <w:tcW w:type="dxa" w:w="1728"/>
+            <w:tcBorders>
+              <w:top w:val="single" w:sz="4" w:color="D9D9D9"/>
+              <w:left w:val="single" w:sz="4" w:color="D9D9D9"/>
+              <w:bottom w:val="single" w:sz="4" w:color="D9D9D9"/>
+              <w:right w:val="single" w:sz="4" w:color="D9D9D9"/>
+            </w:tcBorders>
+            <w:tcMar>
+              <w:top w:w="85" w:type="dxa"/>
+              <w:left w:w="85" w:type="dxa"/>
+              <w:bottom w:w="85" w:type="dxa"/>
+              <w:right w:w="85" w:type="dxa"/>
+            </w:tcMar>
+          </w:tcPr>
+          <w:p>
+            <w:pPr>
+              <w:spacing w:after="0" w:before="0" w:line="240" w:lineRule="auto"/>
+            </w:pPr>
+            <w:r>
+              <w:rPr>
+                <w:b w:val="0"/>
+                <w:sz w:val="20"/>
+              </w:rPr>
+              <w:t>OOF exclusion</w:t>
+            </w:r>
+          </w:p>
+        </w:tc>
+        <w:tc>
+          <w:tcPr>
+            <w:tcW w:type="dxa" w:w="3096"/>
+            <w:tcBorders>
+              <w:top w:val="single" w:sz="4" w:color="D9D9D9"/>
+              <w:left w:val="single" w:sz="4" w:color="D9D9D9"/>
+              <w:bottom w:val="single" w:sz="4" w:color="D9D9D9"/>
+              <w:right w:val="single" w:sz="4" w:color="D9D9D9"/>
+            </w:tcBorders>
+            <w:tcMar>
+              <w:top w:w="85" w:type="dxa"/>
+              <w:left w:w="85" w:type="dxa"/>
+              <w:bottom w:w="85" w:type="dxa"/>
+              <w:right w:w="85" w:type="dxa"/>
+            </w:tcMar>
+          </w:tcPr>
+          <w:p>
+            <w:pPr>
+              <w:spacing w:after="0" w:before="0" w:line="240" w:lineRule="auto"/>
+            </w:pPr>
+            <w:r>
+              <w:rPr>
+                <w:b w:val="0"/>
+                <w:sz w:val="20"/>
+              </w:rPr>
+              <w:t>Held, fit and inner-validation memberships</w:t>
+            </w:r>
+          </w:p>
+        </w:tc>
+        <w:tc>
+          <w:tcPr>
+            <w:tcW w:type="dxa" w:w="4464"/>
+            <w:tcBorders>
+              <w:top w:val="single" w:sz="4" w:color="D9D9D9"/>
+              <w:left w:val="single" w:sz="4" w:color="D9D9D9"/>
+              <w:bottom w:val="single" w:sz="4" w:color="D9D9D9"/>
+              <w:right w:val="single" w:sz="4" w:color="D9D9D9"/>
+            </w:tcBorders>
+            <w:tcMar>
+              <w:top w:w="85" w:type="dxa"/>
+              <w:left w:w="85" w:type="dxa"/>
+              <w:bottom w:w="85" w:type="dxa"/>
+              <w:right w:w="85" w:type="dxa"/>
+            </w:tcMar>
+          </w:tcPr>
+          <w:p>
+            <w:pPr>
+              <w:spacing w:after="0" w:before="0" w:line="240" w:lineRule="auto"/>
+            </w:pPr>
+            <w:r>
+              <w:rPr>
+                <w:b w:val="0"/>
+                <w:sz w:val="20"/>
+              </w:rPr>
+              <w:t>Regenerate affected derived predictions</w:t>
+            </w:r>
+          </w:p>
+        </w:tc>
+      </w:tr>
+      <w:tr>
+        <w:trPr>
+          <w:cantSplit/>
+        </w:trPr>
+        <w:tc>
+          <w:tcPr>
+            <w:tcW w:type="dxa" w:w="1728"/>
+            <w:tcBorders>
+              <w:top w:val="single" w:sz="4" w:color="D9D9D9"/>
+              <w:left w:val="single" w:sz="4" w:color="D9D9D9"/>
+              <w:bottom w:val="single" w:sz="4" w:color="D9D9D9"/>
+              <w:right w:val="single" w:sz="4" w:color="D9D9D9"/>
+            </w:tcBorders>
+            <w:tcMar>
+              <w:top w:w="85" w:type="dxa"/>
+              <w:left w:w="85" w:type="dxa"/>
+              <w:bottom w:w="85" w:type="dxa"/>
+              <w:right w:w="85" w:type="dxa"/>
+            </w:tcMar>
+          </w:tcPr>
+          <w:p>
+            <w:pPr>
+              <w:spacing w:after="0" w:before="0" w:line="240" w:lineRule="auto"/>
+            </w:pPr>
+            <w:r>
+              <w:rPr>
+                <w:b w:val="0"/>
+                <w:sz w:val="20"/>
+              </w:rPr>
+              <w:t>Feature order</w:t>
+            </w:r>
+          </w:p>
+        </w:tc>
+        <w:tc>
+          <w:tcPr>
+            <w:tcW w:type="dxa" w:w="3096"/>
+            <w:tcBorders>
+              <w:top w:val="single" w:sz="4" w:color="D9D9D9"/>
+              <w:left w:val="single" w:sz="4" w:color="D9D9D9"/>
+              <w:bottom w:val="single" w:sz="4" w:color="D9D9D9"/>
+              <w:right w:val="single" w:sz="4" w:color="D9D9D9"/>
+            </w:tcBorders>
+            <w:tcMar>
+              <w:top w:w="85" w:type="dxa"/>
+              <w:left w:w="85" w:type="dxa"/>
+              <w:bottom w:w="85" w:type="dxa"/>
+              <w:right w:w="85" w:type="dxa"/>
+            </w:tcMar>
+          </w:tcPr>
+          <w:p>
+            <w:pPr>
+              <w:spacing w:after="0" w:before="0" w:line="240" w:lineRule="auto"/>
+            </w:pPr>
+            <w:r>
+              <w:rPr>
+                <w:b w:val="0"/>
+                <w:sz w:val="20"/>
+              </w:rPr>
+              <w:t>Actual and expected channel lists</w:t>
+            </w:r>
+          </w:p>
+        </w:tc>
+        <w:tc>
+          <w:tcPr>
+            <w:tcW w:type="dxa" w:w="4464"/>
+            <w:tcBorders>
+              <w:top w:val="single" w:sz="4" w:color="D9D9D9"/>
+              <w:left w:val="single" w:sz="4" w:color="D9D9D9"/>
+              <w:bottom w:val="single" w:sz="4" w:color="D9D9D9"/>
+              <w:right w:val="single" w:sz="4" w:color="D9D9D9"/>
+            </w:tcBorders>
+            <w:tcMar>
+              <w:top w:w="85" w:type="dxa"/>
+              <w:left w:w="85" w:type="dxa"/>
+              <w:bottom w:w="85" w:type="dxa"/>
+              <w:right w:w="85" w:type="dxa"/>
+            </w:tcMar>
+          </w:tcPr>
+          <w:p>
+            <w:pPr>
+              <w:spacing w:after="0" w:before="0" w:line="240" w:lineRule="auto"/>
+            </w:pPr>
+            <w:r>
+              <w:rPr>
+                <w:b w:val="0"/>
+                <w:sz w:val="20"/>
+              </w:rPr>
+              <w:t>Restore the declared ordering</w:t>
+            </w:r>
+          </w:p>
+        </w:tc>
+      </w:tr>
+      <w:tr>
+        <w:trPr>
+          <w:cantSplit/>
+        </w:trPr>
+        <w:tc>
+          <w:tcPr>
+            <w:tcW w:type="dxa" w:w="1728"/>
+            <w:tcBorders>
+              <w:top w:val="single" w:sz="4" w:color="D9D9D9"/>
+              <w:left w:val="single" w:sz="4" w:color="D9D9D9"/>
+              <w:bottom w:val="single" w:sz="4" w:color="D9D9D9"/>
+              <w:right w:val="single" w:sz="4" w:color="D9D9D9"/>
+            </w:tcBorders>
+            <w:tcMar>
+              <w:top w:w="85" w:type="dxa"/>
+              <w:left w:w="85" w:type="dxa"/>
+              <w:bottom w:w="85" w:type="dxa"/>
+              <w:right w:w="85" w:type="dxa"/>
+            </w:tcMar>
+          </w:tcPr>
+          <w:p>
+            <w:pPr>
+              <w:spacing w:after="0" w:before="0" w:line="240" w:lineRule="auto"/>
+            </w:pPr>
+            <w:r>
+              <w:rPr>
+                <w:b w:val="0"/>
+                <w:sz w:val="20"/>
+              </w:rPr>
+              <w:t>Artifact identity</w:t>
+            </w:r>
+          </w:p>
+        </w:tc>
+        <w:tc>
+          <w:tcPr>
+            <w:tcW w:type="dxa" w:w="3096"/>
+            <w:tcBorders>
+              <w:top w:val="single" w:sz="4" w:color="D9D9D9"/>
+              <w:left w:val="single" w:sz="4" w:color="D9D9D9"/>
+              <w:bottom w:val="single" w:sz="4" w:color="D9D9D9"/>
+              <w:right w:val="single" w:sz="4" w:color="D9D9D9"/>
+            </w:tcBorders>
+            <w:tcMar>
+              <w:top w:w="85" w:type="dxa"/>
+              <w:left w:w="85" w:type="dxa"/>
+              <w:bottom w:w="85" w:type="dxa"/>
+              <w:right w:w="85" w:type="dxa"/>
+            </w:tcMar>
+          </w:tcPr>
+          <w:p>
+            <w:pPr>
+              <w:spacing w:after="0" w:before="0" w:line="240" w:lineRule="auto"/>
+            </w:pPr>
+            <w:r>
+              <w:rPr>
+                <w:b w:val="0"/>
+                <w:sz w:val="20"/>
+              </w:rPr>
+              <w:t>Files and a frozen SHA-256 manifest</w:t>
+            </w:r>
+          </w:p>
+        </w:tc>
+        <w:tc>
+          <w:tcPr>
+            <w:tcW w:type="dxa" w:w="4464"/>
+            <w:tcBorders>
+              <w:top w:val="single" w:sz="4" w:color="D9D9D9"/>
+              <w:left w:val="single" w:sz="4" w:color="D9D9D9"/>
+              <w:bottom w:val="single" w:sz="4" w:color="D9D9D9"/>
+              <w:right w:val="single" w:sz="4" w:color="D9D9D9"/>
+            </w:tcBorders>
+            <w:tcMar>
+              <w:top w:w="85" w:type="dxa"/>
+              <w:left w:w="85" w:type="dxa"/>
+              <w:bottom w:w="85" w:type="dxa"/>
+              <w:right w:w="85" w:type="dxa"/>
+            </w:tcMar>
+          </w:tcPr>
+          <w:p>
+            <w:pPr>
+              <w:spacing w:after="0" w:before="0" w:line="240" w:lineRule="auto"/>
+            </w:pPr>
+            <w:r>
+              <w:rPr>
+                <w:b w:val="0"/>
+                <w:sz w:val="20"/>
+              </w:rPr>
+              <w:t>Find the changed or missing artifact</w:t>
+            </w:r>
+          </w:p>
+        </w:tc>
+      </w:tr>
+      <w:tr>
+        <w:trPr>
+          <w:cantSplit/>
+        </w:trPr>
+        <w:tc>
+          <w:tcPr>
+            <w:tcW w:type="dxa" w:w="1728"/>
+            <w:tcBorders>
+              <w:top w:val="single" w:sz="4" w:color="D9D9D9"/>
+              <w:left w:val="single" w:sz="4" w:color="D9D9D9"/>
+              <w:bottom w:val="single" w:sz="4" w:color="D9D9D9"/>
+              <w:right w:val="single" w:sz="4" w:color="D9D9D9"/>
+            </w:tcBorders>
+            <w:tcMar>
+              <w:top w:w="85" w:type="dxa"/>
+              <w:left w:w="85" w:type="dxa"/>
+              <w:bottom w:w="85" w:type="dxa"/>
+              <w:right w:w="85" w:type="dxa"/>
+            </w:tcMar>
+          </w:tcPr>
+          <w:p>
+            <w:pPr>
+              <w:spacing w:after="0" w:before="0" w:line="240" w:lineRule="auto"/>
+            </w:pPr>
+            <w:r>
+              <w:rPr>
+                <w:b w:val="0"/>
+                <w:sz w:val="20"/>
+              </w:rPr>
+              <w:t>Historical roles</w:t>
+            </w:r>
+          </w:p>
+        </w:tc>
+        <w:tc>
+          <w:tcPr>
+            <w:tcW w:type="dxa" w:w="3096"/>
+            <w:tcBorders>
+              <w:top w:val="single" w:sz="4" w:color="D9D9D9"/>
+              <w:left w:val="single" w:sz="4" w:color="D9D9D9"/>
+              <w:bottom w:val="single" w:sz="4" w:color="D9D9D9"/>
+              <w:right w:val="single" w:sz="4" w:color="D9D9D9"/>
+            </w:tcBorders>
+            <w:tcMar>
+              <w:top w:w="85" w:type="dxa"/>
+              <w:left w:w="85" w:type="dxa"/>
+              <w:bottom w:w="85" w:type="dxa"/>
+              <w:right w:w="85" w:type="dxa"/>
+            </w:tcMar>
+          </w:tcPr>
+          <w:p>
+            <w:pPr>
+              <w:spacing w:after="0" w:before="0" w:line="240" w:lineRule="auto"/>
+            </w:pPr>
+            <w:r>
+              <w:rPr>
+                <w:b w:val="0"/>
+                <w:sz w:val="20"/>
+              </w:rPr>
+              <w:t>Earlier uses of present test sources</w:t>
+            </w:r>
+          </w:p>
+        </w:tc>
+        <w:tc>
+          <w:tcPr>
+            <w:tcW w:type="dxa" w:w="4464"/>
+            <w:tcBorders>
+              <w:top w:val="single" w:sz="4" w:color="D9D9D9"/>
+              <w:left w:val="single" w:sz="4" w:color="D9D9D9"/>
+              <w:bottom w:val="single" w:sz="4" w:color="D9D9D9"/>
+              <w:right w:val="single" w:sz="4" w:color="D9D9D9"/>
+            </w:tcBorders>
+            <w:tcMar>
+              <w:top w:w="85" w:type="dxa"/>
+              <w:left w:w="85" w:type="dxa"/>
+              <w:bottom w:w="85" w:type="dxa"/>
+              <w:right w:w="85" w:type="dxa"/>
+            </w:tcMar>
+          </w:tcPr>
+          <w:p>
+            <w:pPr>
+              <w:spacing w:after="0" w:before="0" w:line="240" w:lineRule="auto"/>
+            </w:pPr>
+            <w:r>
+              <w:rPr>
+                <w:b w:val="0"/>
+                <w:sz w:val="20"/>
+              </w:rPr>
+              <w:t>Limit independent-confirmation claims</w:t>
+            </w:r>
+          </w:p>
+        </w:tc>
+      </w:tr>
+    </w:tbl>
+    <w:p>
+      <w:pPr>
+        <w:pStyle w:val="Caption"/>
+        <w:keepNext/>
+      </w:pPr>
+      <w:r>
+        <w:t>Table 2 Tool outputs from frozen STEAD evidence</w:t>
+      </w:r>
+    </w:p>
+    <w:tbl>
+      <w:tblPr>
+        <w:tblW w:type="auto" w:w="0"/>
+        <w:tblLayout w:type="fixed"/>
+        <w:tblLook w:firstColumn="1" w:firstRow="1" w:lastColumn="0" w:lastRow="0" w:noHBand="0" w:noVBand="1" w:val="04A0"/>
+      </w:tblPr>
+      <w:tblGrid>
+        <w:gridCol w:w="3024"/>
+        <w:gridCol w:w="1800"/>
+        <w:gridCol w:w="4464"/>
+      </w:tblGrid>
+      <w:tr>
+        <w:trPr>
+          <w:tblHeader/>
+          <w:cantSplit/>
+        </w:trPr>
+        <w:tc>
+          <w:tcPr>
+            <w:tcW w:type="dxa" w:w="3024"/>
+            <w:tcBorders>
+              <w:top w:val="single" w:sz="4" w:color="D9D9D9"/>
+              <w:left w:val="single" w:sz="4" w:color="D9D9D9"/>
+              <w:bottom w:val="single" w:sz="4" w:color="D9D9D9"/>
+              <w:right w:val="single" w:sz="4" w:color="D9D9D9"/>
+            </w:tcBorders>
+            <w:tcMar>
+              <w:top w:w="85" w:type="dxa"/>
+              <w:left w:w="85" w:type="dxa"/>
+              <w:bottom w:w="85" w:type="dxa"/>
+              <w:right w:w="85" w:type="dxa"/>
+            </w:tcMar>
+            <w:shd w:fill="E5EDF3"/>
+          </w:tcPr>
+          <w:p>
+            <w:pPr>
+              <w:keepNext/>
+              <w:spacing w:after="0" w:before="0" w:line="240" w:lineRule="auto"/>
+            </w:pPr>
+            <w:r>
+              <w:rPr>
+                <w:b/>
+                <w:sz w:val="20"/>
+              </w:rPr>
+              <w:t>Check and input</w:t>
+            </w:r>
+          </w:p>
+        </w:tc>
+        <w:tc>
+          <w:tcPr>
+            <w:tcW w:type="dxa" w:w="1800"/>
+            <w:tcBorders>
+              <w:top w:val="single" w:sz="4" w:color="D9D9D9"/>
+              <w:left w:val="single" w:sz="4" w:color="D9D9D9"/>
+              <w:bottom w:val="single" w:sz="4" w:color="D9D9D9"/>
+              <w:right w:val="single" w:sz="4" w:color="D9D9D9"/>
+            </w:tcBorders>
+            <w:tcMar>
+              <w:top w:w="85" w:type="dxa"/>
+              <w:left w:w="85" w:type="dxa"/>
+              <w:bottom w:w="85" w:type="dxa"/>
+              <w:right w:w="85" w:type="dxa"/>
+            </w:tcMar>
+            <w:shd w:fill="E5EDF3"/>
+          </w:tcPr>
+          <w:p>
+            <w:pPr>
+              <w:keepNext/>
+              <w:spacing w:after="0" w:before="0" w:line="240" w:lineRule="auto"/>
+            </w:pPr>
+            <w:r>
+              <w:rPr>
+                <w:b/>
+                <w:sz w:val="20"/>
+              </w:rPr>
+              <w:t>Status</w:t>
+            </w:r>
+          </w:p>
+        </w:tc>
+        <w:tc>
+          <w:tcPr>
+            <w:tcW w:type="dxa" w:w="4464"/>
+            <w:tcBorders>
+              <w:top w:val="single" w:sz="4" w:color="D9D9D9"/>
+              <w:left w:val="single" w:sz="4" w:color="D9D9D9"/>
+              <w:bottom w:val="single" w:sz="4" w:color="D9D9D9"/>
+              <w:right w:val="single" w:sz="4" w:color="D9D9D9"/>
+            </w:tcBorders>
+            <w:tcMar>
+              <w:top w:w="85" w:type="dxa"/>
+              <w:left w:w="85" w:type="dxa"/>
+              <w:bottom w:w="85" w:type="dxa"/>
+              <w:right w:w="85" w:type="dxa"/>
+            </w:tcMar>
+            <w:shd w:fill="E5EDF3"/>
+          </w:tcPr>
+          <w:p>
+            <w:pPr>
+              <w:keepNext/>
+              <w:spacing w:after="0" w:before="0" w:line="240" w:lineRule="auto"/>
+            </w:pPr>
+            <w:r>
+              <w:rPr>
+                <w:b/>
+                <w:sz w:val="20"/>
+              </w:rPr>
+              <w:t>Key result</w:t>
+            </w:r>
+          </w:p>
+        </w:tc>
+      </w:tr>
+      <w:tr>
+        <w:trPr>
+          <w:cantSplit/>
+        </w:trPr>
+        <w:tc>
+          <w:tcPr>
+            <w:tcW w:type="dxa" w:w="3024"/>
+            <w:tcBorders>
+              <w:top w:val="single" w:sz="4" w:color="D9D9D9"/>
+              <w:left w:val="single" w:sz="4" w:color="D9D9D9"/>
+              <w:bottom w:val="single" w:sz="4" w:color="D9D9D9"/>
+              <w:right w:val="single" w:sz="4" w:color="D9D9D9"/>
+            </w:tcBorders>
+            <w:tcMar>
+              <w:top w:w="85" w:type="dxa"/>
+              <w:left w:w="85" w:type="dxa"/>
+              <w:bottom w:w="85" w:type="dxa"/>
+              <w:right w:w="85" w:type="dxa"/>
+            </w:tcMar>
+          </w:tcPr>
+          <w:p>
+            <w:pPr>
+              <w:spacing w:after="0" w:before="0" w:line="240" w:lineRule="auto"/>
+            </w:pPr>
+            <w:r>
+              <w:rPr>
+                <w:b w:val="0"/>
+                <w:sz w:val="20"/>
+              </w:rPr>
+              <w:t>Historical source membership</w:t>
+            </w:r>
+          </w:p>
+        </w:tc>
+        <w:tc>
+          <w:tcPr>
+            <w:tcW w:type="dxa" w:w="1800"/>
+            <w:tcBorders>
+              <w:top w:val="single" w:sz="4" w:color="D9D9D9"/>
+              <w:left w:val="single" w:sz="4" w:color="D9D9D9"/>
+              <w:bottom w:val="single" w:sz="4" w:color="D9D9D9"/>
+              <w:right w:val="single" w:sz="4" w:color="D9D9D9"/>
+            </w:tcBorders>
+            <w:tcMar>
+              <w:top w:w="85" w:type="dxa"/>
+              <w:left w:w="85" w:type="dxa"/>
+              <w:bottom w:w="85" w:type="dxa"/>
+              <w:right w:w="85" w:type="dxa"/>
+            </w:tcMar>
+          </w:tcPr>
+          <w:p>
+            <w:pPr>
+              <w:spacing w:after="0" w:before="0" w:line="240" w:lineRule="auto"/>
+            </w:pPr>
+            <w:r>
+              <w:rPr>
+                <w:b w:val="0"/>
+                <w:sz w:val="20"/>
+              </w:rPr>
+              <w:t>FAIL</w:t>
+            </w:r>
+          </w:p>
+        </w:tc>
+        <w:tc>
+          <w:tcPr>
+            <w:tcW w:type="dxa" w:w="4464"/>
+            <w:tcBorders>
+              <w:top w:val="single" w:sz="4" w:color="D9D9D9"/>
+              <w:left w:val="single" w:sz="4" w:color="D9D9D9"/>
+              <w:bottom w:val="single" w:sz="4" w:color="D9D9D9"/>
+              <w:right w:val="single" w:sz="4" w:color="D9D9D9"/>
+            </w:tcBorders>
+            <w:tcMar>
+              <w:top w:w="85" w:type="dxa"/>
+              <w:left w:w="85" w:type="dxa"/>
+              <w:bottom w:w="85" w:type="dxa"/>
+              <w:right w:w="85" w:type="dxa"/>
+            </w:tcMar>
+          </w:tcPr>
+          <w:p>
+            <w:pPr>
+              <w:spacing w:after="0" w:before="0" w:line="240" w:lineRule="auto"/>
+            </w:pPr>
+            <w:r>
+              <w:rPr>
+                <w:b w:val="0"/>
+                <w:sz w:val="20"/>
+              </w:rPr>
+              <w:t>151/335 test records share training sources; 168/335 share training or validation</w:t>
+            </w:r>
+          </w:p>
+        </w:tc>
+      </w:tr>
+      <w:tr>
+        <w:trPr>
+          <w:cantSplit/>
+        </w:trPr>
+        <w:tc>
+          <w:tcPr>
+            <w:tcW w:type="dxa" w:w="3024"/>
+            <w:tcBorders>
+              <w:top w:val="single" w:sz="4" w:color="D9D9D9"/>
+              <w:left w:val="single" w:sz="4" w:color="D9D9D9"/>
+              <w:bottom w:val="single" w:sz="4" w:color="D9D9D9"/>
+              <w:right w:val="single" w:sz="4" w:color="D9D9D9"/>
+            </w:tcBorders>
+            <w:tcMar>
+              <w:top w:w="85" w:type="dxa"/>
+              <w:left w:w="85" w:type="dxa"/>
+              <w:bottom w:w="85" w:type="dxa"/>
+              <w:right w:w="85" w:type="dxa"/>
+            </w:tcMar>
+          </w:tcPr>
+          <w:p>
+            <w:pPr>
+              <w:spacing w:after="0" w:before="0" w:line="240" w:lineRule="auto"/>
+            </w:pPr>
+            <w:r>
+              <w:rPr>
+                <w:b w:val="0"/>
+                <w:sz w:val="20"/>
+              </w:rPr>
+              <w:t>Corrected source membership</w:t>
+            </w:r>
+          </w:p>
+        </w:tc>
+        <w:tc>
+          <w:tcPr>
+            <w:tcW w:type="dxa" w:w="1800"/>
+            <w:tcBorders>
+              <w:top w:val="single" w:sz="4" w:color="D9D9D9"/>
+              <w:left w:val="single" w:sz="4" w:color="D9D9D9"/>
+              <w:bottom w:val="single" w:sz="4" w:color="D9D9D9"/>
+              <w:right w:val="single" w:sz="4" w:color="D9D9D9"/>
+            </w:tcBorders>
+            <w:tcMar>
+              <w:top w:w="85" w:type="dxa"/>
+              <w:left w:w="85" w:type="dxa"/>
+              <w:bottom w:w="85" w:type="dxa"/>
+              <w:right w:w="85" w:type="dxa"/>
+            </w:tcMar>
+          </w:tcPr>
+          <w:p>
+            <w:pPr>
+              <w:spacing w:after="0" w:before="0" w:line="240" w:lineRule="auto"/>
+            </w:pPr>
+            <w:r>
+              <w:rPr>
+                <w:b w:val="0"/>
+                <w:sz w:val="20"/>
+              </w:rPr>
+              <w:t>PASS</w:t>
+            </w:r>
+          </w:p>
+        </w:tc>
+        <w:tc>
+          <w:tcPr>
+            <w:tcW w:type="dxa" w:w="4464"/>
+            <w:tcBorders>
+              <w:top w:val="single" w:sz="4" w:color="D9D9D9"/>
+              <w:left w:val="single" w:sz="4" w:color="D9D9D9"/>
+              <w:bottom w:val="single" w:sz="4" w:color="D9D9D9"/>
+              <w:right w:val="single" w:sz="4" w:color="D9D9D9"/>
+            </w:tcBorders>
+            <w:tcMar>
+              <w:top w:w="85" w:type="dxa"/>
+              <w:left w:w="85" w:type="dxa"/>
+              <w:bottom w:w="85" w:type="dxa"/>
+              <w:right w:w="85" w:type="dxa"/>
+            </w:tcMar>
+          </w:tcPr>
+          <w:p>
+            <w:pPr>
+              <w:spacing w:after="0" w:before="0" w:line="240" w:lineRule="auto"/>
+            </w:pPr>
+            <w:r>
+              <w:rPr>
+                <w:b w:val="0"/>
+                <w:sz w:val="20"/>
+              </w:rPr>
+              <w:t>Zero shared sources</w:t>
+            </w:r>
+          </w:p>
+        </w:tc>
+      </w:tr>
+      <w:tr>
+        <w:trPr>
+          <w:cantSplit/>
+        </w:trPr>
+        <w:tc>
+          <w:tcPr>
+            <w:tcW w:type="dxa" w:w="3024"/>
+            <w:tcBorders>
+              <w:top w:val="single" w:sz="4" w:color="D9D9D9"/>
+              <w:left w:val="single" w:sz="4" w:color="D9D9D9"/>
+              <w:bottom w:val="single" w:sz="4" w:color="D9D9D9"/>
+              <w:right w:val="single" w:sz="4" w:color="D9D9D9"/>
+            </w:tcBorders>
+            <w:tcMar>
+              <w:top w:w="85" w:type="dxa"/>
+              <w:left w:w="85" w:type="dxa"/>
+              <w:bottom w:w="85" w:type="dxa"/>
+              <w:right w:w="85" w:type="dxa"/>
+            </w:tcMar>
+          </w:tcPr>
+          <w:p>
+            <w:pPr>
+              <w:spacing w:after="0" w:before="0" w:line="240" w:lineRule="auto"/>
+            </w:pPr>
+            <w:r>
+              <w:rPr>
+                <w:b w:val="0"/>
+                <w:sz w:val="20"/>
+              </w:rPr>
+              <w:t>Current test versus historical roles</w:t>
+            </w:r>
+          </w:p>
+        </w:tc>
+        <w:tc>
+          <w:tcPr>
+            <w:tcW w:type="dxa" w:w="1800"/>
+            <w:tcBorders>
+              <w:top w:val="single" w:sz="4" w:color="D9D9D9"/>
+              <w:left w:val="single" w:sz="4" w:color="D9D9D9"/>
+              <w:bottom w:val="single" w:sz="4" w:color="D9D9D9"/>
+              <w:right w:val="single" w:sz="4" w:color="D9D9D9"/>
+            </w:tcBorders>
+            <w:tcMar>
+              <w:top w:w="85" w:type="dxa"/>
+              <w:left w:w="85" w:type="dxa"/>
+              <w:bottom w:w="85" w:type="dxa"/>
+              <w:right w:w="85" w:type="dxa"/>
+            </w:tcMar>
+          </w:tcPr>
+          <w:p>
+            <w:pPr>
+              <w:spacing w:after="0" w:before="0" w:line="240" w:lineRule="auto"/>
+            </w:pPr>
+            <w:r>
+              <w:rPr>
+                <w:b w:val="0"/>
+                <w:sz w:val="20"/>
+              </w:rPr>
+              <w:t>WARNING</w:t>
+            </w:r>
+          </w:p>
+        </w:tc>
+        <w:tc>
+          <w:tcPr>
+            <w:tcW w:type="dxa" w:w="4464"/>
+            <w:tcBorders>
+              <w:top w:val="single" w:sz="4" w:color="D9D9D9"/>
+              <w:left w:val="single" w:sz="4" w:color="D9D9D9"/>
+              <w:bottom w:val="single" w:sz="4" w:color="D9D9D9"/>
+              <w:right w:val="single" w:sz="4" w:color="D9D9D9"/>
+            </w:tcBorders>
+            <w:tcMar>
+              <w:top w:w="85" w:type="dxa"/>
+              <w:left w:w="85" w:type="dxa"/>
+              <w:bottom w:w="85" w:type="dxa"/>
+              <w:right w:w="85" w:type="dxa"/>
+            </w:tcMar>
+          </w:tcPr>
+          <w:p>
+            <w:pPr>
+              <w:spacing w:after="0" w:before="0" w:line="240" w:lineRule="auto"/>
+            </w:pPr>
+            <w:r>
+              <w:rPr>
+                <w:b w:val="0"/>
+                <w:sz w:val="20"/>
+              </w:rPr>
+              <w:t>196/221 sources and 304/330 records had development roles</w:t>
+            </w:r>
+          </w:p>
+        </w:tc>
+      </w:tr>
+      <w:tr>
+        <w:trPr>
+          <w:cantSplit/>
+        </w:trPr>
+        <w:tc>
+          <w:tcPr>
+            <w:tcW w:type="dxa" w:w="3024"/>
+            <w:tcBorders>
+              <w:top w:val="single" w:sz="4" w:color="D9D9D9"/>
+              <w:left w:val="single" w:sz="4" w:color="D9D9D9"/>
+              <w:bottom w:val="single" w:sz="4" w:color="D9D9D9"/>
+              <w:right w:val="single" w:sz="4" w:color="D9D9D9"/>
+            </w:tcBorders>
+            <w:tcMar>
+              <w:top w:w="85" w:type="dxa"/>
+              <w:left w:w="85" w:type="dxa"/>
+              <w:bottom w:w="85" w:type="dxa"/>
+              <w:right w:w="85" w:type="dxa"/>
+            </w:tcMar>
+          </w:tcPr>
+          <w:p>
+            <w:pPr>
+              <w:spacing w:after="0" w:before="0" w:line="240" w:lineRule="auto"/>
+            </w:pPr>
+            <w:r>
+              <w:rPr>
+                <w:b w:val="0"/>
+                <w:sz w:val="20"/>
+              </w:rPr>
+              <w:t>Six OOF membership tables</w:t>
+            </w:r>
+          </w:p>
+        </w:tc>
+        <w:tc>
+          <w:tcPr>
+            <w:tcW w:type="dxa" w:w="1800"/>
+            <w:tcBorders>
+              <w:top w:val="single" w:sz="4" w:color="D9D9D9"/>
+              <w:left w:val="single" w:sz="4" w:color="D9D9D9"/>
+              <w:bottom w:val="single" w:sz="4" w:color="D9D9D9"/>
+              <w:right w:val="single" w:sz="4" w:color="D9D9D9"/>
+            </w:tcBorders>
+            <w:tcMar>
+              <w:top w:w="85" w:type="dxa"/>
+              <w:left w:w="85" w:type="dxa"/>
+              <w:bottom w:w="85" w:type="dxa"/>
+              <w:right w:w="85" w:type="dxa"/>
+            </w:tcMar>
+          </w:tcPr>
+          <w:p>
+            <w:pPr>
+              <w:spacing w:after="0" w:before="0" w:line="240" w:lineRule="auto"/>
+            </w:pPr>
+            <w:r>
+              <w:rPr>
+                <w:b w:val="0"/>
+                <w:sz w:val="20"/>
+              </w:rPr>
+              <w:t>PASS</w:t>
+            </w:r>
+          </w:p>
+        </w:tc>
+        <w:tc>
+          <w:tcPr>
+            <w:tcW w:type="dxa" w:w="4464"/>
+            <w:tcBorders>
+              <w:top w:val="single" w:sz="4" w:color="D9D9D9"/>
+              <w:left w:val="single" w:sz="4" w:color="D9D9D9"/>
+              <w:bottom w:val="single" w:sz="4" w:color="D9D9D9"/>
+              <w:right w:val="single" w:sz="4" w:color="D9D9D9"/>
+            </w:tcBorders>
+            <w:tcMar>
+              <w:top w:w="85" w:type="dxa"/>
+              <w:left w:w="85" w:type="dxa"/>
+              <w:bottom w:w="85" w:type="dxa"/>
+              <w:right w:w="85" w:type="dxa"/>
+            </w:tcMar>
+          </w:tcPr>
+          <w:p>
+            <w:pPr>
+              <w:spacing w:after="0" w:before="0" w:line="240" w:lineRule="auto"/>
+            </w:pPr>
+            <w:r>
+              <w:rPr>
+                <w:b w:val="0"/>
+                <w:sz w:val="20"/>
+              </w:rPr>
+              <w:t>30 configuration–fold checks; five inner-fold tables shared across six configurations</w:t>
+            </w:r>
+          </w:p>
+        </w:tc>
+      </w:tr>
+      <w:tr>
+        <w:trPr>
+          <w:cantSplit/>
+        </w:trPr>
+        <w:tc>
+          <w:tcPr>
+            <w:tcW w:type="dxa" w:w="3024"/>
+            <w:tcBorders>
+              <w:top w:val="single" w:sz="4" w:color="D9D9D9"/>
+              <w:left w:val="single" w:sz="4" w:color="D9D9D9"/>
+              <w:bottom w:val="single" w:sz="4" w:color="D9D9D9"/>
+              <w:right w:val="single" w:sz="4" w:color="D9D9D9"/>
+            </w:tcBorders>
+            <w:tcMar>
+              <w:top w:w="85" w:type="dxa"/>
+              <w:left w:w="85" w:type="dxa"/>
+              <w:bottom w:w="85" w:type="dxa"/>
+              <w:right w:w="85" w:type="dxa"/>
+            </w:tcMar>
+          </w:tcPr>
+          <w:p>
+            <w:pPr>
+              <w:spacing w:after="0" w:before="0" w:line="240" w:lineRule="auto"/>
+            </w:pPr>
+            <w:r>
+              <w:rPr>
+                <w:b w:val="0"/>
+                <w:sz w:val="20"/>
+              </w:rPr>
+              <w:t>Lineage adapted from replay receipts</w:t>
+            </w:r>
+          </w:p>
+        </w:tc>
+        <w:tc>
+          <w:tcPr>
+            <w:tcW w:type="dxa" w:w="1800"/>
+            <w:tcBorders>
+              <w:top w:val="single" w:sz="4" w:color="D9D9D9"/>
+              <w:left w:val="single" w:sz="4" w:color="D9D9D9"/>
+              <w:bottom w:val="single" w:sz="4" w:color="D9D9D9"/>
+              <w:right w:val="single" w:sz="4" w:color="D9D9D9"/>
+            </w:tcBorders>
+            <w:tcMar>
+              <w:top w:w="85" w:type="dxa"/>
+              <w:left w:w="85" w:type="dxa"/>
+              <w:bottom w:w="85" w:type="dxa"/>
+              <w:right w:w="85" w:type="dxa"/>
+            </w:tcMar>
+          </w:tcPr>
+          <w:p>
+            <w:pPr>
+              <w:spacing w:after="0" w:before="0" w:line="240" w:lineRule="auto"/>
+            </w:pPr>
+            <w:r>
+              <w:rPr>
+                <w:b w:val="0"/>
+                <w:sz w:val="20"/>
+              </w:rPr>
+              <w:t>Consistent (reconstructed)</w:t>
+            </w:r>
+          </w:p>
+        </w:tc>
+        <w:tc>
+          <w:tcPr>
+            <w:tcW w:type="dxa" w:w="4464"/>
+            <w:tcBorders>
+              <w:top w:val="single" w:sz="4" w:color="D9D9D9"/>
+              <w:left w:val="single" w:sz="4" w:color="D9D9D9"/>
+              <w:bottom w:val="single" w:sz="4" w:color="D9D9D9"/>
+              <w:right w:val="single" w:sz="4" w:color="D9D9D9"/>
+            </w:tcBorders>
+            <w:tcMar>
+              <w:top w:w="85" w:type="dxa"/>
+              <w:left w:w="85" w:type="dxa"/>
+              <w:bottom w:w="85" w:type="dxa"/>
+              <w:right w:w="85" w:type="dxa"/>
+            </w:tcMar>
+          </w:tcPr>
+          <w:p>
+            <w:pPr>
+              <w:spacing w:after="0" w:before="0" w:line="240" w:lineRule="auto"/>
+            </w:pPr>
+            <w:r>
+              <w:rPr>
+                <w:b w:val="0"/>
+                <w:sz w:val="20"/>
+              </w:rPr>
+              <w:t>9,264 receipt-derived child keys agree with frozen source and fold memberships; no augmentation-time log available</w:t>
+            </w:r>
+          </w:p>
+        </w:tc>
+      </w:tr>
+      <w:tr>
+        <w:trPr>
+          <w:cantSplit/>
+        </w:trPr>
+        <w:tc>
+          <w:tcPr>
+            <w:tcW w:type="dxa" w:w="3024"/>
+            <w:tcBorders>
+              <w:top w:val="single" w:sz="4" w:color="D9D9D9"/>
+              <w:left w:val="single" w:sz="4" w:color="D9D9D9"/>
+              <w:bottom w:val="single" w:sz="4" w:color="D9D9D9"/>
+              <w:right w:val="single" w:sz="4" w:color="D9D9D9"/>
+            </w:tcBorders>
+            <w:tcMar>
+              <w:top w:w="85" w:type="dxa"/>
+              <w:left w:w="85" w:type="dxa"/>
+              <w:bottom w:w="85" w:type="dxa"/>
+              <w:right w:w="85" w:type="dxa"/>
+            </w:tcMar>
+          </w:tcPr>
+          <w:p>
+            <w:pPr>
+              <w:spacing w:after="0" w:before="0" w:line="240" w:lineRule="auto"/>
+            </w:pPr>
+            <w:r>
+              <w:rPr>
+                <w:b w:val="0"/>
+                <w:sz w:val="20"/>
+              </w:rPr>
+              <w:t>Checkpoint and public-code hashes</w:t>
+            </w:r>
+          </w:p>
+        </w:tc>
+        <w:tc>
+          <w:tcPr>
+            <w:tcW w:type="dxa" w:w="1800"/>
+            <w:tcBorders>
+              <w:top w:val="single" w:sz="4" w:color="D9D9D9"/>
+              <w:left w:val="single" w:sz="4" w:color="D9D9D9"/>
+              <w:bottom w:val="single" w:sz="4" w:color="D9D9D9"/>
+              <w:right w:val="single" w:sz="4" w:color="D9D9D9"/>
+            </w:tcBorders>
+            <w:tcMar>
+              <w:top w:w="85" w:type="dxa"/>
+              <w:left w:w="85" w:type="dxa"/>
+              <w:bottom w:w="85" w:type="dxa"/>
+              <w:right w:w="85" w:type="dxa"/>
+            </w:tcMar>
+          </w:tcPr>
+          <w:p>
+            <w:pPr>
+              <w:spacing w:after="0" w:before="0" w:line="240" w:lineRule="auto"/>
+            </w:pPr>
+            <w:r>
+              <w:rPr>
+                <w:b w:val="0"/>
+                <w:sz w:val="20"/>
+              </w:rPr>
+              <w:t>PASS</w:t>
+            </w:r>
+          </w:p>
+        </w:tc>
+        <w:tc>
+          <w:tcPr>
+            <w:tcW w:type="dxa" w:w="4464"/>
+            <w:tcBorders>
+              <w:top w:val="single" w:sz="4" w:color="D9D9D9"/>
+              <w:left w:val="single" w:sz="4" w:color="D9D9D9"/>
+              <w:bottom w:val="single" w:sz="4" w:color="D9D9D9"/>
+              <w:right w:val="single" w:sz="4" w:color="D9D9D9"/>
+            </w:tcBorders>
+            <w:tcMar>
+              <w:top w:w="85" w:type="dxa"/>
+              <w:left w:w="85" w:type="dxa"/>
+              <w:bottom w:w="85" w:type="dxa"/>
+              <w:right w:w="85" w:type="dxa"/>
+            </w:tcMar>
+          </w:tcPr>
+          <w:p>
+            <w:pPr>
+              <w:spacing w:after="0" w:before="0" w:line="240" w:lineRule="auto"/>
+            </w:pPr>
+            <w:r>
+              <w:rPr>
+                <w:b w:val="0"/>
+                <w:sz w:val="20"/>
+              </w:rPr>
+              <w:t>106 checkpoints and 93 code files</w:t>
+            </w:r>
+          </w:p>
+        </w:tc>
+      </w:tr>
+    </w:tbl>
+    <w:p>
+      <w:pPr>
+        <w:pStyle w:val="Caption"/>
+        <w:keepNext/>
+      </w:pPr>
+      <w:r>
+        <w:t>Table 3 ETHZ records by partition and audit outcome</w:t>
+      </w:r>
+    </w:p>
+    <w:tbl>
+      <w:tblPr>
+        <w:tblW w:type="auto" w:w="0"/>
+        <w:tblLayout w:type="fixed"/>
+        <w:tblLook w:firstColumn="1" w:firstRow="1" w:lastColumn="0" w:lastRow="0" w:noHBand="0" w:noVBand="1" w:val="04A0"/>
+      </w:tblPr>
+      <w:tblGrid>
+        <w:gridCol w:w="3168"/>
+        <w:gridCol w:w="1368"/>
+        <w:gridCol w:w="1368"/>
+        <w:gridCol w:w="1368"/>
+        <w:gridCol w:w="2016"/>
+      </w:tblGrid>
+      <w:tr>
+        <w:trPr>
+          <w:tblHeader/>
+          <w:cantSplit/>
+        </w:trPr>
+        <w:tc>
+          <w:tcPr>
+            <w:tcW w:type="dxa" w:w="3168"/>
+            <w:tcBorders>
+              <w:top w:val="single" w:sz="4" w:color="D9D9D9"/>
+              <w:left w:val="single" w:sz="4" w:color="D9D9D9"/>
+              <w:bottom w:val="single" w:sz="4" w:color="D9D9D9"/>
+              <w:right w:val="single" w:sz="4" w:color="D9D9D9"/>
+            </w:tcBorders>
+            <w:tcMar>
+              <w:top w:w="85" w:type="dxa"/>
+              <w:left w:w="85" w:type="dxa"/>
+              <w:bottom w:w="85" w:type="dxa"/>
+              <w:right w:w="85" w:type="dxa"/>
+            </w:tcMar>
+            <w:shd w:fill="E5EDF3"/>
+          </w:tcPr>
+          <w:p>
+            <w:pPr>
+              <w:keepNext/>
+              <w:spacing w:after="0" w:before="0" w:line="240" w:lineRule="auto"/>
+            </w:pPr>
+            <w:r>
+              <w:rPr>
+                <w:b/>
+                <w:sz w:val="20"/>
+              </w:rPr>
+              <w:t>Partition</w:t>
+            </w:r>
+          </w:p>
+        </w:tc>
+        <w:tc>
+          <w:tcPr>
+            <w:tcW w:type="dxa" w:w="1368"/>
+            <w:tcBorders>
+              <w:top w:val="single" w:sz="4" w:color="D9D9D9"/>
+              <w:left w:val="single" w:sz="4" w:color="D9D9D9"/>
+              <w:bottom w:val="single" w:sz="4" w:color="D9D9D9"/>
+              <w:right w:val="single" w:sz="4" w:color="D9D9D9"/>
+            </w:tcBorders>
+            <w:tcMar>
+              <w:top w:w="85" w:type="dxa"/>
+              <w:left w:w="85" w:type="dxa"/>
+              <w:bottom w:w="85" w:type="dxa"/>
+              <w:right w:w="85" w:type="dxa"/>
+            </w:tcMar>
+            <w:shd w:fill="E5EDF3"/>
+          </w:tcPr>
+          <w:p>
+            <w:pPr>
+              <w:keepNext/>
+              <w:spacing w:after="0" w:before="0" w:line="240" w:lineRule="auto"/>
+            </w:pPr>
+            <w:r>
+              <w:rPr>
+                <w:b/>
+                <w:sz w:val="20"/>
+              </w:rPr>
+              <w:t>Train</w:t>
+            </w:r>
+          </w:p>
+        </w:tc>
+        <w:tc>
+          <w:tcPr>
+            <w:tcW w:type="dxa" w:w="1368"/>
+            <w:tcBorders>
+              <w:top w:val="single" w:sz="4" w:color="D9D9D9"/>
+              <w:left w:val="single" w:sz="4" w:color="D9D9D9"/>
+              <w:bottom w:val="single" w:sz="4" w:color="D9D9D9"/>
+              <w:right w:val="single" w:sz="4" w:color="D9D9D9"/>
+            </w:tcBorders>
+            <w:tcMar>
+              <w:top w:w="85" w:type="dxa"/>
+              <w:left w:w="85" w:type="dxa"/>
+              <w:bottom w:w="85" w:type="dxa"/>
+              <w:right w:w="85" w:type="dxa"/>
+            </w:tcMar>
+            <w:shd w:fill="E5EDF3"/>
+          </w:tcPr>
+          <w:p>
+            <w:pPr>
+              <w:keepNext/>
+              <w:spacing w:after="0" w:before="0" w:line="240" w:lineRule="auto"/>
+            </w:pPr>
+            <w:r>
+              <w:rPr>
+                <w:b/>
+                <w:sz w:val="20"/>
+              </w:rPr>
+              <w:t>Dev</w:t>
+            </w:r>
+          </w:p>
+        </w:tc>
+        <w:tc>
+          <w:tcPr>
+            <w:tcW w:type="dxa" w:w="1368"/>
+            <w:tcBorders>
+              <w:top w:val="single" w:sz="4" w:color="D9D9D9"/>
+              <w:left w:val="single" w:sz="4" w:color="D9D9D9"/>
+              <w:bottom w:val="single" w:sz="4" w:color="D9D9D9"/>
+              <w:right w:val="single" w:sz="4" w:color="D9D9D9"/>
+            </w:tcBorders>
+            <w:tcMar>
+              <w:top w:w="85" w:type="dxa"/>
+              <w:left w:w="85" w:type="dxa"/>
+              <w:bottom w:w="85" w:type="dxa"/>
+              <w:right w:w="85" w:type="dxa"/>
+            </w:tcMar>
+            <w:shd w:fill="E5EDF3"/>
+          </w:tcPr>
+          <w:p>
+            <w:pPr>
+              <w:keepNext/>
+              <w:spacing w:after="0" w:before="0" w:line="240" w:lineRule="auto"/>
+            </w:pPr>
+            <w:r>
+              <w:rPr>
+                <w:b/>
+                <w:sz w:val="20"/>
+              </w:rPr>
+              <w:t>Test</w:t>
+            </w:r>
+          </w:p>
+        </w:tc>
+        <w:tc>
+          <w:tcPr>
+            <w:tcW w:type="dxa" w:w="2016"/>
+            <w:tcBorders>
+              <w:top w:val="single" w:sz="4" w:color="D9D9D9"/>
+              <w:left w:val="single" w:sz="4" w:color="D9D9D9"/>
+              <w:bottom w:val="single" w:sz="4" w:color="D9D9D9"/>
+              <w:right w:val="single" w:sz="4" w:color="D9D9D9"/>
+            </w:tcBorders>
+            <w:tcMar>
+              <w:top w:w="85" w:type="dxa"/>
+              <w:left w:w="85" w:type="dxa"/>
+              <w:bottom w:w="85" w:type="dxa"/>
+              <w:right w:w="85" w:type="dxa"/>
+            </w:tcMar>
+            <w:shd w:fill="E5EDF3"/>
+          </w:tcPr>
+          <w:p>
+            <w:pPr>
+              <w:keepNext/>
+              <w:spacing w:after="0" w:before="0" w:line="240" w:lineRule="auto"/>
+            </w:pPr>
+            <w:r>
+              <w:rPr>
+                <w:b/>
+                <w:sz w:val="20"/>
+              </w:rPr>
+              <w:t>Shared sources</w:t>
+            </w:r>
+          </w:p>
+        </w:tc>
+      </w:tr>
+      <w:tr>
+        <w:trPr>
+          <w:cantSplit/>
+        </w:trPr>
+        <w:tc>
+          <w:tcPr>
+            <w:tcW w:type="dxa" w:w="3168"/>
+            <w:tcBorders>
+              <w:top w:val="single" w:sz="4" w:color="D9D9D9"/>
+              <w:left w:val="single" w:sz="4" w:color="D9D9D9"/>
+              <w:bottom w:val="single" w:sz="4" w:color="D9D9D9"/>
+              <w:right w:val="single" w:sz="4" w:color="D9D9D9"/>
+            </w:tcBorders>
+            <w:tcMar>
+              <w:top w:w="85" w:type="dxa"/>
+              <w:left w:w="85" w:type="dxa"/>
+              <w:bottom w:w="85" w:type="dxa"/>
+              <w:right w:w="85" w:type="dxa"/>
+            </w:tcMar>
+          </w:tcPr>
+          <w:p>
+            <w:pPr>
+              <w:spacing w:after="0" w:before="0" w:line="240" w:lineRule="auto"/>
+            </w:pPr>
+            <w:r>
+              <w:rPr>
+                <w:b w:val="0"/>
+                <w:sz w:val="20"/>
+              </w:rPr>
+              <w:t>Supplied SeisBench</w:t>
+            </w:r>
+          </w:p>
+        </w:tc>
+        <w:tc>
+          <w:tcPr>
+            <w:tcW w:type="dxa" w:w="1368"/>
+            <w:tcBorders>
+              <w:top w:val="single" w:sz="4" w:color="D9D9D9"/>
+              <w:left w:val="single" w:sz="4" w:color="D9D9D9"/>
+              <w:bottom w:val="single" w:sz="4" w:color="D9D9D9"/>
+              <w:right w:val="single" w:sz="4" w:color="D9D9D9"/>
+            </w:tcBorders>
+            <w:tcMar>
+              <w:top w:w="85" w:type="dxa"/>
+              <w:left w:w="85" w:type="dxa"/>
+              <w:bottom w:w="85" w:type="dxa"/>
+              <w:right w:w="85" w:type="dxa"/>
+            </w:tcMar>
+          </w:tcPr>
+          <w:p>
+            <w:pPr>
+              <w:spacing w:after="0" w:before="0" w:line="240" w:lineRule="auto"/>
+            </w:pPr>
+            <w:r>
+              <w:rPr>
+                <w:b w:val="0"/>
+                <w:sz w:val="20"/>
+              </w:rPr>
+              <w:t>22626</w:t>
+            </w:r>
+          </w:p>
+        </w:tc>
+        <w:tc>
+          <w:tcPr>
+            <w:tcW w:type="dxa" w:w="1368"/>
+            <w:tcBorders>
+              <w:top w:val="single" w:sz="4" w:color="D9D9D9"/>
+              <w:left w:val="single" w:sz="4" w:color="D9D9D9"/>
+              <w:bottom w:val="single" w:sz="4" w:color="D9D9D9"/>
+              <w:right w:val="single" w:sz="4" w:color="D9D9D9"/>
+            </w:tcBorders>
+            <w:tcMar>
+              <w:top w:w="85" w:type="dxa"/>
+              <w:left w:w="85" w:type="dxa"/>
+              <w:bottom w:w="85" w:type="dxa"/>
+              <w:right w:w="85" w:type="dxa"/>
+            </w:tcMar>
+          </w:tcPr>
+          <w:p>
+            <w:pPr>
+              <w:spacing w:after="0" w:before="0" w:line="240" w:lineRule="auto"/>
+            </w:pPr>
+            <w:r>
+              <w:rPr>
+                <w:b w:val="0"/>
+                <w:sz w:val="20"/>
+              </w:rPr>
+              <w:t>3632</w:t>
+            </w:r>
+          </w:p>
+        </w:tc>
+        <w:tc>
+          <w:tcPr>
+            <w:tcW w:type="dxa" w:w="1368"/>
+            <w:tcBorders>
+              <w:top w:val="single" w:sz="4" w:color="D9D9D9"/>
+              <w:left w:val="single" w:sz="4" w:color="D9D9D9"/>
+              <w:bottom w:val="single" w:sz="4" w:color="D9D9D9"/>
+              <w:right w:val="single" w:sz="4" w:color="D9D9D9"/>
+            </w:tcBorders>
+            <w:tcMar>
+              <w:top w:w="85" w:type="dxa"/>
+              <w:left w:w="85" w:type="dxa"/>
+              <w:bottom w:w="85" w:type="dxa"/>
+              <w:right w:w="85" w:type="dxa"/>
+            </w:tcMar>
+          </w:tcPr>
+          <w:p>
+            <w:pPr>
+              <w:spacing w:after="0" w:before="0" w:line="240" w:lineRule="auto"/>
+            </w:pPr>
+            <w:r>
+              <w:rPr>
+                <w:b w:val="0"/>
+                <w:sz w:val="20"/>
+              </w:rPr>
+              <w:t>10485</w:t>
+            </w:r>
+          </w:p>
+        </w:tc>
+        <w:tc>
+          <w:tcPr>
+            <w:tcW w:type="dxa" w:w="2016"/>
+            <w:tcBorders>
+              <w:top w:val="single" w:sz="4" w:color="D9D9D9"/>
+              <w:left w:val="single" w:sz="4" w:color="D9D9D9"/>
+              <w:bottom w:val="single" w:sz="4" w:color="D9D9D9"/>
+              <w:right w:val="single" w:sz="4" w:color="D9D9D9"/>
+            </w:tcBorders>
+            <w:tcMar>
+              <w:top w:w="85" w:type="dxa"/>
+              <w:left w:w="85" w:type="dxa"/>
+              <w:bottom w:w="85" w:type="dxa"/>
+              <w:right w:w="85" w:type="dxa"/>
+            </w:tcMar>
+          </w:tcPr>
+          <w:p>
+            <w:pPr>
+              <w:spacing w:after="0" w:before="0" w:line="240" w:lineRule="auto"/>
+            </w:pPr>
+            <w:r>
+              <w:rPr>
+                <w:b w:val="0"/>
+                <w:sz w:val="20"/>
+              </w:rPr>
+              <w:t>0</w:t>
+            </w:r>
+          </w:p>
+        </w:tc>
+      </w:tr>
+      <w:tr>
+        <w:trPr>
+          <w:cantSplit/>
+        </w:trPr>
+        <w:tc>
+          <w:tcPr>
+            <w:tcW w:type="dxa" w:w="3168"/>
+            <w:tcBorders>
+              <w:top w:val="single" w:sz="4" w:color="D9D9D9"/>
+              <w:left w:val="single" w:sz="4" w:color="D9D9D9"/>
+              <w:bottom w:val="single" w:sz="4" w:color="D9D9D9"/>
+              <w:right w:val="single" w:sz="4" w:color="D9D9D9"/>
+            </w:tcBorders>
+            <w:tcMar>
+              <w:top w:w="85" w:type="dxa"/>
+              <w:left w:w="85" w:type="dxa"/>
+              <w:bottom w:w="85" w:type="dxa"/>
+              <w:right w:w="85" w:type="dxa"/>
+            </w:tcMar>
+          </w:tcPr>
+          <w:p>
+            <w:pPr>
+              <w:spacing w:after="0" w:before="0" w:line="240" w:lineRule="auto"/>
+            </w:pPr>
+            <w:r>
+              <w:rPr>
+                <w:b w:val="0"/>
+                <w:sz w:val="20"/>
+              </w:rPr>
+              <w:t>Constructed record-random</w:t>
+            </w:r>
+          </w:p>
+        </w:tc>
+        <w:tc>
+          <w:tcPr>
+            <w:tcW w:type="dxa" w:w="1368"/>
+            <w:tcBorders>
+              <w:top w:val="single" w:sz="4" w:color="D9D9D9"/>
+              <w:left w:val="single" w:sz="4" w:color="D9D9D9"/>
+              <w:bottom w:val="single" w:sz="4" w:color="D9D9D9"/>
+              <w:right w:val="single" w:sz="4" w:color="D9D9D9"/>
+            </w:tcBorders>
+            <w:tcMar>
+              <w:top w:w="85" w:type="dxa"/>
+              <w:left w:w="85" w:type="dxa"/>
+              <w:bottom w:w="85" w:type="dxa"/>
+              <w:right w:w="85" w:type="dxa"/>
+            </w:tcMar>
+          </w:tcPr>
+          <w:p>
+            <w:pPr>
+              <w:spacing w:after="0" w:before="0" w:line="240" w:lineRule="auto"/>
+            </w:pPr>
+            <w:r>
+              <w:rPr>
+                <w:b w:val="0"/>
+                <w:sz w:val="20"/>
+              </w:rPr>
+              <w:t>25720</w:t>
+            </w:r>
+          </w:p>
+        </w:tc>
+        <w:tc>
+          <w:tcPr>
+            <w:tcW w:type="dxa" w:w="1368"/>
+            <w:tcBorders>
+              <w:top w:val="single" w:sz="4" w:color="D9D9D9"/>
+              <w:left w:val="single" w:sz="4" w:color="D9D9D9"/>
+              <w:bottom w:val="single" w:sz="4" w:color="D9D9D9"/>
+              <w:right w:val="single" w:sz="4" w:color="D9D9D9"/>
+            </w:tcBorders>
+            <w:tcMar>
+              <w:top w:w="85" w:type="dxa"/>
+              <w:left w:w="85" w:type="dxa"/>
+              <w:bottom w:w="85" w:type="dxa"/>
+              <w:right w:w="85" w:type="dxa"/>
+            </w:tcMar>
+          </w:tcPr>
+          <w:p>
+            <w:pPr>
+              <w:spacing w:after="0" w:before="0" w:line="240" w:lineRule="auto"/>
+            </w:pPr>
+            <w:r>
+              <w:rPr>
+                <w:b w:val="0"/>
+                <w:sz w:val="20"/>
+              </w:rPr>
+              <w:t>5511</w:t>
+            </w:r>
+          </w:p>
+        </w:tc>
+        <w:tc>
+          <w:tcPr>
+            <w:tcW w:type="dxa" w:w="1368"/>
+            <w:tcBorders>
+              <w:top w:val="single" w:sz="4" w:color="D9D9D9"/>
+              <w:left w:val="single" w:sz="4" w:color="D9D9D9"/>
+              <w:bottom w:val="single" w:sz="4" w:color="D9D9D9"/>
+              <w:right w:val="single" w:sz="4" w:color="D9D9D9"/>
+            </w:tcBorders>
+            <w:tcMar>
+              <w:top w:w="85" w:type="dxa"/>
+              <w:left w:w="85" w:type="dxa"/>
+              <w:bottom w:w="85" w:type="dxa"/>
+              <w:right w:w="85" w:type="dxa"/>
+            </w:tcMar>
+          </w:tcPr>
+          <w:p>
+            <w:pPr>
+              <w:spacing w:after="0" w:before="0" w:line="240" w:lineRule="auto"/>
+            </w:pPr>
+            <w:r>
+              <w:rPr>
+                <w:b w:val="0"/>
+                <w:sz w:val="20"/>
+              </w:rPr>
+              <w:t>5512</w:t>
+            </w:r>
+          </w:p>
+        </w:tc>
+        <w:tc>
+          <w:tcPr>
+            <w:tcW w:type="dxa" w:w="2016"/>
+            <w:tcBorders>
+              <w:top w:val="single" w:sz="4" w:color="D9D9D9"/>
+              <w:left w:val="single" w:sz="4" w:color="D9D9D9"/>
+              <w:bottom w:val="single" w:sz="4" w:color="D9D9D9"/>
+              <w:right w:val="single" w:sz="4" w:color="D9D9D9"/>
+            </w:tcBorders>
+            <w:tcMar>
+              <w:top w:w="85" w:type="dxa"/>
+              <w:left w:w="85" w:type="dxa"/>
+              <w:bottom w:w="85" w:type="dxa"/>
+              <w:right w:w="85" w:type="dxa"/>
+            </w:tcMar>
+          </w:tcPr>
+          <w:p>
+            <w:pPr>
+              <w:spacing w:after="0" w:before="0" w:line="240" w:lineRule="auto"/>
+            </w:pPr>
+            <w:r>
+              <w:rPr>
+                <w:b w:val="0"/>
+                <w:sz w:val="20"/>
+              </w:rPr>
+              <w:t>2028</w:t>
+            </w:r>
+          </w:p>
+        </w:tc>
+      </w:tr>
+      <w:tr>
+        <w:trPr>
+          <w:cantSplit/>
+        </w:trPr>
+        <w:tc>
+          <w:tcPr>
+            <w:tcW w:type="dxa" w:w="3168"/>
+            <w:tcBorders>
+              <w:top w:val="single" w:sz="4" w:color="D9D9D9"/>
+              <w:left w:val="single" w:sz="4" w:color="D9D9D9"/>
+              <w:bottom w:val="single" w:sz="4" w:color="D9D9D9"/>
+              <w:right w:val="single" w:sz="4" w:color="D9D9D9"/>
+            </w:tcBorders>
+            <w:tcMar>
+              <w:top w:w="85" w:type="dxa"/>
+              <w:left w:w="85" w:type="dxa"/>
+              <w:bottom w:w="85" w:type="dxa"/>
+              <w:right w:w="85" w:type="dxa"/>
+            </w:tcMar>
+          </w:tcPr>
+          <w:p>
+            <w:pPr>
+              <w:spacing w:after="0" w:before="0" w:line="240" w:lineRule="auto"/>
+            </w:pPr>
+            <w:r>
+              <w:rPr>
+                <w:b w:val="0"/>
+                <w:sz w:val="20"/>
+              </w:rPr>
+              <w:t>Constructed source-grouped</w:t>
+            </w:r>
+          </w:p>
+        </w:tc>
+        <w:tc>
+          <w:tcPr>
+            <w:tcW w:type="dxa" w:w="1368"/>
+            <w:tcBorders>
+              <w:top w:val="single" w:sz="4" w:color="D9D9D9"/>
+              <w:left w:val="single" w:sz="4" w:color="D9D9D9"/>
+              <w:bottom w:val="single" w:sz="4" w:color="D9D9D9"/>
+              <w:right w:val="single" w:sz="4" w:color="D9D9D9"/>
+            </w:tcBorders>
+            <w:tcMar>
+              <w:top w:w="85" w:type="dxa"/>
+              <w:left w:w="85" w:type="dxa"/>
+              <w:bottom w:w="85" w:type="dxa"/>
+              <w:right w:w="85" w:type="dxa"/>
+            </w:tcMar>
+          </w:tcPr>
+          <w:p>
+            <w:pPr>
+              <w:spacing w:after="0" w:before="0" w:line="240" w:lineRule="auto"/>
+            </w:pPr>
+            <w:r>
+              <w:rPr>
+                <w:b w:val="0"/>
+                <w:sz w:val="20"/>
+              </w:rPr>
+              <w:t>25522</w:t>
+            </w:r>
+          </w:p>
+        </w:tc>
+        <w:tc>
+          <w:tcPr>
+            <w:tcW w:type="dxa" w:w="1368"/>
+            <w:tcBorders>
+              <w:top w:val="single" w:sz="4" w:color="D9D9D9"/>
+              <w:left w:val="single" w:sz="4" w:color="D9D9D9"/>
+              <w:bottom w:val="single" w:sz="4" w:color="D9D9D9"/>
+              <w:right w:val="single" w:sz="4" w:color="D9D9D9"/>
+            </w:tcBorders>
+            <w:tcMar>
+              <w:top w:w="85" w:type="dxa"/>
+              <w:left w:w="85" w:type="dxa"/>
+              <w:bottom w:w="85" w:type="dxa"/>
+              <w:right w:w="85" w:type="dxa"/>
+            </w:tcMar>
+          </w:tcPr>
+          <w:p>
+            <w:pPr>
+              <w:spacing w:after="0" w:before="0" w:line="240" w:lineRule="auto"/>
+            </w:pPr>
+            <w:r>
+              <w:rPr>
+                <w:b w:val="0"/>
+                <w:sz w:val="20"/>
+              </w:rPr>
+              <w:t>5850</w:t>
+            </w:r>
+          </w:p>
+        </w:tc>
+        <w:tc>
+          <w:tcPr>
+            <w:tcW w:type="dxa" w:w="1368"/>
+            <w:tcBorders>
+              <w:top w:val="single" w:sz="4" w:color="D9D9D9"/>
+              <w:left w:val="single" w:sz="4" w:color="D9D9D9"/>
+              <w:bottom w:val="single" w:sz="4" w:color="D9D9D9"/>
+              <w:right w:val="single" w:sz="4" w:color="D9D9D9"/>
+            </w:tcBorders>
+            <w:tcMar>
+              <w:top w:w="85" w:type="dxa"/>
+              <w:left w:w="85" w:type="dxa"/>
+              <w:bottom w:w="85" w:type="dxa"/>
+              <w:right w:w="85" w:type="dxa"/>
+            </w:tcMar>
+          </w:tcPr>
+          <w:p>
+            <w:pPr>
+              <w:spacing w:after="0" w:before="0" w:line="240" w:lineRule="auto"/>
+            </w:pPr>
+            <w:r>
+              <w:rPr>
+                <w:b w:val="0"/>
+                <w:sz w:val="20"/>
+              </w:rPr>
+              <w:t>5371</w:t>
+            </w:r>
+          </w:p>
+        </w:tc>
+        <w:tc>
+          <w:tcPr>
+            <w:tcW w:type="dxa" w:w="2016"/>
+            <w:tcBorders>
+              <w:top w:val="single" w:sz="4" w:color="D9D9D9"/>
+              <w:left w:val="single" w:sz="4" w:color="D9D9D9"/>
+              <w:bottom w:val="single" w:sz="4" w:color="D9D9D9"/>
+              <w:right w:val="single" w:sz="4" w:color="D9D9D9"/>
+            </w:tcBorders>
+            <w:tcMar>
+              <w:top w:w="85" w:type="dxa"/>
+              <w:left w:w="85" w:type="dxa"/>
+              <w:bottom w:w="85" w:type="dxa"/>
+              <w:right w:w="85" w:type="dxa"/>
+            </w:tcMar>
+          </w:tcPr>
+          <w:p>
+            <w:pPr>
+              <w:spacing w:after="0" w:before="0" w:line="240" w:lineRule="auto"/>
+            </w:pPr>
+            <w:r>
+              <w:rPr>
+                <w:b w:val="0"/>
+                <w:sz w:val="20"/>
+              </w:rPr>
+              <w:t>0</w:t>
+            </w:r>
+          </w:p>
+        </w:tc>
+      </w:tr>
+    </w:tbl>
+    <w:p>
+      <w:pPr>
+        <w:pStyle w:val="Heading1"/>
+        <w:keepNext/>
+      </w:pPr>
+      <w:r>
+        <w:t>Software Files</w:t>
+      </w:r>
+    </w:p>
+    <w:p>
+      <w:r>
+        <w:t>The v0.1.3 repository and DOI archive contain the Python package, wheel, 27 tests, examples, metadata scripts, reports, licence, citation metadata and CHECKSUMS.csv. Historical model checkpoints are available separately at DOI 10.5281/zenodo.22824997 and are unnecessary for the ETHZ metadata example.</w:t>
+      </w:r>
+    </w:p>
+    <w:p>
+      <w:r>
+        <w:t>Post-archive usage files—docs/WALKTHROUGH.md, docs/verify_walkthrough.py, case_studies/verification/wheel_usage_receipt.json and walkthrough_logs—are fixed at commit 502b5415bead677ec810207affed55a0e76a9f82. Code availability and Online Resource 1 identify their manifest.</w:t>
       </w:r>
     </w:p>
     <w:sectPr>

</xml_diff>

<commit_message>
Complete declarations and final manuscript presentation corrections
</commit_message>
<xml_diff>
--- a/manuscript/PathA_MainText.docx
+++ b/manuscript/PathA_MainText.docx
@@ -65,7 +65,7 @@
     </w:p>
     <w:p>
       <w:r>
-        <w:t>An earthquake can contribute recordings from several stations. Separating files therefore does not necessarily separate sources, and repairing a split does not erase earlier use. We present a Python tool for auditing source membership, processing relationships and artifact identity. Applied to recovered identities in a historical STEAD partition, the tool identifies 151 of 335 test records sharing sources with training. The corrected split has zero overlap, but 196 of its 221 test sources have documented prior training or validation roles. Thirty configuration–fold checks pass across six saved out-of-fold membership tables, and hashes match for 106 checkpoints and 93 public code files. A metadata demonstration uses 36,743 ETHZ records from 2,231 sources. The supplied SeisBench partition is source-disjoint, whereas a deliberately constructed record-random control has 2,028 sources spanning subsets. The supplied partition also shares 180 network–station keys between training and testing, distinguishing source exclusion from station exclusion. Twenty-seven automated tests cover valid inputs, injected failures and incomplete identifiers. These checks demonstrate reusable auditing without model training; they do not verify physical event associations or estimate how leakage changes accuracy. Historical development exposure prevents an independent-confirmation claim. The practical output is an executable checklist with explicit evidence boundaries.</w:t>
+        <w:t>An earthquake can contribute recordings from several stations. Separating files therefore does not necessarily separate sources, and repairing a split does not erase earlier use. We present a Python tool for auditing source membership, processing relationships and artifact identity. Applied to recovered identities in a historical STEAD partition, the tool identifies 151 of 335 test records sharing sources with training. The corrected split has zero overlap, but 196 of its 221 test sources have documented prior training or validation roles. Thirty configuration–fold checks pass across six saved out-of-fold membership tables, and hashes match for 106 checkpoints and 93 public code files. A metadata demonstration uses 36,743 ETHZ records from 2,231 sources. The supplied SeisBench partition is source-disjoint, whereas a deliberately constructed record-random control has 2,028 sources spanning subsets. The supplied partition also shares 180 network–station keys between training and testing, distinguishing source exclusion from station exclusion. Twenty-seven automated tests cover valid inputs, injected failures and incomplete identifiers. These checks demonstrate reusable auditing without model training; they do not verify physical event associations or estimate how leakage changes accuracy. Because most corrected test sources were used earlier in development, the corrected split cannot serve as independent confirmation. The practical output is an executable checklist with explicit evidence boundaries.</w:t>
       </w:r>
     </w:p>
     <w:p>
@@ -386,7 +386,7 @@
         <w:pStyle w:val="Heading1"/>
       </w:pPr>
       <w:r>
-        <w:t>4.2 The ETHZ supplied partition passes the membership check</w:t>
+        <w:t>4.2 Source and station membership give different answers for the ETHZ split</w:t>
       </w:r>
     </w:p>
     <w:p>
@@ -396,7 +396,7 @@
     </w:p>
     <w:p>
       <w:r>
-        <w:t>All rows contain 36,743 records and 2,231 distinct source identifiers. Shared sources means sources occurring in more than one subset, counted once. The two constructed rows use seed 42. The metadata demonstration verifies that the same membership interface handles another dataset table without using the STEAD-specific model implementation. It does not demonstrate an end-to-end model audit on ETHZ.</w:t>
+        <w:t>The metadata demonstration verifies that the same membership interface handles another dataset table without using the STEAD-specific model implementation. It does not demonstrate an end-to-end model audit on ETHZ.</w:t>
       </w:r>
     </w:p>
     <w:p>
@@ -448,7 +448,7 @@
     </w:p>
     <w:p>
       <w:r>
-        <w:t>The STEAD forensic analysis depends on the tested local archive and exact waveform representation. It does not recover unavailable original filtering decisions or prove global uniqueness across every distribution. The ETHZ example verifies metadata portability only. It neither validates the underlying event catalogue nor tests new waveform reconstruction, augmentation or model replay on that dataset. The negative controls illustrate specific errors and are not an exhaustive security or leakage test suite. We do not infer how much source overlap changes predictive accuracy, because that would require a separately designed modeling experiment. The feature-schema API remains tested on controlled examples; no new real-tensor schema audit is claimed. Manifest consistency does not by itself prove execution followed those manifests. The earlier replay receipts provide additional historical execution evidence, and their limitations remain distinct from the new metadata and byte checks.</w:t>
+        <w:t>The STEAD forensic analysis depends on the tested local archive and exact waveform representation. It does not recover unavailable original filtering decisions or prove global uniqueness across every distribution. The ETHZ example verifies metadata portability only. It neither validates the underlying event catalogue nor tests new waveform reconstruction, augmentation or model replay on that dataset. The negative controls illustrate specific errors and are not an exhaustive security or leakage test suite. We do not infer how much source overlap changes predictive accuracy, because that would require a separately designed modeling experiment. The feature-schema API remains tested on controlled examples; no new real-tensor schema audit is claimed. Manifest consistency does not by itself prove execution followed those manifests. The earlier replay receipts provide additional historical execution evidence, and their limitations remain distinct from the metadata and byte checks in this study.</w:t>
       </w:r>
     </w:p>
     <w:p>
@@ -492,7 +492,7 @@
     <w:p>
       <w:pPr/>
       <w:r>
-        <w:t>Install the supplied wheel in a Python environment:</w:t>
+        <w:t>From the repository root, install the supplied wheel in a Python environment:</w:t>
       </w:r>
     </w:p>
     <w:p>
@@ -567,6 +567,42 @@
     <w:p>
       <w:pPr>
         <w:pStyle w:val="Heading1"/>
+        <w:keepNext/>
+      </w:pPr>
+      <w:r>
+        <w:rPr>
+          <w:b/>
+        </w:rPr>
+        <w:t>Ethics approval and consent to participate</w:t>
+      </w:r>
+    </w:p>
+    <w:p>
+      <w:pPr/>
+      <w:r>
+        <w:t>Not applicable. This study uses publicly distributed seismic metadata and waveform-derived identifiers; no human participants or animals were involved.</w:t>
+      </w:r>
+    </w:p>
+    <w:p>
+      <w:pPr>
+        <w:pStyle w:val="Heading1"/>
+        <w:keepNext/>
+      </w:pPr>
+      <w:r>
+        <w:rPr>
+          <w:b/>
+        </w:rPr>
+        <w:t>Consent for publication</w:t>
+      </w:r>
+    </w:p>
+    <w:p>
+      <w:pPr/>
+      <w:r>
+        <w:t>Not applicable.</w:t>
+      </w:r>
+    </w:p>
+    <w:p>
+      <w:pPr>
+        <w:pStyle w:val="Heading1"/>
       </w:pPr>
       <w:r>
         <w:t>Code availability</w:t>
@@ -580,7 +616,7 @@
     <w:p>
       <w:pPr/>
       <w:r>
-        <w:t>The post-archive walkthrough, usage driver and verification receipt are fixed at commit 502b5415bead677ec810207affed55a0e76a9f82 (https://github.com/rcw3712/seismic-eval-audit/tree/502b5415bead677ec810207affed55a0e76a9f82). Its CHECKSUMS.csv records their hashes; Online Resource 1, Section 6 supplies the exact manifest URL and SHA-256. These files are outside the v0.1.3 Zenodo snapshot. The present manuscript is a later editorial revision and is not identified by that earlier documentation commit.</w:t>
+        <w:t>The post-archive walkthrough, usage driver and verification receipt are fixed at commit 502b5415bead677ec810207affed55a0e76a9f82 (https://github.com/rcw3712/seismic-eval-audit/tree/502b5415bead677ec810207affed55a0e76a9f82). Its CHECKSUMS.csv records their hashes; Online Resource 1, Section 6 supplies the exact manifest URL and SHA-256. These files are outside the v0.1.3 Zenodo snapshot.</w:t>
       </w:r>
     </w:p>
     <w:p>
@@ -789,9 +825,9 @@
               <w:right w:val="single" w:sz="4" w:color="D9D9D9"/>
             </w:tcBorders>
             <w:tcMar>
-              <w:top w:w="85" w:type="dxa"/>
+              <w:top w:w="40" w:type="dxa"/>
               <w:left w:w="85" w:type="dxa"/>
-              <w:bottom w:w="85" w:type="dxa"/>
+              <w:bottom w:w="40" w:type="dxa"/>
               <w:right w:w="85" w:type="dxa"/>
             </w:tcMar>
             <w:shd w:fill="E5EDF3"/>
@@ -820,9 +856,9 @@
               <w:right w:val="single" w:sz="4" w:color="D9D9D9"/>
             </w:tcBorders>
             <w:tcMar>
-              <w:top w:w="85" w:type="dxa"/>
+              <w:top w:w="40" w:type="dxa"/>
               <w:left w:w="85" w:type="dxa"/>
-              <w:bottom w:w="85" w:type="dxa"/>
+              <w:bottom w:w="40" w:type="dxa"/>
               <w:right w:w="85" w:type="dxa"/>
             </w:tcMar>
             <w:shd w:fill="E5EDF3"/>
@@ -851,9 +887,9 @@
               <w:right w:val="single" w:sz="4" w:color="D9D9D9"/>
             </w:tcBorders>
             <w:tcMar>
-              <w:top w:w="85" w:type="dxa"/>
+              <w:top w:w="40" w:type="dxa"/>
               <w:left w:w="85" w:type="dxa"/>
-              <w:bottom w:w="85" w:type="dxa"/>
+              <w:bottom w:w="40" w:type="dxa"/>
               <w:right w:w="85" w:type="dxa"/>
             </w:tcMar>
             <w:shd w:fill="E5EDF3"/>
@@ -887,9 +923,9 @@
               <w:right w:val="single" w:sz="4" w:color="D9D9D9"/>
             </w:tcBorders>
             <w:tcMar>
-              <w:top w:w="85" w:type="dxa"/>
+              <w:top w:w="40" w:type="dxa"/>
               <w:left w:w="85" w:type="dxa"/>
-              <w:bottom w:w="85" w:type="dxa"/>
+              <w:bottom w:w="40" w:type="dxa"/>
               <w:right w:w="85" w:type="dxa"/>
             </w:tcMar>
           </w:tcPr>
@@ -916,9 +952,9 @@
               <w:right w:val="single" w:sz="4" w:color="D9D9D9"/>
             </w:tcBorders>
             <w:tcMar>
-              <w:top w:w="85" w:type="dxa"/>
+              <w:top w:w="40" w:type="dxa"/>
               <w:left w:w="85" w:type="dxa"/>
-              <w:bottom w:w="85" w:type="dxa"/>
+              <w:bottom w:w="40" w:type="dxa"/>
               <w:right w:w="85" w:type="dxa"/>
             </w:tcMar>
           </w:tcPr>
@@ -945,9 +981,9 @@
               <w:right w:val="single" w:sz="4" w:color="D9D9D9"/>
             </w:tcBorders>
             <w:tcMar>
-              <w:top w:w="85" w:type="dxa"/>
+              <w:top w:w="40" w:type="dxa"/>
               <w:left w:w="85" w:type="dxa"/>
-              <w:bottom w:w="85" w:type="dxa"/>
+              <w:bottom w:w="40" w:type="dxa"/>
               <w:right w:w="85" w:type="dxa"/>
             </w:tcMar>
           </w:tcPr>
@@ -979,9 +1015,9 @@
               <w:right w:val="single" w:sz="4" w:color="D9D9D9"/>
             </w:tcBorders>
             <w:tcMar>
-              <w:top w:w="85" w:type="dxa"/>
+              <w:top w:w="40" w:type="dxa"/>
               <w:left w:w="85" w:type="dxa"/>
-              <w:bottom w:w="85" w:type="dxa"/>
+              <w:bottom w:w="40" w:type="dxa"/>
               <w:right w:w="85" w:type="dxa"/>
             </w:tcMar>
           </w:tcPr>
@@ -1008,9 +1044,9 @@
               <w:right w:val="single" w:sz="4" w:color="D9D9D9"/>
             </w:tcBorders>
             <w:tcMar>
-              <w:top w:w="85" w:type="dxa"/>
+              <w:top w:w="40" w:type="dxa"/>
               <w:left w:w="85" w:type="dxa"/>
-              <w:bottom w:w="85" w:type="dxa"/>
+              <w:bottom w:w="40" w:type="dxa"/>
               <w:right w:w="85" w:type="dxa"/>
             </w:tcMar>
           </w:tcPr>
@@ -1037,9 +1073,9 @@
               <w:right w:val="single" w:sz="4" w:color="D9D9D9"/>
             </w:tcBorders>
             <w:tcMar>
-              <w:top w:w="85" w:type="dxa"/>
+              <w:top w:w="40" w:type="dxa"/>
               <w:left w:w="85" w:type="dxa"/>
-              <w:bottom w:w="85" w:type="dxa"/>
+              <w:bottom w:w="40" w:type="dxa"/>
               <w:right w:w="85" w:type="dxa"/>
             </w:tcMar>
           </w:tcPr>
@@ -1071,9 +1107,9 @@
               <w:right w:val="single" w:sz="4" w:color="D9D9D9"/>
             </w:tcBorders>
             <w:tcMar>
-              <w:top w:w="85" w:type="dxa"/>
+              <w:top w:w="40" w:type="dxa"/>
               <w:left w:w="85" w:type="dxa"/>
-              <w:bottom w:w="85" w:type="dxa"/>
+              <w:bottom w:w="40" w:type="dxa"/>
               <w:right w:w="85" w:type="dxa"/>
             </w:tcMar>
           </w:tcPr>
@@ -1100,9 +1136,9 @@
               <w:right w:val="single" w:sz="4" w:color="D9D9D9"/>
             </w:tcBorders>
             <w:tcMar>
-              <w:top w:w="85" w:type="dxa"/>
+              <w:top w:w="40" w:type="dxa"/>
               <w:left w:w="85" w:type="dxa"/>
-              <w:bottom w:w="85" w:type="dxa"/>
+              <w:bottom w:w="40" w:type="dxa"/>
               <w:right w:w="85" w:type="dxa"/>
             </w:tcMar>
           </w:tcPr>
@@ -1129,9 +1165,9 @@
               <w:right w:val="single" w:sz="4" w:color="D9D9D9"/>
             </w:tcBorders>
             <w:tcMar>
-              <w:top w:w="85" w:type="dxa"/>
+              <w:top w:w="40" w:type="dxa"/>
               <w:left w:w="85" w:type="dxa"/>
-              <w:bottom w:w="85" w:type="dxa"/>
+              <w:bottom w:w="40" w:type="dxa"/>
               <w:right w:w="85" w:type="dxa"/>
             </w:tcMar>
           </w:tcPr>
@@ -1163,9 +1199,9 @@
               <w:right w:val="single" w:sz="4" w:color="D9D9D9"/>
             </w:tcBorders>
             <w:tcMar>
-              <w:top w:w="85" w:type="dxa"/>
+              <w:top w:w="40" w:type="dxa"/>
               <w:left w:w="85" w:type="dxa"/>
-              <w:bottom w:w="85" w:type="dxa"/>
+              <w:bottom w:w="40" w:type="dxa"/>
               <w:right w:w="85" w:type="dxa"/>
             </w:tcMar>
           </w:tcPr>
@@ -1192,9 +1228,9 @@
               <w:right w:val="single" w:sz="4" w:color="D9D9D9"/>
             </w:tcBorders>
             <w:tcMar>
-              <w:top w:w="85" w:type="dxa"/>
+              <w:top w:w="40" w:type="dxa"/>
               <w:left w:w="85" w:type="dxa"/>
-              <w:bottom w:w="85" w:type="dxa"/>
+              <w:bottom w:w="40" w:type="dxa"/>
               <w:right w:w="85" w:type="dxa"/>
             </w:tcMar>
           </w:tcPr>
@@ -1221,9 +1257,9 @@
               <w:right w:val="single" w:sz="4" w:color="D9D9D9"/>
             </w:tcBorders>
             <w:tcMar>
-              <w:top w:w="85" w:type="dxa"/>
+              <w:top w:w="40" w:type="dxa"/>
               <w:left w:w="85" w:type="dxa"/>
-              <w:bottom w:w="85" w:type="dxa"/>
+              <w:bottom w:w="40" w:type="dxa"/>
               <w:right w:w="85" w:type="dxa"/>
             </w:tcMar>
           </w:tcPr>
@@ -1255,9 +1291,9 @@
               <w:right w:val="single" w:sz="4" w:color="D9D9D9"/>
             </w:tcBorders>
             <w:tcMar>
-              <w:top w:w="85" w:type="dxa"/>
+              <w:top w:w="40" w:type="dxa"/>
               <w:left w:w="85" w:type="dxa"/>
-              <w:bottom w:w="85" w:type="dxa"/>
+              <w:bottom w:w="40" w:type="dxa"/>
               <w:right w:w="85" w:type="dxa"/>
             </w:tcMar>
           </w:tcPr>
@@ -1284,9 +1320,9 @@
               <w:right w:val="single" w:sz="4" w:color="D9D9D9"/>
             </w:tcBorders>
             <w:tcMar>
-              <w:top w:w="85" w:type="dxa"/>
+              <w:top w:w="40" w:type="dxa"/>
               <w:left w:w="85" w:type="dxa"/>
-              <w:bottom w:w="85" w:type="dxa"/>
+              <w:bottom w:w="40" w:type="dxa"/>
               <w:right w:w="85" w:type="dxa"/>
             </w:tcMar>
           </w:tcPr>
@@ -1313,9 +1349,9 @@
               <w:right w:val="single" w:sz="4" w:color="D9D9D9"/>
             </w:tcBorders>
             <w:tcMar>
-              <w:top w:w="85" w:type="dxa"/>
+              <w:top w:w="40" w:type="dxa"/>
               <w:left w:w="85" w:type="dxa"/>
-              <w:bottom w:w="85" w:type="dxa"/>
+              <w:bottom w:w="40" w:type="dxa"/>
               <w:right w:w="85" w:type="dxa"/>
             </w:tcMar>
           </w:tcPr>
@@ -1347,9 +1383,9 @@
               <w:right w:val="single" w:sz="4" w:color="D9D9D9"/>
             </w:tcBorders>
             <w:tcMar>
-              <w:top w:w="85" w:type="dxa"/>
+              <w:top w:w="40" w:type="dxa"/>
               <w:left w:w="85" w:type="dxa"/>
-              <w:bottom w:w="85" w:type="dxa"/>
+              <w:bottom w:w="40" w:type="dxa"/>
               <w:right w:w="85" w:type="dxa"/>
             </w:tcMar>
           </w:tcPr>
@@ -1376,9 +1412,9 @@
               <w:right w:val="single" w:sz="4" w:color="D9D9D9"/>
             </w:tcBorders>
             <w:tcMar>
-              <w:top w:w="85" w:type="dxa"/>
+              <w:top w:w="40" w:type="dxa"/>
               <w:left w:w="85" w:type="dxa"/>
-              <w:bottom w:w="85" w:type="dxa"/>
+              <w:bottom w:w="40" w:type="dxa"/>
               <w:right w:w="85" w:type="dxa"/>
             </w:tcMar>
           </w:tcPr>
@@ -1405,9 +1441,9 @@
               <w:right w:val="single" w:sz="4" w:color="D9D9D9"/>
             </w:tcBorders>
             <w:tcMar>
-              <w:top w:w="85" w:type="dxa"/>
+              <w:top w:w="40" w:type="dxa"/>
               <w:left w:w="85" w:type="dxa"/>
-              <w:bottom w:w="85" w:type="dxa"/>
+              <w:bottom w:w="40" w:type="dxa"/>
               <w:right w:w="85" w:type="dxa"/>
             </w:tcMar>
           </w:tcPr>
@@ -1461,9 +1497,9 @@
               <w:right w:val="single" w:sz="4" w:color="D9D9D9"/>
             </w:tcBorders>
             <w:tcMar>
-              <w:top w:w="85" w:type="dxa"/>
+              <w:top w:w="40" w:type="dxa"/>
               <w:left w:w="85" w:type="dxa"/>
-              <w:bottom w:w="85" w:type="dxa"/>
+              <w:bottom w:w="40" w:type="dxa"/>
               <w:right w:w="85" w:type="dxa"/>
             </w:tcMar>
             <w:shd w:fill="E5EDF3"/>
@@ -1492,9 +1528,9 @@
               <w:right w:val="single" w:sz="4" w:color="D9D9D9"/>
             </w:tcBorders>
             <w:tcMar>
-              <w:top w:w="85" w:type="dxa"/>
+              <w:top w:w="40" w:type="dxa"/>
               <w:left w:w="85" w:type="dxa"/>
-              <w:bottom w:w="85" w:type="dxa"/>
+              <w:bottom w:w="40" w:type="dxa"/>
               <w:right w:w="85" w:type="dxa"/>
             </w:tcMar>
             <w:shd w:fill="E5EDF3"/>
@@ -1523,9 +1559,9 @@
               <w:right w:val="single" w:sz="4" w:color="D9D9D9"/>
             </w:tcBorders>
             <w:tcMar>
-              <w:top w:w="85" w:type="dxa"/>
+              <w:top w:w="40" w:type="dxa"/>
               <w:left w:w="85" w:type="dxa"/>
-              <w:bottom w:w="85" w:type="dxa"/>
+              <w:bottom w:w="40" w:type="dxa"/>
               <w:right w:w="85" w:type="dxa"/>
             </w:tcMar>
             <w:shd w:fill="E5EDF3"/>
@@ -1559,9 +1595,9 @@
               <w:right w:val="single" w:sz="4" w:color="D9D9D9"/>
             </w:tcBorders>
             <w:tcMar>
-              <w:top w:w="85" w:type="dxa"/>
+              <w:top w:w="40" w:type="dxa"/>
               <w:left w:w="85" w:type="dxa"/>
-              <w:bottom w:w="85" w:type="dxa"/>
+              <w:bottom w:w="40" w:type="dxa"/>
               <w:right w:w="85" w:type="dxa"/>
             </w:tcMar>
           </w:tcPr>
@@ -1588,9 +1624,9 @@
               <w:right w:val="single" w:sz="4" w:color="D9D9D9"/>
             </w:tcBorders>
             <w:tcMar>
-              <w:top w:w="85" w:type="dxa"/>
+              <w:top w:w="40" w:type="dxa"/>
               <w:left w:w="85" w:type="dxa"/>
-              <w:bottom w:w="85" w:type="dxa"/>
+              <w:bottom w:w="40" w:type="dxa"/>
               <w:right w:w="85" w:type="dxa"/>
             </w:tcMar>
           </w:tcPr>
@@ -1617,9 +1653,9 @@
               <w:right w:val="single" w:sz="4" w:color="D9D9D9"/>
             </w:tcBorders>
             <w:tcMar>
-              <w:top w:w="85" w:type="dxa"/>
+              <w:top w:w="40" w:type="dxa"/>
               <w:left w:w="85" w:type="dxa"/>
-              <w:bottom w:w="85" w:type="dxa"/>
+              <w:bottom w:w="40" w:type="dxa"/>
               <w:right w:w="85" w:type="dxa"/>
             </w:tcMar>
           </w:tcPr>
@@ -1651,9 +1687,9 @@
               <w:right w:val="single" w:sz="4" w:color="D9D9D9"/>
             </w:tcBorders>
             <w:tcMar>
-              <w:top w:w="85" w:type="dxa"/>
+              <w:top w:w="40" w:type="dxa"/>
               <w:left w:w="85" w:type="dxa"/>
-              <w:bottom w:w="85" w:type="dxa"/>
+              <w:bottom w:w="40" w:type="dxa"/>
               <w:right w:w="85" w:type="dxa"/>
             </w:tcMar>
           </w:tcPr>
@@ -1680,9 +1716,9 @@
               <w:right w:val="single" w:sz="4" w:color="D9D9D9"/>
             </w:tcBorders>
             <w:tcMar>
-              <w:top w:w="85" w:type="dxa"/>
+              <w:top w:w="40" w:type="dxa"/>
               <w:left w:w="85" w:type="dxa"/>
-              <w:bottom w:w="85" w:type="dxa"/>
+              <w:bottom w:w="40" w:type="dxa"/>
               <w:right w:w="85" w:type="dxa"/>
             </w:tcMar>
           </w:tcPr>
@@ -1709,9 +1745,9 @@
               <w:right w:val="single" w:sz="4" w:color="D9D9D9"/>
             </w:tcBorders>
             <w:tcMar>
-              <w:top w:w="85" w:type="dxa"/>
+              <w:top w:w="40" w:type="dxa"/>
               <w:left w:w="85" w:type="dxa"/>
-              <w:bottom w:w="85" w:type="dxa"/>
+              <w:bottom w:w="40" w:type="dxa"/>
               <w:right w:w="85" w:type="dxa"/>
             </w:tcMar>
           </w:tcPr>
@@ -1743,9 +1779,9 @@
               <w:right w:val="single" w:sz="4" w:color="D9D9D9"/>
             </w:tcBorders>
             <w:tcMar>
-              <w:top w:w="85" w:type="dxa"/>
+              <w:top w:w="40" w:type="dxa"/>
               <w:left w:w="85" w:type="dxa"/>
-              <w:bottom w:w="85" w:type="dxa"/>
+              <w:bottom w:w="40" w:type="dxa"/>
               <w:right w:w="85" w:type="dxa"/>
             </w:tcMar>
           </w:tcPr>
@@ -1772,9 +1808,9 @@
               <w:right w:val="single" w:sz="4" w:color="D9D9D9"/>
             </w:tcBorders>
             <w:tcMar>
-              <w:top w:w="85" w:type="dxa"/>
+              <w:top w:w="40" w:type="dxa"/>
               <w:left w:w="85" w:type="dxa"/>
-              <w:bottom w:w="85" w:type="dxa"/>
+              <w:bottom w:w="40" w:type="dxa"/>
               <w:right w:w="85" w:type="dxa"/>
             </w:tcMar>
           </w:tcPr>
@@ -1801,9 +1837,9 @@
               <w:right w:val="single" w:sz="4" w:color="D9D9D9"/>
             </w:tcBorders>
             <w:tcMar>
-              <w:top w:w="85" w:type="dxa"/>
+              <w:top w:w="40" w:type="dxa"/>
               <w:left w:w="85" w:type="dxa"/>
-              <w:bottom w:w="85" w:type="dxa"/>
+              <w:bottom w:w="40" w:type="dxa"/>
               <w:right w:w="85" w:type="dxa"/>
             </w:tcMar>
           </w:tcPr>
@@ -1835,9 +1871,9 @@
               <w:right w:val="single" w:sz="4" w:color="D9D9D9"/>
             </w:tcBorders>
             <w:tcMar>
-              <w:top w:w="85" w:type="dxa"/>
+              <w:top w:w="40" w:type="dxa"/>
               <w:left w:w="85" w:type="dxa"/>
-              <w:bottom w:w="85" w:type="dxa"/>
+              <w:bottom w:w="40" w:type="dxa"/>
               <w:right w:w="85" w:type="dxa"/>
             </w:tcMar>
           </w:tcPr>
@@ -1864,9 +1900,9 @@
               <w:right w:val="single" w:sz="4" w:color="D9D9D9"/>
             </w:tcBorders>
             <w:tcMar>
-              <w:top w:w="85" w:type="dxa"/>
+              <w:top w:w="40" w:type="dxa"/>
               <w:left w:w="85" w:type="dxa"/>
-              <w:bottom w:w="85" w:type="dxa"/>
+              <w:bottom w:w="40" w:type="dxa"/>
               <w:right w:w="85" w:type="dxa"/>
             </w:tcMar>
           </w:tcPr>
@@ -1893,9 +1929,9 @@
               <w:right w:val="single" w:sz="4" w:color="D9D9D9"/>
             </w:tcBorders>
             <w:tcMar>
-              <w:top w:w="85" w:type="dxa"/>
+              <w:top w:w="40" w:type="dxa"/>
               <w:left w:w="85" w:type="dxa"/>
-              <w:bottom w:w="85" w:type="dxa"/>
+              <w:bottom w:w="40" w:type="dxa"/>
               <w:right w:w="85" w:type="dxa"/>
             </w:tcMar>
           </w:tcPr>
@@ -1927,9 +1963,9 @@
               <w:right w:val="single" w:sz="4" w:color="D9D9D9"/>
             </w:tcBorders>
             <w:tcMar>
-              <w:top w:w="85" w:type="dxa"/>
+              <w:top w:w="40" w:type="dxa"/>
               <w:left w:w="85" w:type="dxa"/>
-              <w:bottom w:w="85" w:type="dxa"/>
+              <w:bottom w:w="40" w:type="dxa"/>
               <w:right w:w="85" w:type="dxa"/>
             </w:tcMar>
           </w:tcPr>
@@ -1956,9 +1992,9 @@
               <w:right w:val="single" w:sz="4" w:color="D9D9D9"/>
             </w:tcBorders>
             <w:tcMar>
-              <w:top w:w="85" w:type="dxa"/>
+              <w:top w:w="40" w:type="dxa"/>
               <w:left w:w="85" w:type="dxa"/>
-              <w:bottom w:w="85" w:type="dxa"/>
+              <w:bottom w:w="40" w:type="dxa"/>
               <w:right w:w="85" w:type="dxa"/>
             </w:tcMar>
           </w:tcPr>
@@ -1985,9 +2021,9 @@
               <w:right w:val="single" w:sz="4" w:color="D9D9D9"/>
             </w:tcBorders>
             <w:tcMar>
-              <w:top w:w="85" w:type="dxa"/>
+              <w:top w:w="40" w:type="dxa"/>
               <w:left w:w="85" w:type="dxa"/>
-              <w:bottom w:w="85" w:type="dxa"/>
+              <w:bottom w:w="40" w:type="dxa"/>
               <w:right w:w="85" w:type="dxa"/>
             </w:tcMar>
           </w:tcPr>
@@ -2019,9 +2055,9 @@
               <w:right w:val="single" w:sz="4" w:color="D9D9D9"/>
             </w:tcBorders>
             <w:tcMar>
-              <w:top w:w="85" w:type="dxa"/>
+              <w:top w:w="40" w:type="dxa"/>
               <w:left w:w="85" w:type="dxa"/>
-              <w:bottom w:w="85" w:type="dxa"/>
+              <w:bottom w:w="40" w:type="dxa"/>
               <w:right w:w="85" w:type="dxa"/>
             </w:tcMar>
           </w:tcPr>
@@ -2048,9 +2084,9 @@
               <w:right w:val="single" w:sz="4" w:color="D9D9D9"/>
             </w:tcBorders>
             <w:tcMar>
-              <w:top w:w="85" w:type="dxa"/>
+              <w:top w:w="40" w:type="dxa"/>
               <w:left w:w="85" w:type="dxa"/>
-              <w:bottom w:w="85" w:type="dxa"/>
+              <w:bottom w:w="40" w:type="dxa"/>
               <w:right w:w="85" w:type="dxa"/>
             </w:tcMar>
           </w:tcPr>
@@ -2077,9 +2113,9 @@
               <w:right w:val="single" w:sz="4" w:color="D9D9D9"/>
             </w:tcBorders>
             <w:tcMar>
-              <w:top w:w="85" w:type="dxa"/>
+              <w:top w:w="40" w:type="dxa"/>
               <w:left w:w="85" w:type="dxa"/>
-              <w:bottom w:w="85" w:type="dxa"/>
+              <w:bottom w:w="40" w:type="dxa"/>
               <w:right w:w="85" w:type="dxa"/>
             </w:tcMar>
           </w:tcPr>
@@ -2135,9 +2171,9 @@
               <w:right w:val="single" w:sz="4" w:color="D9D9D9"/>
             </w:tcBorders>
             <w:tcMar>
-              <w:top w:w="85" w:type="dxa"/>
+              <w:top w:w="40" w:type="dxa"/>
               <w:left w:w="85" w:type="dxa"/>
-              <w:bottom w:w="85" w:type="dxa"/>
+              <w:bottom w:w="40" w:type="dxa"/>
               <w:right w:w="85" w:type="dxa"/>
             </w:tcMar>
             <w:shd w:fill="E5EDF3"/>
@@ -2166,9 +2202,9 @@
               <w:right w:val="single" w:sz="4" w:color="D9D9D9"/>
             </w:tcBorders>
             <w:tcMar>
-              <w:top w:w="85" w:type="dxa"/>
+              <w:top w:w="40" w:type="dxa"/>
               <w:left w:w="85" w:type="dxa"/>
-              <w:bottom w:w="85" w:type="dxa"/>
+              <w:bottom w:w="40" w:type="dxa"/>
               <w:right w:w="85" w:type="dxa"/>
             </w:tcMar>
             <w:shd w:fill="E5EDF3"/>
@@ -2197,9 +2233,9 @@
               <w:right w:val="single" w:sz="4" w:color="D9D9D9"/>
             </w:tcBorders>
             <w:tcMar>
-              <w:top w:w="85" w:type="dxa"/>
+              <w:top w:w="40" w:type="dxa"/>
               <w:left w:w="85" w:type="dxa"/>
-              <w:bottom w:w="85" w:type="dxa"/>
+              <w:bottom w:w="40" w:type="dxa"/>
               <w:right w:w="85" w:type="dxa"/>
             </w:tcMar>
             <w:shd w:fill="E5EDF3"/>
@@ -2228,9 +2264,9 @@
               <w:right w:val="single" w:sz="4" w:color="D9D9D9"/>
             </w:tcBorders>
             <w:tcMar>
-              <w:top w:w="85" w:type="dxa"/>
+              <w:top w:w="40" w:type="dxa"/>
               <w:left w:w="85" w:type="dxa"/>
-              <w:bottom w:w="85" w:type="dxa"/>
+              <w:bottom w:w="40" w:type="dxa"/>
               <w:right w:w="85" w:type="dxa"/>
             </w:tcMar>
             <w:shd w:fill="E5EDF3"/>
@@ -2259,9 +2295,9 @@
               <w:right w:val="single" w:sz="4" w:color="D9D9D9"/>
             </w:tcBorders>
             <w:tcMar>
-              <w:top w:w="85" w:type="dxa"/>
+              <w:top w:w="40" w:type="dxa"/>
               <w:left w:w="85" w:type="dxa"/>
-              <w:bottom w:w="85" w:type="dxa"/>
+              <w:bottom w:w="40" w:type="dxa"/>
               <w:right w:w="85" w:type="dxa"/>
             </w:tcMar>
             <w:shd w:fill="E5EDF3"/>
@@ -2295,9 +2331,9 @@
               <w:right w:val="single" w:sz="4" w:color="D9D9D9"/>
             </w:tcBorders>
             <w:tcMar>
-              <w:top w:w="85" w:type="dxa"/>
+              <w:top w:w="40" w:type="dxa"/>
               <w:left w:w="85" w:type="dxa"/>
-              <w:bottom w:w="85" w:type="dxa"/>
+              <w:bottom w:w="40" w:type="dxa"/>
               <w:right w:w="85" w:type="dxa"/>
             </w:tcMar>
           </w:tcPr>
@@ -2324,9 +2360,9 @@
               <w:right w:val="single" w:sz="4" w:color="D9D9D9"/>
             </w:tcBorders>
             <w:tcMar>
-              <w:top w:w="85" w:type="dxa"/>
+              <w:top w:w="40" w:type="dxa"/>
               <w:left w:w="85" w:type="dxa"/>
-              <w:bottom w:w="85" w:type="dxa"/>
+              <w:bottom w:w="40" w:type="dxa"/>
               <w:right w:w="85" w:type="dxa"/>
             </w:tcMar>
           </w:tcPr>
@@ -2353,9 +2389,9 @@
               <w:right w:val="single" w:sz="4" w:color="D9D9D9"/>
             </w:tcBorders>
             <w:tcMar>
-              <w:top w:w="85" w:type="dxa"/>
+              <w:top w:w="40" w:type="dxa"/>
               <w:left w:w="85" w:type="dxa"/>
-              <w:bottom w:w="85" w:type="dxa"/>
+              <w:bottom w:w="40" w:type="dxa"/>
               <w:right w:w="85" w:type="dxa"/>
             </w:tcMar>
           </w:tcPr>
@@ -2382,9 +2418,9 @@
               <w:right w:val="single" w:sz="4" w:color="D9D9D9"/>
             </w:tcBorders>
             <w:tcMar>
-              <w:top w:w="85" w:type="dxa"/>
+              <w:top w:w="40" w:type="dxa"/>
               <w:left w:w="85" w:type="dxa"/>
-              <w:bottom w:w="85" w:type="dxa"/>
+              <w:bottom w:w="40" w:type="dxa"/>
               <w:right w:w="85" w:type="dxa"/>
             </w:tcMar>
           </w:tcPr>
@@ -2411,9 +2447,9 @@
               <w:right w:val="single" w:sz="4" w:color="D9D9D9"/>
             </w:tcBorders>
             <w:tcMar>
-              <w:top w:w="85" w:type="dxa"/>
+              <w:top w:w="40" w:type="dxa"/>
               <w:left w:w="85" w:type="dxa"/>
-              <w:bottom w:w="85" w:type="dxa"/>
+              <w:bottom w:w="40" w:type="dxa"/>
               <w:right w:w="85" w:type="dxa"/>
             </w:tcMar>
           </w:tcPr>
@@ -2445,9 +2481,9 @@
               <w:right w:val="single" w:sz="4" w:color="D9D9D9"/>
             </w:tcBorders>
             <w:tcMar>
-              <w:top w:w="85" w:type="dxa"/>
+              <w:top w:w="40" w:type="dxa"/>
               <w:left w:w="85" w:type="dxa"/>
-              <w:bottom w:w="85" w:type="dxa"/>
+              <w:bottom w:w="40" w:type="dxa"/>
               <w:right w:w="85" w:type="dxa"/>
             </w:tcMar>
           </w:tcPr>
@@ -2474,9 +2510,9 @@
               <w:right w:val="single" w:sz="4" w:color="D9D9D9"/>
             </w:tcBorders>
             <w:tcMar>
-              <w:top w:w="85" w:type="dxa"/>
+              <w:top w:w="40" w:type="dxa"/>
               <w:left w:w="85" w:type="dxa"/>
-              <w:bottom w:w="85" w:type="dxa"/>
+              <w:bottom w:w="40" w:type="dxa"/>
               <w:right w:w="85" w:type="dxa"/>
             </w:tcMar>
           </w:tcPr>
@@ -2503,9 +2539,9 @@
               <w:right w:val="single" w:sz="4" w:color="D9D9D9"/>
             </w:tcBorders>
             <w:tcMar>
-              <w:top w:w="85" w:type="dxa"/>
+              <w:top w:w="40" w:type="dxa"/>
               <w:left w:w="85" w:type="dxa"/>
-              <w:bottom w:w="85" w:type="dxa"/>
+              <w:bottom w:w="40" w:type="dxa"/>
               <w:right w:w="85" w:type="dxa"/>
             </w:tcMar>
           </w:tcPr>
@@ -2532,9 +2568,9 @@
               <w:right w:val="single" w:sz="4" w:color="D9D9D9"/>
             </w:tcBorders>
             <w:tcMar>
-              <w:top w:w="85" w:type="dxa"/>
+              <w:top w:w="40" w:type="dxa"/>
               <w:left w:w="85" w:type="dxa"/>
-              <w:bottom w:w="85" w:type="dxa"/>
+              <w:bottom w:w="40" w:type="dxa"/>
               <w:right w:w="85" w:type="dxa"/>
             </w:tcMar>
           </w:tcPr>
@@ -2561,9 +2597,9 @@
               <w:right w:val="single" w:sz="4" w:color="D9D9D9"/>
             </w:tcBorders>
             <w:tcMar>
-              <w:top w:w="85" w:type="dxa"/>
+              <w:top w:w="40" w:type="dxa"/>
               <w:left w:w="85" w:type="dxa"/>
-              <w:bottom w:w="85" w:type="dxa"/>
+              <w:bottom w:w="40" w:type="dxa"/>
               <w:right w:w="85" w:type="dxa"/>
             </w:tcMar>
           </w:tcPr>
@@ -2595,14 +2631,15 @@
               <w:right w:val="single" w:sz="4" w:color="D9D9D9"/>
             </w:tcBorders>
             <w:tcMar>
-              <w:top w:w="85" w:type="dxa"/>
+              <w:top w:w="40" w:type="dxa"/>
               <w:left w:w="85" w:type="dxa"/>
-              <w:bottom w:w="85" w:type="dxa"/>
+              <w:bottom w:w="40" w:type="dxa"/>
               <w:right w:w="85" w:type="dxa"/>
             </w:tcMar>
           </w:tcPr>
           <w:p>
             <w:pPr>
+              <w:keepNext/>
               <w:spacing w:after="0" w:before="0" w:line="240" w:lineRule="auto"/>
             </w:pPr>
             <w:r>
@@ -2624,14 +2661,15 @@
               <w:right w:val="single" w:sz="4" w:color="D9D9D9"/>
             </w:tcBorders>
             <w:tcMar>
-              <w:top w:w="85" w:type="dxa"/>
+              <w:top w:w="40" w:type="dxa"/>
               <w:left w:w="85" w:type="dxa"/>
-              <w:bottom w:w="85" w:type="dxa"/>
+              <w:bottom w:w="40" w:type="dxa"/>
               <w:right w:w="85" w:type="dxa"/>
             </w:tcMar>
           </w:tcPr>
           <w:p>
             <w:pPr>
+              <w:keepNext/>
               <w:spacing w:after="0" w:before="0" w:line="240" w:lineRule="auto"/>
             </w:pPr>
             <w:r>
@@ -2653,14 +2691,15 @@
               <w:right w:val="single" w:sz="4" w:color="D9D9D9"/>
             </w:tcBorders>
             <w:tcMar>
-              <w:top w:w="85" w:type="dxa"/>
+              <w:top w:w="40" w:type="dxa"/>
               <w:left w:w="85" w:type="dxa"/>
-              <w:bottom w:w="85" w:type="dxa"/>
+              <w:bottom w:w="40" w:type="dxa"/>
               <w:right w:w="85" w:type="dxa"/>
             </w:tcMar>
           </w:tcPr>
           <w:p>
             <w:pPr>
+              <w:keepNext/>
               <w:spacing w:after="0" w:before="0" w:line="240" w:lineRule="auto"/>
             </w:pPr>
             <w:r>
@@ -2682,14 +2721,15 @@
               <w:right w:val="single" w:sz="4" w:color="D9D9D9"/>
             </w:tcBorders>
             <w:tcMar>
-              <w:top w:w="85" w:type="dxa"/>
+              <w:top w:w="40" w:type="dxa"/>
               <w:left w:w="85" w:type="dxa"/>
-              <w:bottom w:w="85" w:type="dxa"/>
+              <w:bottom w:w="40" w:type="dxa"/>
               <w:right w:w="85" w:type="dxa"/>
             </w:tcMar>
           </w:tcPr>
           <w:p>
             <w:pPr>
+              <w:keepNext/>
               <w:spacing w:after="0" w:before="0" w:line="240" w:lineRule="auto"/>
             </w:pPr>
             <w:r>
@@ -2711,14 +2751,15 @@
               <w:right w:val="single" w:sz="4" w:color="D9D9D9"/>
             </w:tcBorders>
             <w:tcMar>
-              <w:top w:w="85" w:type="dxa"/>
+              <w:top w:w="40" w:type="dxa"/>
               <w:left w:w="85" w:type="dxa"/>
-              <w:bottom w:w="85" w:type="dxa"/>
+              <w:bottom w:w="40" w:type="dxa"/>
               <w:right w:w="85" w:type="dxa"/>
             </w:tcMar>
           </w:tcPr>
           <w:p>
             <w:pPr>
+              <w:keepNext/>
               <w:spacing w:after="0" w:before="0" w:line="240" w:lineRule="auto"/>
             </w:pPr>
             <w:r>
@@ -2732,6 +2773,18 @@
         </w:tc>
       </w:tr>
     </w:tbl>
+    <w:p>
+      <w:pPr>
+        <w:keepLines/>
+        <w:spacing w:after="120"/>
+      </w:pPr>
+      <w:r>
+        <w:rPr>
+          <w:sz w:val="20"/>
+        </w:rPr>
+        <w:t>Note. All rows contain 36,743 records and 2,231 distinct source identifiers. Shared sources means sources occurring in more than one subset, counted once. The two constructed rows use seed 42.</w:t>
+      </w:r>
+    </w:p>
     <w:p>
       <w:pPr>
         <w:pStyle w:val="Heading1"/>

</xml_diff>

<commit_message>
Clarify archived ETHZ memberships and manuscript evidence scope
</commit_message>
<xml_diff>
--- a/manuscript/PathA_MainText.docx
+++ b/manuscript/PathA_MainText.docx
@@ -7,6 +7,9 @@
         <w:pStyle w:val="Title"/>
       </w:pPr>
       <w:r>
+        <w:rPr>
+          <w:color w:val="000000"/>
+        </w:rPr>
         <w:t>Auditing Earthquake Source Separation and Data History in Seismic Machine Learning</w:t>
       </w:r>
     </w:p>
@@ -60,12 +63,15 @@
         <w:pStyle w:val="Heading1"/>
       </w:pPr>
       <w:r>
+        <w:rPr>
+          <w:color w:val="000000"/>
+        </w:rPr>
         <w:t>Abstract</w:t>
       </w:r>
     </w:p>
     <w:p>
       <w:r>
-        <w:t>An earthquake can contribute recordings from several stations. Separating files therefore does not necessarily separate sources, and repairing a split does not erase earlier use. We present a Python tool for auditing source membership, processing relationships and artifact identity. Applied to recovered identities in a historical STEAD partition, the tool identifies 151 of 335 test records sharing sources with training. The corrected split has zero overlap, but 196 of its 221 test sources have documented prior training or validation roles. Thirty configuration–fold checks pass across six saved out-of-fold membership tables, and hashes match for 106 checkpoints and 93 public code files. A metadata demonstration uses 36,743 ETHZ records from 2,231 sources. The supplied SeisBench partition is source-disjoint, whereas a deliberately constructed record-random control has 2,028 sources spanning subsets. The supplied partition also shares 180 network–station keys between training and testing, distinguishing source exclusion from station exclusion. Twenty-seven automated tests cover valid inputs, injected failures and incomplete identifiers. These checks demonstrate reusable auditing without model training; they do not verify physical event associations or estimate how leakage changes accuracy. Because most corrected test sources were used earlier in development, the corrected split cannot serve as independent confirmation. The practical output is an executable checklist with explicit evidence boundaries.</w:t>
+        <w:t>An earthquake can contribute recordings from several stations. Separating files therefore does not necessarily separate sources, and repairing a split does not erase earlier use. We present a Python tool for auditing source membership, processing relationships and artifact identity. Applied to recovered identities in a historical STEAD partition, the tool identifies 151 of 335 test records sharing sources with training. The corrected split has zero overlap, but 196 of its 221 test sources have documented prior training or validation roles. Thirty configuration–fold checks pass across six saved out-of-fold membership tables, and hashes match for 106 checkpoints and 93 public code files. Metadata audits of four SeisBench datasets (515,692 records) verify source-disjoint supplied splits in three datasets; Iquique lacks source IDs and is not assessable. Across all four datasets, 91.91–100% of test records use training-represented station keys. ETHZ reproduces its documented chronological split, yet 97.71% of test sources occupy training-represented 25 km cells. Twenty-seven automated tests and separate recomputation of 28 metadata contracts support implementation verification without model training. These checks do not verify physical event associations or estimate how leakage changes accuracy. Because most corrected test sources were used earlier in development, the corrected split cannot serve as independent confirmation. The practical output is an executable checklist with explicit evidence boundaries.</w:t>
       </w:r>
     </w:p>
     <w:p>
@@ -78,6 +84,9 @@
         <w:pStyle w:val="Heading1"/>
       </w:pPr>
       <w:r>
+        <w:rPr>
+          <w:color w:val="000000"/>
+        </w:rPr>
         <w:t>1 Introduction</w:t>
       </w:r>
     </w:p>
@@ -146,12 +155,18 @@
     <w:p>
       <w:pPr/>
       <w:r>
+        <w:t>Static analysis provides a complementary way to detect leakage in executable pipelines. Yang et al. (2022) analyze notebook code to identify common training–test data-flow problems. Our interface instead checks saved memberships, provenance records and artifact bytes, including historical data roles that may be absent from a current notebook. We do not claim to replace static analysis or detect every form of leakage.</w:t>
+      </w:r>
+    </w:p>
+    <w:p>
+      <w:pPr/>
+      <w:r>
         <w:t>Existing libraries already support grouped partition construction: scikit-learn provides GroupKFold and GroupShuffleSplit (Pedregosa et al. 2011). Those splitting interfaces generate train/test indices from supplied groups; they do not themselves provide the combined audit of saved partitions, derived-record links, multistage out-of-fold (OOF) memberships, artifact hashes and earlier development roles examined here. Our contribution is a small, reusable implementation of explicit input contracts and consistent reports across these checks. The split command reports PASS, FAIL or WARNING and identifies record-level membership violations; the accompanying Python APIs address the other contracts. This makes the checks inspectable and repeatable without claiming a new splitting algorithm or a comprehensive leakage detector.</w:t>
       </w:r>
     </w:p>
     <w:p>
       <w:r>
-        <w:t>We ask whether a compact, model-independent interface can make common source-membership and processing-history failures visible before seismic predictions are interpreted. We connect a forensic example from an existing STEAD workflow to a reusable Python implementation and a metadata demonstration on ETHZ. The metadata demonstration requires neither MATLAB nor a trained picker. Its purpose is to test the portability of the membership audit, with a clear distinction between a supplied partition and controls constructed for this study. Model architecture and accuracy ranking are outside the primary question.</w:t>
+        <w:t>We ask whether a compact, model-independent interface can make common source-membership and processing-history failures visible before seismic predictions are interpreted. We connect a forensic example from an existing STEAD workflow to a reusable Python implementation and metadata demonstrations across four SeisBench datasets. The metadata demonstration requires neither MATLAB nor a trained picker. Its purpose is to test the portability of source and station membership checks, with a clear distinction between a supplied partition and controls constructed for this study. Lineage, OOF and feature-schema checks are not validated across all four datasets. Model architecture and accuracy ranking are outside the primary question.</w:t>
       </w:r>
     </w:p>
     <w:p>
@@ -165,14 +180,20 @@
         <w:pStyle w:val="Heading1"/>
       </w:pPr>
       <w:r>
+        <w:rPr>
+          <w:color w:val="000000"/>
+        </w:rPr>
         <w:t>2 Design and Implementation</w:t>
       </w:r>
     </w:p>
     <w:p>
       <w:pPr>
-        <w:pStyle w:val="Heading1"/>
+        <w:pStyle w:val="Heading2"/>
       </w:pPr>
       <w:r>
+        <w:rPr>
+          <w:color w:val="000000"/>
+        </w:rPr>
         <w:t>2.1 Identify records and state the evaluation unit</w:t>
       </w:r>
     </w:p>
@@ -187,15 +208,24 @@
       </w:r>
     </w:p>
     <w:p>
+      <w:pPr/>
+      <w:r>
+        <w:t>For an exclusion contract, let R be the record set, s(r) its split label and g(r) the declared group key. Define Gₐ = {g(r): r ∈ R, s(r) = a}. All-subset exclusion requires Gₐ ∩ Gᵦ = ∅ for every distinct pair of subsets a and b; train–test exclusion checks only G_train ∩ G_test = ∅. Source IDs, network–station keys, spatial cells and temporal bins instantiate g separately. Missing required keys make that dataset contract not assessable; they do not establish an empty intersection. These definitions concern supplied memberships, not physical identity or historical independence.</w:t>
+      </w:r>
+    </w:p>
+    <w:p>
       <w:r>
         <w:t>The check is conditional on the supplied identifiers. Correctly grouping incorrect labels can pass. In the STEAD case, waveform identity recovery supplies an additional link between local exported records and original catalogue identifiers. The generic Python tool does not perform that waveform recovery; it consumes the resulting membership table. This distinction is necessary when applying the tool to another dataset.</w:t>
       </w:r>
     </w:p>
     <w:p>
       <w:pPr>
-        <w:pStyle w:val="Heading1"/>
+        <w:pStyle w:val="Heading2"/>
       </w:pPr>
       <w:r>
+        <w:rPr>
+          <w:color w:val="000000"/>
+        </w:rPr>
         <w:t>2.2 Preserve processing relationships</w:t>
       </w:r>
     </w:p>
@@ -211,9 +241,12 @@
     </w:p>
     <w:p>
       <w:pPr>
-        <w:pStyle w:val="Heading1"/>
+        <w:pStyle w:val="Heading2"/>
       </w:pPr>
       <w:r>
+        <w:rPr>
+          <w:color w:val="000000"/>
+        </w:rPr>
         <w:t>2.3 Report the scope of a successful check</w:t>
       </w:r>
     </w:p>
@@ -264,20 +297,32 @@
         <w:pStyle w:val="Heading1"/>
       </w:pPr>
       <w:r>
+        <w:rPr>
+          <w:color w:val="000000"/>
+        </w:rPr>
         <w:t>3 Case studies and verification</w:t>
       </w:r>
     </w:p>
     <w:p>
       <w:pPr>
-        <w:pStyle w:val="Heading1"/>
+        <w:pStyle w:val="Heading2"/>
       </w:pPr>
       <w:r>
+        <w:rPr>
+          <w:color w:val="000000"/>
+        </w:rPr>
         <w:t>3.1 Existing STEAD case</w:t>
       </w:r>
     </w:p>
     <w:p>
       <w:r>
         <w:t>The STEAD case uses an existing local collection of 2,234 exported waveform records. Earlier ordinal filenames did not provide a reliable connection to the catalogue. A previously completed exact fingerprint audit compared the retained numerical waveforms against 1,265,657 waveforms in the tested local HDF5 archive. Every retained waveform had one matching archive entry, yielding 1,477 recovered source identifiers. Matching used the documented float32 waveform representation and component order; it did not search for approximate or transformed duplicates.</w:t>
+      </w:r>
+    </w:p>
+    <w:p>
+      <w:pPr/>
+      <w:r>
+        <w:t>The legacy configuration records intended filters of source distance ≤15 km, magnitude ≥1.5, SNR ≥10 dB and manual P/S pick status, with reapplication disabled; the recovered 2,234-record collection does not satisfy all of these settings, so they cannot be treated as verified extraction criteria. The retained records span 0–49.99 km and magnitudes 2.5–5.9, with both picks marked manual in 1,817 records; the original extraction log is unavailable (Online Resource 1, Section 5).</w:t>
       </w:r>
     </w:p>
     <w:p>
@@ -303,9 +348,12 @@
     </w:p>
     <w:p>
       <w:pPr>
-        <w:pStyle w:val="Heading1"/>
+        <w:pStyle w:val="Heading2"/>
       </w:pPr>
       <w:r>
+        <w:rPr>
+          <w:color w:val="000000"/>
+        </w:rPr>
         <w:t>3.2 Metadata demonstration on ETHZ</w:t>
       </w:r>
     </w:p>
@@ -331,10 +379,49 @@
     </w:p>
     <w:p>
       <w:pPr>
-        <w:pStyle w:val="Heading1"/>
+        <w:pStyle w:val="Heading2"/>
+        <w:keepNext/>
       </w:pPr>
       <w:r>
-        <w:t>3.3 Verification of the implementation</w:t>
+        <w:rPr>
+          <w:color w:val="000000"/>
+        </w:rPr>
+        <w:t>3.3 Transfer across datasets and ETHZ space and time groups</w:t>
+      </w:r>
+    </w:p>
+    <w:p>
+      <w:pPr>
+        <w:keepNext w:val="0"/>
+      </w:pPr>
+      <w:r>
+        <w:t>We applied the unchanged seismic-eval-audit v0.1.3 wheel to four complete SeisBench metadata snapshots retrieved on 28 October 2026: ETHZ, GEOFON, ISC-EHB Depth Phases and Iquique (515,692 records in 35 files). Selection was purposive, based on public metadata availability, compatible fields and contrasting settings. A written protocol preceded the new overlap calculations; earlier ETHZ source and station results were already known. ISC-EHB was added through a documented amendment when Iquique lacked source identifiers. This extension tests transfer of the audit to different tables, not physical event matching across catalogs. Record keys are JSON tuples of chunk filename and native trace_name; source IDs and split labels are retained, and station keys are JSON tuples of network and station codes. Iquique source separation is not assessable. The ETHZ snapshot has the same input hash as the preceding demonstration.</w:t>
+      </w:r>
+    </w:p>
+    <w:p>
+      <w:pPr>
+        <w:keepNext w:val="0"/>
+      </w:pPr>
+      <w:r>
+        <w:t>Dataset context determines the appropriate exclusion requirement. ETHZ and GEOFON use documented chronological cutoffs, checked here as positive controls. The ISC-EHB study describes random 70/10/20 allocation with event groups kept intact (Münchmeyer et al. 2024). Iquique concerns a local seismic network (Woollam et al. 2019), and its SeisBench adapter documents random record sampling, which does not guarantee source separation. SeisBench provides the common metadata interface (Woollam et al. 2022). Online Resource 1, Section 10 records input hashes, adapter provenance and regeneration commands. Network attribution includes GEOFON Data Centre (1993); that citation identifies the GE network, not the complete multi-network benchmark.</w:t>
+      </w:r>
+    </w:p>
+    <w:p>
+      <w:pPr>
+        <w:keepNext w:val="0"/>
+      </w:pPr>
+      <w:r>
+        <w:t>For ETHZ, we checked within-source consistency of origin times and epicentres, then projected WGS84 longitude and latitude into EPSG:3035 using longitude–latitude axis order. Floor-based square cells have sides of 10, 25 or 50 km, each with origins (0,0), (s/2,0), (0,s/2) and (s/2,s/2), where s is cell size. The prespecified primary spatial configuration is 25 km at (0,0). Temporal groups are calendar days, months and years, plus half-open 7-, 30- and 90-day bins anchored to 1 January 1970 UTC at offsets zero and half the bin width; calendar month is the primary temporal definition. All 12 spatial and nine temporal configurations are reported. A separate pandas implementation recomputed all 28 assessable source, station, spatial and temporal contract outputs from the original files. These are author-run checks, not independent-user adoption.</w:t>
+      </w:r>
+    </w:p>
+    <w:p>
+      <w:pPr>
+        <w:pStyle w:val="Heading2"/>
+      </w:pPr>
+      <w:r>
+        <w:rPr>
+          <w:color w:val="000000"/>
+        </w:rPr>
+        <w:t>3.4 Verification of the implementation</w:t>
       </w:r>
     </w:p>
     <w:p>
@@ -344,10 +431,13 @@
     </w:p>
     <w:p>
       <w:pPr>
-        <w:pStyle w:val="Heading1"/>
+        <w:pStyle w:val="Heading2"/>
       </w:pPr>
       <w:r>
-        <w:t>3.4 Software development and AI assistance</w:t>
+        <w:rPr>
+          <w:color w:val="000000"/>
+        </w:rPr>
+        <w:t>3.5 Software development and AI assistance</w:t>
       </w:r>
     </w:p>
     <w:p>
@@ -360,14 +450,20 @@
         <w:pStyle w:val="Heading1"/>
       </w:pPr>
       <w:r>
+        <w:rPr>
+          <w:color w:val="000000"/>
+        </w:rPr>
         <w:t>4 Results</w:t>
       </w:r>
     </w:p>
     <w:p>
       <w:pPr>
-        <w:pStyle w:val="Heading1"/>
+        <w:pStyle w:val="Heading2"/>
       </w:pPr>
       <w:r>
+        <w:rPr>
+          <w:color w:val="000000"/>
+        </w:rPr>
         <w:t>4.1 A corrected split does not erase earlier use</w:t>
       </w:r>
     </w:p>
@@ -383,10 +479,13 @@
     </w:p>
     <w:p>
       <w:pPr>
-        <w:pStyle w:val="Heading1"/>
+        <w:pStyle w:val="Heading2"/>
       </w:pPr>
       <w:r>
-        <w:t>4.2 Source and station membership give different answers for the ETHZ split</w:t>
+        <w:rPr>
+          <w:color w:val="000000"/>
+        </w:rPr>
+        <w:t>4.2 Source, station, spatial and temporal membership give different answers</w:t>
       </w:r>
     </w:p>
     <w:p>
@@ -406,9 +505,90 @@
     </w:p>
     <w:p>
       <w:pPr>
-        <w:pStyle w:val="Heading1"/>
+        <w:keepNext w:val="0"/>
       </w:pPr>
       <w:r>
+        <w:t>The four-dataset audit retained all rows for every assessable contract (Table 4; Online Resource 1, Fig. S1). ETHZ, GEOFON and ISC-EHB have zero supplied source-ID overlap across all subsets. In contrast, 91.91–100% of test records use network–station keys represented in training. Station reuse is compatible with evaluation on a known network, including the ISC-EHB global teleseismic setting; unseen-station exclusion is an additional evaluation requirement rather than a universal dataset-quality criterion. Iquique lacks source IDs, so actual source overlap remains unmeasured. Its record-sampling design alone does not establish overlap.</w:t>
+      </w:r>
+    </w:p>
+    <w:p>
+      <w:pPr>
+        <w:keepNext w:val="0"/>
+      </w:pPr>
+      <w:r>
+        <w:t>ETHZ and GEOFON reproduced their documented chronological labels with zero mismatches across 36,743 and 275,274 records, respectively. For ETHZ, every training origin precedes every test origin; their 240.02-day separation contains the development period and is not an event-free interval. Calendar-month bins share two groups across adjacent subsets but none between training and testing: January and September 2019 span the within-month cutoffs of 8 January and 4 September. None of the predefined 7-, 30- or 90-day configurations shares a train–test bin. The calendar-year definition does share 2019, illustrating that coarse-bin overlap can coexist with chronological order (Online Resource 1, Table S8 and Fig. S2). Chronology is a positive control for the documented design, not a newly discovered partitioning method.</w:t>
+      </w:r>
+    </w:p>
+    <w:p>
+      <w:pPr>
+        <w:keepNext w:val="0"/>
+      </w:pPr>
+      <w:r>
+        <w:t>Despite that chronological order, the primary 25 km grid places 512/524 test source IDs (97.71%) and 10,382/10,485 test records (99.02%) in cells represented in training. All twelve spatial configurations share train–test cells. Across the four origins, the test-source fraction ranges from 80.92–84.35% at 10 km, 97.14–98.47% at 25 km and 99.24–99.81% at 50 km (Fig. 2; Online Resource 1, Table S7). These ranges measure grid-origin sensitivity, not statistical uncertainty. A chronological split therefore does not imply spatial-cell exclusion; cells are not distance buffers.</w:t>
+      </w:r>
+    </w:p>
+    <w:p>
+      <w:pPr>
+        <w:keepNext/>
+        <w:jc w:val="center"/>
+      </w:pPr>
+      <w:r>
+        <w:drawing>
+          <wp:inline xmlns:a="http://schemas.openxmlformats.org/drawingml/2006/main" xmlns:pic="http://schemas.openxmlformats.org/drawingml/2006/picture">
+            <wp:extent cx="5303520" cy="2339617"/>
+            <wp:docPr id="2" name="Picture 2" descr="Fig. 2 ETHZ spatial membership sensitivity. (A) Unique source locations by supplied split in EPSG:3035; points are sources, not stations, and may overlap visually. (B) Fractions of test source IDs and records occupying cells represented in training, for three cell sizes and four origins. Vertical ranges describe origin sensitivity, not confidence intervals. The primary grid is 25 km with origin (0,0)."/>
+            <wp:cNvGraphicFramePr>
+              <a:graphicFrameLocks noChangeAspect="1"/>
+            </wp:cNvGraphicFramePr>
+            <a:graphic>
+              <a:graphicData uri="http://schemas.openxmlformats.org/drawingml/2006/picture">
+                <pic:pic>
+                  <pic:nvPicPr>
+                    <pic:cNvPr id="0" name="Figure2_ETHZ_spatial.png"/>
+                    <pic:cNvPicPr/>
+                  </pic:nvPicPr>
+                  <pic:blipFill>
+                    <a:blip r:embed="rId10"/>
+                    <a:stretch>
+                      <a:fillRect/>
+                    </a:stretch>
+                  </pic:blipFill>
+                  <pic:spPr>
+                    <a:xfrm>
+                      <a:off x="0" y="0"/>
+                      <a:ext cx="5303520" cy="2339617"/>
+                    </a:xfrm>
+                    <a:prstGeom prst="rect"/>
+                  </pic:spPr>
+                </pic:pic>
+              </a:graphicData>
+            </a:graphic>
+          </wp:inline>
+        </w:drawing>
+      </w:r>
+    </w:p>
+    <w:p>
+      <w:pPr>
+        <w:pStyle w:val="Caption"/>
+        <w:keepNext w:val="0"/>
+        <w:keepLines/>
+      </w:pPr>
+      <w:r>
+        <w:rPr>
+          <w:b/>
+          <w:sz w:val="20"/>
+        </w:rPr>
+        <w:t>Fig. 2 ETHZ spatial membership sensitivity. (A) Source epicentres by split in EPSG:3035. (B) Test sources and records in training-represented cells across three cell sizes and four origins. Ranges show origin sensitivity, not confidence intervals. The primary grid is 25 km at (0,0).</w:t>
+      </w:r>
+    </w:p>
+    <w:p>
+      <w:pPr>
+        <w:pStyle w:val="Heading2"/>
+      </w:pPr>
+      <w:r>
+        <w:rPr>
+          <w:color w:val="000000"/>
+        </w:rPr>
         <w:t>4.3 Reproduction and test outcomes</w:t>
       </w:r>
     </w:p>
@@ -420,7 +600,7 @@
     <w:p>
       <w:pPr/>
       <w:r>
-        <w:t>The usage walkthrough separately exercises the unchanged v0.1.3 wheel from outside the source directory. Native ETHZ columns reproduce the source and station counts against direct set calculations. Synthetic examples verify PASS, FAIL, WARNING, strict-warning and invalid-input exits (Online Resource 1, Table S6). This author-run check verifies executable instructions, not independent-user adoption; its receipt and guide are supplied separately from the archived release.</w:t>
+        <w:t>The usage walkthrough separately exercises the unchanged v0.1.3 wheel from outside the source directory. Native ETHZ columns reproduce the source and station counts against direct set calculations. Synthetic examples verify PASS, FAIL, WARNING, strict-warning and invalid-input exits (Online Resource 1, Table S6). This author-run check verifies executable instructions, not independent-user adoption; its receipt and guide are supplied in the later metadata evidence archive.</w:t>
       </w:r>
     </w:p>
     <w:p>
@@ -433,6 +613,9 @@
         <w:pStyle w:val="Heading1"/>
       </w:pPr>
       <w:r>
+        <w:rPr>
+          <w:color w:val="000000"/>
+        </w:rPr>
         <w:t>5 Practical use and limitations</w:t>
       </w:r>
     </w:p>
@@ -452,6 +635,14 @@
       </w:r>
     </w:p>
     <w:p>
+      <w:pPr>
+        <w:keepNext w:val="0"/>
+      </w:pPr>
+      <w:r>
+        <w:t>The metadata extension is a purposive four-dataset comparison, not a representative survey or an audit of additional trained models. Supplied source IDs were not reconciled independently with physical earthquakes. The downloaded ISC-EHB snapshot contains 190,275 records and 45,028 source IDs, whereas the paper reports 174,436 traces and 44,106 events (Münchmeyer et al. 2024); our counts apply to the hashed snapshot. ETHZ contains 14 adapter-generated sb_id_ identifiers covering 376 records (292 training, 84 development, none test). They preserve within-event grouping but do not themselves resolve to catalog identifiers. Temporal bins and spatial cells define explicit exclusion tests, not statistical independence or an effect on accuracy. Reproduction requires continued upstream availability of the exact hashed metadata bytes.</w:t>
+      </w:r>
+    </w:p>
+    <w:p>
       <w:r>
         <w:t>The contribution is a small executable interface, documented failure cases and a practical separation of evidence levels. Existing grouped-validation and provenance concepts remain the foundation. The case shows why artifact consistency, within-run source exclusion and historical independence should be reported separately. Keeping these claims distinct provides a useful outcome even when an earlier experiment cannot be reinterpreted as an independent benchmark.</w:t>
       </w:r>
@@ -461,12 +652,15 @@
         <w:pStyle w:val="Heading1"/>
       </w:pPr>
       <w:r>
+        <w:rPr>
+          <w:color w:val="000000"/>
+        </w:rPr>
         <w:t>6 Conclusions</w:t>
       </w:r>
     </w:p>
     <w:p>
       <w:r>
-        <w:t>The tool detects a documented historical source-overlap failure and distinguishes that failure from the corrected STEAD memberships and their earlier development roles. Saved OOF memberships and frozen artifact hashes pass their specified checks. On ETHZ, the supplied partition is source-disjoint but shares 180 network.station keys between training and testing, demonstrating why the evaluation unit must be stated. These findings support explicit audit claims without estimating a change in model accuracy. We recommend running these checks, and reporting historical data roles, before interpreting seismic machine-learning scores.</w:t>
+        <w:t>The tool detects a documented historical source-overlap failure and distinguishes it from the corrected STEAD memberships and their earlier development roles. Saved OOF memberships and frozen artifact hashes pass their specified checks. Across four SeisBench metadata snapshots, source-ID exclusion passes wherever identifiers are available, while 92–100% of test records use stations represented in training; in ETHZ, a documented chronological split coexists with extensive spatial-cell sharing. Source, station, temporal and spatial exclusion are therefore distinct evaluation requirements that should be stated before a score is interpreted. These findings support explicit audit claims without estimating a change in model accuracy or establishing independent predictive confirmation. We recommend running these checks, and reporting historical data roles, before interpreting seismic machine-learning scores.</w:t>
       </w:r>
     </w:p>
     <w:p>
@@ -474,19 +668,22 @@
         <w:pStyle w:val="Heading1"/>
       </w:pPr>
       <w:r>
+        <w:rPr>
+          <w:color w:val="000000"/>
+        </w:rPr>
         <w:t>Availability and Requirements</w:t>
       </w:r>
     </w:p>
     <w:p>
       <w:pPr/>
       <w:r>
-        <w:t>Project: seismic-eval-audit, version 0.1.3. Source, wheel and licence: https://github.com/rcw3712/seismic-eval-audit. Immutable software archive: https://doi.org/10.5281/zenodo.23684054. The software is distributed under the MIT licence; upstream data licences remain separate.</w:t>
+        <w:t>Project: seismic-eval-audit, version 0.1.3. Source, wheel and licence: https://github.com/rcw3712/seismic-eval-audit. Immutable software archive: https://doi.org/10.5281/zenodo.23684054. The software is distributed under the MIT licence; upstream data licences remain separate. The metadata evidence extension is archived separately at https://doi.org/10.5281/zenodo.23758930 (Wibowo 2026b); it uses the unchanged v0.1.3 wheel.</w:t>
       </w:r>
     </w:p>
     <w:p>
       <w:pPr/>
       <w:r>
-        <w:t>Python 3.10 or later is required; the audit core has no third-party runtime dependencies. Verification covers Windows and Linux with Python 3.10 and 3.12; local verification used Python 3.12.14 on Windows. No MATLAB installation, GPU or trained model is required for the metadata workflow. Memory and storage depend on the input tables, reports and any artifacts being hashed; minimum RAM, disk capacity and cross-platform performance were not benchmarked. Network access is needed only when retrieving remote inputs or software.</w:t>
+        <w:t>Python 3.10 or later is required; the audit core has no third-party runtime dependencies. Verification covers Windows and Linux with Python 3.10 and 3.12; local verification used Python 3.12.14 on Windows. No MATLAB installation, GPU or trained model is required for the metadata workflow. Memory and storage depend on the input tables, reports and any artifacts being hashed; minimum RAM, disk capacity and cross-platform performance were not benchmarked. Network access is needed only when retrieving remote inputs or software. The full metadata extension additionally uses pandas, NumPy, pyproj and Matplotlib with pinned versions in its requirements file; it was run with Python 3.12.14. This dependency requirement is separate from the standard-library-only core.</w:t>
       </w:r>
     </w:p>
     <w:p>
@@ -508,7 +705,7 @@
     <w:p>
       <w:pPr/>
       <w:r>
-        <w:t>The source CLI and separate APIs, their input contracts and their exit semantics are described in Online Resource 1. Section 9 provides the installed-wheel walkthrough; Code availability distinguishes its later commit from the software DOI.</w:t>
+        <w:t>The source CLI and separate APIs, their input contracts and their exit semantics are described in Online Resource 1. Section 9 provides the installed-wheel walkthrough; Code availability and Online Resource 1, Section 6 distinguish the later documentation and evidence commits from the software DOI. Online Resource 1, Section 10 gives the full metadata regeneration path.</w:t>
       </w:r>
     </w:p>
     <w:p>
@@ -516,6 +713,9 @@
         <w:pStyle w:val="Heading1"/>
       </w:pPr>
       <w:r>
+        <w:rPr>
+          <w:color w:val="000000"/>
+        </w:rPr>
         <w:t>Statements and Declarations</w:t>
       </w:r>
     </w:p>
@@ -524,6 +724,9 @@
         <w:pStyle w:val="Heading1"/>
       </w:pPr>
       <w:r>
+        <w:rPr>
+          <w:color w:val="000000"/>
+        </w:rPr>
         <w:t>Author contributions</w:t>
       </w:r>
     </w:p>
@@ -543,6 +746,9 @@
         <w:pStyle w:val="Heading1"/>
       </w:pPr>
       <w:r>
+        <w:rPr>
+          <w:color w:val="000000"/>
+        </w:rPr>
         <w:t>Competing interests</w:t>
       </w:r>
     </w:p>
@@ -556,6 +762,9 @@
         <w:pStyle w:val="Heading1"/>
       </w:pPr>
       <w:r>
+        <w:rPr>
+          <w:color w:val="000000"/>
+        </w:rPr>
         <w:t>Funding</w:t>
       </w:r>
     </w:p>
@@ -572,6 +781,7 @@
       <w:r>
         <w:rPr>
           <w:b/>
+          <w:color w:val="000000"/>
         </w:rPr>
         <w:t>Ethics approval and consent to participate</w:t>
       </w:r>
@@ -590,6 +800,7 @@
       <w:r>
         <w:rPr>
           <w:b/>
+          <w:color w:val="000000"/>
         </w:rPr>
         <w:t>Consent for publication</w:t>
       </w:r>
@@ -605,18 +816,21 @@
         <w:pStyle w:val="Heading1"/>
       </w:pPr>
       <w:r>
+        <w:rPr>
+          <w:color w:val="000000"/>
+        </w:rPr>
         <w:t>Code availability</w:t>
       </w:r>
     </w:p>
     <w:p>
       <w:r>
-        <w:t>seismic-eval-audit v0.1.3 is distributed under the MIT license at https://github.com/rcw3712/seismic-eval-audit and archived at https://doi.org/10.5281/zenodo.23684054 (Wibowo 2026). The DOI identifies the immutable source and evidence at tag archive-v0.1.3, commit 287138537796c577a383844a6faa57f126e17568, which is identical to the original v0.1.3 release commit. The package provides source, a wheel, tests, case-study reports and SHA-256 manifests. The core requires Python 3.10 or later and no third-party runtime dependencies. Continuous integration tests Linux and Windows with Python 3.10 and 3.12; separate local verification used Python 3.12.14 on Windows. The historical STEAD model/result implementation remains archived separately at https://doi.org/10.5281/zenodo.22824997 (Wibowo et al. 2026).</w:t>
+        <w:t>seismic-eval-audit v0.1.3 is distributed under the MIT license at https://github.com/rcw3712/seismic-eval-audit and archived at https://doi.org/10.5281/zenodo.23684054 (Wibowo 2026a). The DOI identifies the immutable source and evidence at tag archive-v0.1.3, commit 287138537796c577a383844a6faa57f126e17568, which is identical to the original v0.1.3 release commit. The package provides source, a wheel, tests, case-study reports and SHA-256 manifests. The core requires Python 3.10 or later and no third-party runtime dependencies. Continuous integration tests Linux and Windows with Python 3.10 and 3.12; separate local verification used Python 3.12.14 on Windows. The historical STEAD model/result implementation remains archived separately at https://doi.org/10.5281/zenodo.22824997 (Wibowo et al. 2026).</w:t>
       </w:r>
     </w:p>
     <w:p>
       <w:pPr/>
       <w:r>
-        <w:t>The post-archive walkthrough, usage driver and verification receipt are fixed at commit 502b5415bead677ec810207affed55a0e76a9f82 (https://github.com/rcw3712/seismic-eval-audit/tree/502b5415bead677ec810207affed55a0e76a9f82). Its CHECKSUMS.csv records their hashes; Online Resource 1, Section 6 supplies the exact manifest URL and SHA-256. These files are outside the v0.1.3 Zenodo snapshot.</w:t>
+        <w:t>The metadata audit evidence and unchanged installed-wheel walkthrough are preserved in the later evidence release metadata-audit-20261028-r1 (commit 6d7ecbbb7758e1dcfcf4cfe7f0eeb0a875bfe520), archived at https://doi.org/10.5281/zenodo.23758930 (Wibowo 2026b). The archive contains the protocols, scripts, input URLs and hashes, aggregate results, figures and verification receipts. Online Resource 1, Section 6 distinguishes this evidence archive from the original v0.1.3 software archive and the historical model archive.</w:t>
       </w:r>
     </w:p>
     <w:p>
@@ -624,12 +838,15 @@
         <w:pStyle w:val="Heading1"/>
       </w:pPr>
       <w:r>
+        <w:rPr>
+          <w:color w:val="000000"/>
+        </w:rPr>
         <w:t>Data availability</w:t>
       </w:r>
     </w:p>
     <w:p>
       <w:r>
-        <w:t>STEAD data are distributed through https://github.com/smousavi05/STEAD. The retained-trace mapping and fingerprints identify the local case-study inputs. ETHZ metadata were obtained from the official SeisBench distribution at https://hifis-storage.desy.de/Helmholtz/HelmholtzAI/SeisBench/datasets/ethz/metadata.csv. The software provides a downloader that checks the tested SHA-256, and the accompanying results include exact partition memberships. Raw waveforms are not redistributed. The STEAD-derived identifier tables retain CC BY 4.0 attribution to Mousavi et al. (2019); selection, recovered source mapping and split labels are documented changes. The software MIT license does not replace upstream data licences. Other dataset terms remain those of their original providers. The ETHZ metadata checksum and retrieval details are recorded in Online Resource 1.</w:t>
+        <w:t>STEAD data are distributed through https://github.com/smousavi05/STEAD. The retained-trace mapping and fingerprints identify the local case-study inputs. ETHZ metadata were obtained from the official SeisBench distribution at https://hifis-storage.desy.de/Helmholtz/HelmholtzAI/SeisBench/datasets/ethz/metadata.csv. The software provides a downloader that checks the tested SHA-256. Raw waveforms are not redistributed. The STEAD-derived identifier tables retain CC BY 4.0 attribution to Mousavi et al. (2019); selection, recovered source mapping and split labels are documented changes. The software MIT license does not replace upstream data licences. Other dataset terms remain those of their original providers. The ETHZ metadata checksum and retrieval details are recorded in Online Resource 1. The extension obtains ETHZ, GEOFON, ISC-EHB Depth Phases and Iquique metadata from the SeisBench distribution URLs listed in its frozen input manifest. Dataset and network attribution is given in Online Resource 1, Section 11. Uniform redistribution permission was not established for the 35 raw CSVs, so the metadata extension at case_studies/metadata_ia1_ia2 excludes them together with its row-level membership and location tables. The earlier v0.1.3 archive contains identifier-only ETHZ membership tables (trace, source or station key, and split); those tables contain no waveforms, coordinates or other metadata fields. They are also retained in the later repository snapshot archived at DOI 10.5281/zenodo.23758930. The exclusion therefore applies to the new metadata extension, not to all files in either repository archive. Acquisition scripts verify exact input hashes before numerical regeneration; the software MIT license does not relicense upstream data.</w:t>
       </w:r>
     </w:p>
     <w:p>
@@ -637,12 +854,15 @@
         <w:pStyle w:val="Heading1"/>
       </w:pPr>
       <w:r>
+        <w:rPr>
+          <w:color w:val="000000"/>
+        </w:rPr>
         <w:t>Supplementary information</w:t>
       </w:r>
     </w:p>
     <w:p>
       <w:r>
-        <w:t>Online Resource 1 provides input contracts, reproduction commands, a comparison with grouped split interfaces, a contract-by-evidence matrix, an installed-wheel walkthrough and network citations. The implementation is at the repository root; machine-readable case-study reports are in case_studies/results and usage receipts in case_studies/verification. Earlier model-focused material remains in the preserved STEAD case-study archive.</w:t>
+        <w:t>Online Resource 1 provides input contracts, reproduction commands, a comparison with grouped split interfaces, a contract-by-evidence matrix, an installed-wheel walkthrough and network citations. The implementation is at the repository root; machine-readable case-study reports are in case_studies/results and usage receipts in case_studies/verification. Earlier model-focused material remains in the preserved STEAD case-study archive. Sections 10–11 add the cross-dataset protocol, ETHZ spatial and temporal sensitivity (Tables S7–S8; Figs. S1–S2), regeneration instructions and dataset attribution. The ETHZ network attribution table is Table S9.</w:t>
       </w:r>
     </w:p>
     <w:p>
@@ -650,6 +870,9 @@
         <w:pStyle w:val="Heading1"/>
       </w:pPr>
       <w:r>
+        <w:rPr>
+          <w:color w:val="000000"/>
+        </w:rPr>
         <w:t>References</w:t>
       </w:r>
     </w:p>
@@ -687,6 +910,14 @@
     </w:p>
     <w:p>
       <w:pPr>
+        <w:keepNext w:val="0"/>
+      </w:pPr>
+      <w:r>
+        <w:t>GEOFON Data Centre (1993) GEOFON Seismic Network. Deutsches GeoForschungsZentrum GFZ. https://doi.org/10.14470/TR560404</w:t>
+      </w:r>
+    </w:p>
+    <w:p>
+      <w:pPr>
         <w:keepLines/>
       </w:pPr>
       <w:r>
@@ -715,6 +946,14 @@
       </w:pPr>
       <w:r>
         <w:t>Münchmeyer J, Woollam J, Rietbrock A, Tilmann F, Lange D, Bornstein T, Diehl T, Giunchi C, Haslinger F, Jozinović D, Michelini A, Saul J, Soto H (2022) Which picker fits my data? A quantitative evaluation of deep learning based seismic pickers. Journal of Geophysical Research: Solid Earth 127:e2021JB023499. https://doi.org/10.1029/2021JB023499</w:t>
+      </w:r>
+    </w:p>
+    <w:p>
+      <w:pPr>
+        <w:keepNext w:val="0"/>
+      </w:pPr>
+      <w:r>
+        <w:t>Münchmeyer J, Saul J, Tilmann F (2024) Learning the Deep and the Shallow: Deep-Learning-Based Depth Phase Picking and Earthquake Depth Estimation. Seismological Research Letters 95(3):1543–1557. https://doi.org/10.1785/0220230187</w:t>
       </w:r>
     </w:p>
     <w:p>
@@ -762,7 +1001,15 @@
         <w:keepLines/>
       </w:pPr>
       <w:r>
-        <w:t>Wibowo RC (2026) seismic-eval-audit. Version 0.1.3. Zenodo. https://doi.org/10.5281/zenodo.23684054</w:t>
+        <w:t>Wibowo RC (2026a) seismic-eval-audit. Version 0.1.3. Zenodo. https://doi.org/10.5281/zenodo.23684054</w:t>
+      </w:r>
+    </w:p>
+    <w:p>
+      <w:pPr>
+        <w:keepNext w:val="0"/>
+      </w:pPr>
+      <w:r>
+        <w:t>Wibowo RC (2026b) seismic-eval-audit: Cross-dataset and ETHZ space–time metadata audit evidence (metadata-audit-20261028-r1). Zenodo. https://doi.org/10.5281/zenodo.23758930</w:t>
       </w:r>
     </w:p>
     <w:p>
@@ -775,10 +1022,24 @@
     </w:p>
     <w:p>
       <w:pPr>
+        <w:keepNext w:val="0"/>
+      </w:pPr>
+      <w:r>
+        <w:t>Woollam J, Rietbrock A, Bueno A, De Angelis S (2019) Convolutional Neural Network for Seismic Phase Classification, Performance Demonstration over a Local Seismic Network. Seismological Research Letters 90(2A):491–502. https://doi.org/10.1785/0220180312</w:t>
+      </w:r>
+    </w:p>
+    <w:p>
+      <w:pPr>
         <w:keepLines/>
       </w:pPr>
       <w:r>
         <w:t>Woollam J, Münchmeyer J, Tilmann F, Rietbrock A, Lange D, Bornstein T, Diehl T, Giunchi C, Haslinger F, Jozinović D, Michelini A, Saul J, Soto H (2022) SeisBench—A toolbox for machine learning in seismology. Seismological Research Letters 93:1695–1709. https://doi.org/10.1785/0220210324</w:t>
+      </w:r>
+    </w:p>
+    <w:p>
+      <w:pPr/>
+      <w:r>
+        <w:t>Yang C, Brower-Sinning RA, Lewis GA, Kästner C (2022) Data Leakage in Notebooks: Static Detection and Better Processes. In: Proceedings of the 37th IEEE/ACM International Conference on Automated Software Engineering (ASE ’22), 12 pp. https://doi.org/10.1145/3551349.3556918</w:t>
       </w:r>
     </w:p>
     <w:p>
@@ -787,6 +1048,9 @@
         <w:pageBreakBefore/>
       </w:pPr>
       <w:r>
+        <w:rPr>
+          <w:color w:val="000000"/>
+        </w:rPr>
         <w:t>Tables and captions</w:t>
       </w:r>
     </w:p>
@@ -2787,10 +3051,870 @@
     </w:p>
     <w:p>
       <w:pPr>
+        <w:pStyle w:val="Caption"/>
+        <w:keepNext/>
+        <w:pageBreakBefore/>
+      </w:pPr>
+      <w:r>
+        <w:t>Table 4 Membership audits of four complete SeisBench metadata snapshots</w:t>
+      </w:r>
+    </w:p>
+    <w:tbl>
+      <w:tblPr>
+        <w:tblW w:type="auto" w:w="0"/>
+        <w:tblLayout w:type="fixed"/>
+        <w:tblLook w:firstColumn="1" w:firstRow="1" w:lastColumn="0" w:lastRow="0" w:noHBand="0" w:noVBand="1" w:val="04A0"/>
+      </w:tblPr>
+      <w:tblGrid>
+        <w:gridCol w:w="1181"/>
+        <w:gridCol w:w="1037"/>
+        <w:gridCol w:w="1152"/>
+        <w:gridCol w:w="1469"/>
+        <w:gridCol w:w="1469"/>
+        <w:gridCol w:w="3024"/>
+      </w:tblGrid>
+      <w:tr>
+        <w:trPr>
+          <w:tblHeader/>
+          <w:cantSplit/>
+        </w:trPr>
+        <w:tc>
+          <w:tcPr>
+            <w:tcW w:type="dxa" w:w="1181"/>
+            <w:vAlign w:val="center"/>
+            <w:tcBorders>
+              <w:top w:val="single" w:sz="4" w:color="D9D9D9"/>
+              <w:left w:val="single" w:sz="4" w:color="D9D9D9"/>
+              <w:bottom w:val="single" w:sz="4" w:color="D9D9D9"/>
+              <w:right w:val="single" w:sz="4" w:color="D9D9D9"/>
+            </w:tcBorders>
+            <w:shd w:fill="EDEDED"/>
+          </w:tcPr>
+          <w:p>
+            <w:pPr>
+              <w:keepNext/>
+              <w:spacing w:before="60" w:after="60" w:line="240" w:lineRule="auto"/>
+              <w:jc w:val="left"/>
+            </w:pPr>
+            <w:r>
+              <w:rPr>
+                <w:b/>
+                <w:sz w:val="19"/>
+              </w:rPr>
+              <w:t>Dataset</w:t>
+            </w:r>
+          </w:p>
+        </w:tc>
+        <w:tc>
+          <w:tcPr>
+            <w:tcW w:type="dxa" w:w="1037"/>
+            <w:vAlign w:val="center"/>
+            <w:tcBorders>
+              <w:top w:val="single" w:sz="4" w:color="D9D9D9"/>
+              <w:left w:val="single" w:sz="4" w:color="D9D9D9"/>
+              <w:bottom w:val="single" w:sz="4" w:color="D9D9D9"/>
+              <w:right w:val="single" w:sz="4" w:color="D9D9D9"/>
+            </w:tcBorders>
+            <w:shd w:fill="EDEDED"/>
+          </w:tcPr>
+          <w:p>
+            <w:pPr>
+              <w:keepNext/>
+              <w:spacing w:before="60" w:after="60" w:line="240" w:lineRule="auto"/>
+              <w:jc w:val="center"/>
+            </w:pPr>
+            <w:r>
+              <w:rPr>
+                <w:b/>
+                <w:sz w:val="19"/>
+              </w:rPr>
+              <w:t>Records</w:t>
+            </w:r>
+          </w:p>
+        </w:tc>
+        <w:tc>
+          <w:tcPr>
+            <w:tcW w:type="dxa" w:w="1152"/>
+            <w:vAlign w:val="center"/>
+            <w:tcBorders>
+              <w:top w:val="single" w:sz="4" w:color="D9D9D9"/>
+              <w:left w:val="single" w:sz="4" w:color="D9D9D9"/>
+              <w:bottom w:val="single" w:sz="4" w:color="D9D9D9"/>
+              <w:right w:val="single" w:sz="4" w:color="D9D9D9"/>
+            </w:tcBorders>
+            <w:shd w:fill="EDEDED"/>
+          </w:tcPr>
+          <w:p>
+            <w:pPr>
+              <w:keepNext/>
+              <w:spacing w:before="60" w:after="60" w:line="240" w:lineRule="auto"/>
+              <w:jc w:val="center"/>
+            </w:pPr>
+            <w:r>
+              <w:rPr>
+                <w:b/>
+                <w:sz w:val="19"/>
+              </w:rPr>
+              <w:t>Source IDs</w:t>
+            </w:r>
+          </w:p>
+        </w:tc>
+        <w:tc>
+          <w:tcPr>
+            <w:tcW w:type="dxa" w:w="1469"/>
+            <w:vAlign w:val="center"/>
+            <w:tcBorders>
+              <w:top w:val="single" w:sz="4" w:color="D9D9D9"/>
+              <w:left w:val="single" w:sz="4" w:color="D9D9D9"/>
+              <w:bottom w:val="single" w:sz="4" w:color="D9D9D9"/>
+              <w:right w:val="single" w:sz="4" w:color="D9D9D9"/>
+            </w:tcBorders>
+            <w:shd w:fill="EDEDED"/>
+          </w:tcPr>
+          <w:p>
+            <w:pPr>
+              <w:keepNext/>
+              <w:spacing w:before="60" w:after="60" w:line="240" w:lineRule="auto"/>
+              <w:jc w:val="center"/>
+            </w:pPr>
+            <w:r>
+              <w:rPr>
+                <w:b/>
+                <w:sz w:val="19"/>
+              </w:rPr>
+              <w:t>Shared source IDs</w:t>
+              <w:br/>
+              <w:t>train–test</w:t>
+            </w:r>
+          </w:p>
+        </w:tc>
+        <w:tc>
+          <w:tcPr>
+            <w:tcW w:type="dxa" w:w="1469"/>
+            <w:vAlign w:val="center"/>
+            <w:tcBorders>
+              <w:top w:val="single" w:sz="4" w:color="D9D9D9"/>
+              <w:left w:val="single" w:sz="4" w:color="D9D9D9"/>
+              <w:bottom w:val="single" w:sz="4" w:color="D9D9D9"/>
+              <w:right w:val="single" w:sz="4" w:color="D9D9D9"/>
+            </w:tcBorders>
+            <w:shd w:fill="EDEDED"/>
+          </w:tcPr>
+          <w:p>
+            <w:pPr>
+              <w:keepNext/>
+              <w:spacing w:before="60" w:after="60" w:line="240" w:lineRule="auto"/>
+              <w:jc w:val="center"/>
+            </w:pPr>
+            <w:r>
+              <w:rPr>
+                <w:b/>
+                <w:sz w:val="19"/>
+              </w:rPr>
+              <w:t>Shared station keys</w:t>
+              <w:br/>
+              <w:t>train–test</w:t>
+            </w:r>
+          </w:p>
+        </w:tc>
+        <w:tc>
+          <w:tcPr>
+            <w:tcW w:type="dxa" w:w="3024"/>
+            <w:vAlign w:val="center"/>
+            <w:tcBorders>
+              <w:top w:val="single" w:sz="4" w:color="D9D9D9"/>
+              <w:left w:val="single" w:sz="4" w:color="D9D9D9"/>
+              <w:bottom w:val="single" w:sz="4" w:color="D9D9D9"/>
+              <w:right w:val="single" w:sz="4" w:color="D9D9D9"/>
+            </w:tcBorders>
+            <w:shd w:fill="EDEDED"/>
+          </w:tcPr>
+          <w:p>
+            <w:pPr>
+              <w:keepNext/>
+              <w:spacing w:before="60" w:after="60" w:line="240" w:lineRule="auto"/>
+              <w:jc w:val="center"/>
+            </w:pPr>
+            <w:r>
+              <w:rPr>
+                <w:b/>
+                <w:sz w:val="19"/>
+              </w:rPr>
+              <w:t>Test records on training station keys</w:t>
+            </w:r>
+          </w:p>
+        </w:tc>
+      </w:tr>
+      <w:tr>
+        <w:trPr>
+          <w:cantSplit/>
+        </w:trPr>
+        <w:tc>
+          <w:tcPr>
+            <w:tcW w:type="dxa" w:w="1181"/>
+            <w:vAlign w:val="center"/>
+            <w:tcBorders>
+              <w:top w:val="single" w:sz="4" w:color="D9D9D9"/>
+              <w:left w:val="single" w:sz="4" w:color="D9D9D9"/>
+              <w:bottom w:val="single" w:sz="4" w:color="D9D9D9"/>
+              <w:right w:val="single" w:sz="4" w:color="D9D9D9"/>
+            </w:tcBorders>
+          </w:tcPr>
+          <w:p>
+            <w:pPr>
+              <w:keepNext w:val="0"/>
+              <w:spacing w:before="60" w:after="60" w:line="240" w:lineRule="auto"/>
+              <w:jc w:val="left"/>
+            </w:pPr>
+            <w:r>
+              <w:rPr>
+                <w:b w:val="0"/>
+                <w:sz w:val="19"/>
+              </w:rPr>
+              <w:t>ETHZ</w:t>
+            </w:r>
+          </w:p>
+        </w:tc>
+        <w:tc>
+          <w:tcPr>
+            <w:tcW w:type="dxa" w:w="1037"/>
+            <w:vAlign w:val="center"/>
+            <w:tcBorders>
+              <w:top w:val="single" w:sz="4" w:color="D9D9D9"/>
+              <w:left w:val="single" w:sz="4" w:color="D9D9D9"/>
+              <w:bottom w:val="single" w:sz="4" w:color="D9D9D9"/>
+              <w:right w:val="single" w:sz="4" w:color="D9D9D9"/>
+            </w:tcBorders>
+          </w:tcPr>
+          <w:p>
+            <w:pPr>
+              <w:keepNext w:val="0"/>
+              <w:spacing w:before="60" w:after="60" w:line="240" w:lineRule="auto"/>
+              <w:jc w:val="center"/>
+            </w:pPr>
+            <w:r>
+              <w:rPr>
+                <w:b w:val="0"/>
+                <w:sz w:val="19"/>
+              </w:rPr>
+              <w:t>36,743</w:t>
+            </w:r>
+          </w:p>
+        </w:tc>
+        <w:tc>
+          <w:tcPr>
+            <w:tcW w:type="dxa" w:w="1152"/>
+            <w:vAlign w:val="center"/>
+            <w:tcBorders>
+              <w:top w:val="single" w:sz="4" w:color="D9D9D9"/>
+              <w:left w:val="single" w:sz="4" w:color="D9D9D9"/>
+              <w:bottom w:val="single" w:sz="4" w:color="D9D9D9"/>
+              <w:right w:val="single" w:sz="4" w:color="D9D9D9"/>
+            </w:tcBorders>
+          </w:tcPr>
+          <w:p>
+            <w:pPr>
+              <w:keepNext w:val="0"/>
+              <w:spacing w:before="60" w:after="60" w:line="240" w:lineRule="auto"/>
+              <w:jc w:val="center"/>
+            </w:pPr>
+            <w:r>
+              <w:rPr>
+                <w:b w:val="0"/>
+                <w:sz w:val="19"/>
+              </w:rPr>
+              <w:t>2,231</w:t>
+            </w:r>
+          </w:p>
+        </w:tc>
+        <w:tc>
+          <w:tcPr>
+            <w:tcW w:type="dxa" w:w="1469"/>
+            <w:vAlign w:val="center"/>
+            <w:tcBorders>
+              <w:top w:val="single" w:sz="4" w:color="D9D9D9"/>
+              <w:left w:val="single" w:sz="4" w:color="D9D9D9"/>
+              <w:bottom w:val="single" w:sz="4" w:color="D9D9D9"/>
+              <w:right w:val="single" w:sz="4" w:color="D9D9D9"/>
+            </w:tcBorders>
+          </w:tcPr>
+          <w:p>
+            <w:pPr>
+              <w:keepNext w:val="0"/>
+              <w:spacing w:before="60" w:after="60" w:line="240" w:lineRule="auto"/>
+              <w:jc w:val="center"/>
+            </w:pPr>
+            <w:r>
+              <w:rPr>
+                <w:b w:val="0"/>
+                <w:sz w:val="19"/>
+              </w:rPr>
+              <w:t>0</w:t>
+            </w:r>
+          </w:p>
+        </w:tc>
+        <w:tc>
+          <w:tcPr>
+            <w:tcW w:type="dxa" w:w="1469"/>
+            <w:vAlign w:val="center"/>
+            <w:tcBorders>
+              <w:top w:val="single" w:sz="4" w:color="D9D9D9"/>
+              <w:left w:val="single" w:sz="4" w:color="D9D9D9"/>
+              <w:bottom w:val="single" w:sz="4" w:color="D9D9D9"/>
+              <w:right w:val="single" w:sz="4" w:color="D9D9D9"/>
+            </w:tcBorders>
+          </w:tcPr>
+          <w:p>
+            <w:pPr>
+              <w:keepNext w:val="0"/>
+              <w:spacing w:before="60" w:after="60" w:line="240" w:lineRule="auto"/>
+              <w:jc w:val="center"/>
+            </w:pPr>
+            <w:r>
+              <w:rPr>
+                <w:b w:val="0"/>
+                <w:sz w:val="19"/>
+              </w:rPr>
+              <w:t>180</w:t>
+            </w:r>
+          </w:p>
+        </w:tc>
+        <w:tc>
+          <w:tcPr>
+            <w:tcW w:type="dxa" w:w="3024"/>
+            <w:vAlign w:val="center"/>
+            <w:tcBorders>
+              <w:top w:val="single" w:sz="4" w:color="D9D9D9"/>
+              <w:left w:val="single" w:sz="4" w:color="D9D9D9"/>
+              <w:bottom w:val="single" w:sz="4" w:color="D9D9D9"/>
+              <w:right w:val="single" w:sz="4" w:color="D9D9D9"/>
+            </w:tcBorders>
+          </w:tcPr>
+          <w:p>
+            <w:pPr>
+              <w:keepNext w:val="0"/>
+              <w:spacing w:before="60" w:after="60" w:line="240" w:lineRule="auto"/>
+              <w:jc w:val="center"/>
+            </w:pPr>
+            <w:r>
+              <w:rPr>
+                <w:b w:val="0"/>
+                <w:sz w:val="19"/>
+              </w:rPr>
+              <w:t>9,637/10,485</w:t>
+              <w:br/>
+              <w:t>(91.91%)</w:t>
+            </w:r>
+          </w:p>
+        </w:tc>
+      </w:tr>
+      <w:tr>
+        <w:trPr>
+          <w:cantSplit/>
+        </w:trPr>
+        <w:tc>
+          <w:tcPr>
+            <w:tcW w:type="dxa" w:w="1181"/>
+            <w:vAlign w:val="center"/>
+            <w:tcBorders>
+              <w:top w:val="single" w:sz="4" w:color="D9D9D9"/>
+              <w:left w:val="single" w:sz="4" w:color="D9D9D9"/>
+              <w:bottom w:val="single" w:sz="4" w:color="D9D9D9"/>
+              <w:right w:val="single" w:sz="4" w:color="D9D9D9"/>
+            </w:tcBorders>
+          </w:tcPr>
+          <w:p>
+            <w:pPr>
+              <w:keepNext w:val="0"/>
+              <w:spacing w:before="60" w:after="60" w:line="240" w:lineRule="auto"/>
+              <w:jc w:val="left"/>
+            </w:pPr>
+            <w:r>
+              <w:rPr>
+                <w:b w:val="0"/>
+                <w:sz w:val="19"/>
+              </w:rPr>
+              <w:t>GEOFON</w:t>
+            </w:r>
+          </w:p>
+        </w:tc>
+        <w:tc>
+          <w:tcPr>
+            <w:tcW w:type="dxa" w:w="1037"/>
+            <w:vAlign w:val="center"/>
+            <w:tcBorders>
+              <w:top w:val="single" w:sz="4" w:color="D9D9D9"/>
+              <w:left w:val="single" w:sz="4" w:color="D9D9D9"/>
+              <w:bottom w:val="single" w:sz="4" w:color="D9D9D9"/>
+              <w:right w:val="single" w:sz="4" w:color="D9D9D9"/>
+            </w:tcBorders>
+          </w:tcPr>
+          <w:p>
+            <w:pPr>
+              <w:keepNext w:val="0"/>
+              <w:spacing w:before="60" w:after="60" w:line="240" w:lineRule="auto"/>
+              <w:jc w:val="center"/>
+            </w:pPr>
+            <w:r>
+              <w:rPr>
+                <w:b w:val="0"/>
+                <w:sz w:val="19"/>
+              </w:rPr>
+              <w:t>275,274</w:t>
+            </w:r>
+          </w:p>
+        </w:tc>
+        <w:tc>
+          <w:tcPr>
+            <w:tcW w:type="dxa" w:w="1152"/>
+            <w:vAlign w:val="center"/>
+            <w:tcBorders>
+              <w:top w:val="single" w:sz="4" w:color="D9D9D9"/>
+              <w:left w:val="single" w:sz="4" w:color="D9D9D9"/>
+              <w:bottom w:val="single" w:sz="4" w:color="D9D9D9"/>
+              <w:right w:val="single" w:sz="4" w:color="D9D9D9"/>
+            </w:tcBorders>
+          </w:tcPr>
+          <w:p>
+            <w:pPr>
+              <w:keepNext w:val="0"/>
+              <w:spacing w:before="60" w:after="60" w:line="240" w:lineRule="auto"/>
+              <w:jc w:val="center"/>
+            </w:pPr>
+            <w:r>
+              <w:rPr>
+                <w:b w:val="0"/>
+                <w:sz w:val="19"/>
+              </w:rPr>
+              <w:t>2,270</w:t>
+            </w:r>
+          </w:p>
+        </w:tc>
+        <w:tc>
+          <w:tcPr>
+            <w:tcW w:type="dxa" w:w="1469"/>
+            <w:vAlign w:val="center"/>
+            <w:tcBorders>
+              <w:top w:val="single" w:sz="4" w:color="D9D9D9"/>
+              <w:left w:val="single" w:sz="4" w:color="D9D9D9"/>
+              <w:bottom w:val="single" w:sz="4" w:color="D9D9D9"/>
+              <w:right w:val="single" w:sz="4" w:color="D9D9D9"/>
+            </w:tcBorders>
+          </w:tcPr>
+          <w:p>
+            <w:pPr>
+              <w:keepNext w:val="0"/>
+              <w:spacing w:before="60" w:after="60" w:line="240" w:lineRule="auto"/>
+              <w:jc w:val="center"/>
+            </w:pPr>
+            <w:r>
+              <w:rPr>
+                <w:b w:val="0"/>
+                <w:sz w:val="19"/>
+              </w:rPr>
+              <w:t>0</w:t>
+            </w:r>
+          </w:p>
+        </w:tc>
+        <w:tc>
+          <w:tcPr>
+            <w:tcW w:type="dxa" w:w="1469"/>
+            <w:vAlign w:val="center"/>
+            <w:tcBorders>
+              <w:top w:val="single" w:sz="4" w:color="D9D9D9"/>
+              <w:left w:val="single" w:sz="4" w:color="D9D9D9"/>
+              <w:bottom w:val="single" w:sz="4" w:color="D9D9D9"/>
+              <w:right w:val="single" w:sz="4" w:color="D9D9D9"/>
+            </w:tcBorders>
+          </w:tcPr>
+          <w:p>
+            <w:pPr>
+              <w:keepNext w:val="0"/>
+              <w:spacing w:before="60" w:after="60" w:line="240" w:lineRule="auto"/>
+              <w:jc w:val="center"/>
+            </w:pPr>
+            <w:r>
+              <w:rPr>
+                <w:b w:val="0"/>
+                <w:sz w:val="19"/>
+              </w:rPr>
+              <w:t>643</w:t>
+            </w:r>
+          </w:p>
+        </w:tc>
+        <w:tc>
+          <w:tcPr>
+            <w:tcW w:type="dxa" w:w="3024"/>
+            <w:vAlign w:val="center"/>
+            <w:tcBorders>
+              <w:top w:val="single" w:sz="4" w:color="D9D9D9"/>
+              <w:left w:val="single" w:sz="4" w:color="D9D9D9"/>
+              <w:bottom w:val="single" w:sz="4" w:color="D9D9D9"/>
+              <w:right w:val="single" w:sz="4" w:color="D9D9D9"/>
+            </w:tcBorders>
+          </w:tcPr>
+          <w:p>
+            <w:pPr>
+              <w:keepNext w:val="0"/>
+              <w:spacing w:before="60" w:after="60" w:line="240" w:lineRule="auto"/>
+              <w:jc w:val="center"/>
+            </w:pPr>
+            <w:r>
+              <w:rPr>
+                <w:b w:val="0"/>
+                <w:sz w:val="19"/>
+              </w:rPr>
+              <w:t>80,798/86,261</w:t>
+              <w:br/>
+              <w:t>(93.67%)</w:t>
+            </w:r>
+          </w:p>
+        </w:tc>
+      </w:tr>
+      <w:tr>
+        <w:trPr>
+          <w:cantSplit/>
+        </w:trPr>
+        <w:tc>
+          <w:tcPr>
+            <w:tcW w:type="dxa" w:w="1181"/>
+            <w:vAlign w:val="center"/>
+            <w:tcBorders>
+              <w:top w:val="single" w:sz="4" w:color="D9D9D9"/>
+              <w:left w:val="single" w:sz="4" w:color="D9D9D9"/>
+              <w:bottom w:val="single" w:sz="4" w:color="D9D9D9"/>
+              <w:right w:val="single" w:sz="4" w:color="D9D9D9"/>
+            </w:tcBorders>
+          </w:tcPr>
+          <w:p>
+            <w:pPr>
+              <w:keepNext w:val="0"/>
+              <w:spacing w:before="60" w:after="60" w:line="240" w:lineRule="auto"/>
+              <w:jc w:val="left"/>
+            </w:pPr>
+            <w:r>
+              <w:rPr>
+                <w:b w:val="0"/>
+                <w:sz w:val="19"/>
+              </w:rPr>
+              <w:t>ISC-EHB</w:t>
+            </w:r>
+          </w:p>
+        </w:tc>
+        <w:tc>
+          <w:tcPr>
+            <w:tcW w:type="dxa" w:w="1037"/>
+            <w:vAlign w:val="center"/>
+            <w:tcBorders>
+              <w:top w:val="single" w:sz="4" w:color="D9D9D9"/>
+              <w:left w:val="single" w:sz="4" w:color="D9D9D9"/>
+              <w:bottom w:val="single" w:sz="4" w:color="D9D9D9"/>
+              <w:right w:val="single" w:sz="4" w:color="D9D9D9"/>
+            </w:tcBorders>
+          </w:tcPr>
+          <w:p>
+            <w:pPr>
+              <w:keepNext w:val="0"/>
+              <w:spacing w:before="60" w:after="60" w:line="240" w:lineRule="auto"/>
+              <w:jc w:val="center"/>
+            </w:pPr>
+            <w:r>
+              <w:rPr>
+                <w:b w:val="0"/>
+                <w:sz w:val="19"/>
+              </w:rPr>
+              <w:t>190,275</w:t>
+            </w:r>
+          </w:p>
+        </w:tc>
+        <w:tc>
+          <w:tcPr>
+            <w:tcW w:type="dxa" w:w="1152"/>
+            <w:vAlign w:val="center"/>
+            <w:tcBorders>
+              <w:top w:val="single" w:sz="4" w:color="D9D9D9"/>
+              <w:left w:val="single" w:sz="4" w:color="D9D9D9"/>
+              <w:bottom w:val="single" w:sz="4" w:color="D9D9D9"/>
+              <w:right w:val="single" w:sz="4" w:color="D9D9D9"/>
+            </w:tcBorders>
+          </w:tcPr>
+          <w:p>
+            <w:pPr>
+              <w:keepNext w:val="0"/>
+              <w:spacing w:before="60" w:after="60" w:line="240" w:lineRule="auto"/>
+              <w:jc w:val="center"/>
+            </w:pPr>
+            <w:r>
+              <w:rPr>
+                <w:b w:val="0"/>
+                <w:sz w:val="19"/>
+              </w:rPr>
+              <w:t>45,028</w:t>
+            </w:r>
+          </w:p>
+        </w:tc>
+        <w:tc>
+          <w:tcPr>
+            <w:tcW w:type="dxa" w:w="1469"/>
+            <w:vAlign w:val="center"/>
+            <w:tcBorders>
+              <w:top w:val="single" w:sz="4" w:color="D9D9D9"/>
+              <w:left w:val="single" w:sz="4" w:color="D9D9D9"/>
+              <w:bottom w:val="single" w:sz="4" w:color="D9D9D9"/>
+              <w:right w:val="single" w:sz="4" w:color="D9D9D9"/>
+            </w:tcBorders>
+          </w:tcPr>
+          <w:p>
+            <w:pPr>
+              <w:keepNext w:val="0"/>
+              <w:spacing w:before="60" w:after="60" w:line="240" w:lineRule="auto"/>
+              <w:jc w:val="center"/>
+            </w:pPr>
+            <w:r>
+              <w:rPr>
+                <w:b w:val="0"/>
+                <w:sz w:val="19"/>
+              </w:rPr>
+              <w:t>0</w:t>
+            </w:r>
+          </w:p>
+        </w:tc>
+        <w:tc>
+          <w:tcPr>
+            <w:tcW w:type="dxa" w:w="1469"/>
+            <w:vAlign w:val="center"/>
+            <w:tcBorders>
+              <w:top w:val="single" w:sz="4" w:color="D9D9D9"/>
+              <w:left w:val="single" w:sz="4" w:color="D9D9D9"/>
+              <w:bottom w:val="single" w:sz="4" w:color="D9D9D9"/>
+              <w:right w:val="single" w:sz="4" w:color="D9D9D9"/>
+            </w:tcBorders>
+          </w:tcPr>
+          <w:p>
+            <w:pPr>
+              <w:keepNext w:val="0"/>
+              <w:spacing w:before="60" w:after="60" w:line="240" w:lineRule="auto"/>
+              <w:jc w:val="center"/>
+            </w:pPr>
+            <w:r>
+              <w:rPr>
+                <w:b w:val="0"/>
+                <w:sz w:val="19"/>
+              </w:rPr>
+              <w:t>1,576</w:t>
+            </w:r>
+          </w:p>
+        </w:tc>
+        <w:tc>
+          <w:tcPr>
+            <w:tcW w:type="dxa" w:w="3024"/>
+            <w:vAlign w:val="center"/>
+            <w:tcBorders>
+              <w:top w:val="single" w:sz="4" w:color="D9D9D9"/>
+              <w:left w:val="single" w:sz="4" w:color="D9D9D9"/>
+              <w:bottom w:val="single" w:sz="4" w:color="D9D9D9"/>
+              <w:right w:val="single" w:sz="4" w:color="D9D9D9"/>
+            </w:tcBorders>
+          </w:tcPr>
+          <w:p>
+            <w:pPr>
+              <w:keepNext w:val="0"/>
+              <w:spacing w:before="60" w:after="60" w:line="240" w:lineRule="auto"/>
+              <w:jc w:val="center"/>
+            </w:pPr>
+            <w:r>
+              <w:rPr>
+                <w:b w:val="0"/>
+                <w:sz w:val="19"/>
+              </w:rPr>
+              <w:t>37,540/37,566</w:t>
+              <w:br/>
+              <w:t>(99.93%)</w:t>
+            </w:r>
+          </w:p>
+        </w:tc>
+      </w:tr>
+      <w:tr>
+        <w:trPr>
+          <w:cantSplit/>
+        </w:trPr>
+        <w:tc>
+          <w:tcPr>
+            <w:tcW w:type="dxa" w:w="1181"/>
+            <w:vAlign w:val="center"/>
+            <w:tcBorders>
+              <w:top w:val="single" w:sz="4" w:color="D9D9D9"/>
+              <w:left w:val="single" w:sz="4" w:color="D9D9D9"/>
+              <w:bottom w:val="single" w:sz="4" w:color="D9D9D9"/>
+              <w:right w:val="single" w:sz="4" w:color="D9D9D9"/>
+            </w:tcBorders>
+          </w:tcPr>
+          <w:p>
+            <w:pPr>
+              <w:keepNext w:val="0"/>
+              <w:spacing w:before="60" w:after="60" w:line="240" w:lineRule="auto"/>
+              <w:jc w:val="left"/>
+            </w:pPr>
+            <w:r>
+              <w:rPr>
+                <w:b w:val="0"/>
+                <w:sz w:val="19"/>
+              </w:rPr>
+              <w:t>Iquique</w:t>
+            </w:r>
+          </w:p>
+        </w:tc>
+        <w:tc>
+          <w:tcPr>
+            <w:tcW w:type="dxa" w:w="1037"/>
+            <w:vAlign w:val="center"/>
+            <w:tcBorders>
+              <w:top w:val="single" w:sz="4" w:color="D9D9D9"/>
+              <w:left w:val="single" w:sz="4" w:color="D9D9D9"/>
+              <w:bottom w:val="single" w:sz="4" w:color="D9D9D9"/>
+              <w:right w:val="single" w:sz="4" w:color="D9D9D9"/>
+            </w:tcBorders>
+          </w:tcPr>
+          <w:p>
+            <w:pPr>
+              <w:keepNext w:val="0"/>
+              <w:spacing w:before="60" w:after="60" w:line="240" w:lineRule="auto"/>
+              <w:jc w:val="center"/>
+            </w:pPr>
+            <w:r>
+              <w:rPr>
+                <w:b w:val="0"/>
+                <w:sz w:val="19"/>
+              </w:rPr>
+              <w:t>13,400</w:t>
+            </w:r>
+          </w:p>
+        </w:tc>
+        <w:tc>
+          <w:tcPr>
+            <w:tcW w:type="dxa" w:w="1152"/>
+            <w:vAlign w:val="center"/>
+            <w:tcBorders>
+              <w:top w:val="single" w:sz="4" w:color="D9D9D9"/>
+              <w:left w:val="single" w:sz="4" w:color="D9D9D9"/>
+              <w:bottom w:val="single" w:sz="4" w:color="D9D9D9"/>
+              <w:right w:val="single" w:sz="4" w:color="D9D9D9"/>
+            </w:tcBorders>
+          </w:tcPr>
+          <w:p>
+            <w:pPr>
+              <w:keepNext w:val="0"/>
+              <w:spacing w:before="60" w:after="60" w:line="240" w:lineRule="auto"/>
+              <w:jc w:val="center"/>
+            </w:pPr>
+            <w:r>
+              <w:rPr>
+                <w:b w:val="0"/>
+                <w:sz w:val="19"/>
+              </w:rPr>
+              <w:t>Unavailable</w:t>
+            </w:r>
+          </w:p>
+        </w:tc>
+        <w:tc>
+          <w:tcPr>
+            <w:tcW w:type="dxa" w:w="1469"/>
+            <w:vAlign w:val="center"/>
+            <w:tcBorders>
+              <w:top w:val="single" w:sz="4" w:color="D9D9D9"/>
+              <w:left w:val="single" w:sz="4" w:color="D9D9D9"/>
+              <w:bottom w:val="single" w:sz="4" w:color="D9D9D9"/>
+              <w:right w:val="single" w:sz="4" w:color="D9D9D9"/>
+            </w:tcBorders>
+          </w:tcPr>
+          <w:p>
+            <w:pPr>
+              <w:keepNext w:val="0"/>
+              <w:spacing w:before="60" w:after="60" w:line="240" w:lineRule="auto"/>
+              <w:jc w:val="center"/>
+            </w:pPr>
+            <w:r>
+              <w:rPr>
+                <w:b w:val="0"/>
+                <w:sz w:val="19"/>
+              </w:rPr>
+              <w:t>Not assessable</w:t>
+            </w:r>
+          </w:p>
+        </w:tc>
+        <w:tc>
+          <w:tcPr>
+            <w:tcW w:type="dxa" w:w="1469"/>
+            <w:vAlign w:val="center"/>
+            <w:tcBorders>
+              <w:top w:val="single" w:sz="4" w:color="D9D9D9"/>
+              <w:left w:val="single" w:sz="4" w:color="D9D9D9"/>
+              <w:bottom w:val="single" w:sz="4" w:color="D9D9D9"/>
+              <w:right w:val="single" w:sz="4" w:color="D9D9D9"/>
+            </w:tcBorders>
+          </w:tcPr>
+          <w:p>
+            <w:pPr>
+              <w:keepNext w:val="0"/>
+              <w:spacing w:before="60" w:after="60" w:line="240" w:lineRule="auto"/>
+              <w:jc w:val="center"/>
+            </w:pPr>
+            <w:r>
+              <w:rPr>
+                <w:b w:val="0"/>
+                <w:sz w:val="19"/>
+              </w:rPr>
+              <w:t>51</w:t>
+            </w:r>
+          </w:p>
+        </w:tc>
+        <w:tc>
+          <w:tcPr>
+            <w:tcW w:type="dxa" w:w="3024"/>
+            <w:vAlign w:val="center"/>
+            <w:tcBorders>
+              <w:top w:val="single" w:sz="4" w:color="D9D9D9"/>
+              <w:left w:val="single" w:sz="4" w:color="D9D9D9"/>
+              <w:bottom w:val="single" w:sz="4" w:color="D9D9D9"/>
+              <w:right w:val="single" w:sz="4" w:color="D9D9D9"/>
+            </w:tcBorders>
+          </w:tcPr>
+          <w:p>
+            <w:pPr>
+              <w:keepNext w:val="0"/>
+              <w:spacing w:before="60" w:after="60" w:line="240" w:lineRule="auto"/>
+              <w:jc w:val="center"/>
+            </w:pPr>
+            <w:r>
+              <w:rPr>
+                <w:b w:val="0"/>
+                <w:sz w:val="19"/>
+              </w:rPr>
+              <w:t>4,020/4,020</w:t>
+              <w:br/>
+              <w:t>(100.00%)</w:t>
+            </w:r>
+          </w:p>
+        </w:tc>
+      </w:tr>
+    </w:tbl>
+    <w:p>
+      <w:pPr>
+        <w:keepNext w:val="0"/>
+      </w:pPr>
+      <w:r>
+        <w:t>All three assessable source contracts also have zero overlap across any subset pair. Iquique supplies no source IDs; missing identifiers are not interpreted as zero overlap. Station keys combine network and station codes. Fractions use each dataset’s complete test subset. Station exclusion is a separate evaluation requirement. Inputs were retrieved on 28 October 2026; results refer to the exact hashed snapshots, including the ISC-EHB size discrepancy described in Section 5.</w:t>
+      </w:r>
+    </w:p>
+    <w:p>
+      <w:pPr>
         <w:pStyle w:val="Heading1"/>
         <w:keepNext/>
       </w:pPr>
       <w:r>
+        <w:rPr>
+          <w:color w:val="000000"/>
+        </w:rPr>
         <w:t>Software Files</w:t>
       </w:r>
     </w:p>
@@ -2801,7 +3925,7 @@
     </w:p>
     <w:p>
       <w:r>
-        <w:t>Post-archive usage files—docs/WALKTHROUGH.md, docs/verify_walkthrough.py, case_studies/verification/wheel_usage_receipt.json and walkthrough_logs—are fixed at commit 502b5415bead677ec810207affed55a0e76a9f82. Code availability and Online Resource 1 identify their manifest.</w:t>
+        <w:t>The later metadata evidence archive (https://doi.org/10.5281/zenodo.23758930) additionally contains case_studies/metadata_ia1_ia2 and the installed-wheel walkthrough. It preserves the unchanged software wheel, acquisition and audit scripts, frozen input manifest, aggregate reference outputs, all 21 ETHZ sensitivity configurations and author-run verification receipts. The extension’s raw metadata and new detailed row-level outputs must be acquired or regenerated as described in Online Resource 1, Section 10; the legacy identifier-only ETHZ tables remain in the repository archives.</w:t>
       </w:r>
     </w:p>
     <w:sectPr>

</xml_diff>